<commit_message>
docs: actualizar documento tecnico con DagsHub, Docker y flujo completo
</commit_message>
<xml_diff>
--- a/documento_tecnico_despliegue.docx
+++ b/documento_tecnico_despliegue.docx
@@ -31,7 +31,7 @@
           <w:sz w:val="28"/>
           <w:szCs w:val="28"/>
         </w:rPr>
-        <w:t xml:space="preserve">Documento Técnico de Despliegue</w:t>
+        <w:t xml:space="preserve">Documento Tecnico de Despliegue</w:t>
       </w:r>
     </w:p>
     <w:p>
@@ -46,12 +46,12 @@
           <w:sz w:val="22"/>
           <w:szCs w:val="22"/>
         </w:rPr>
-        <w:t xml:space="preserve">Segunda Entrega – MLOps Local</w:t>
-      </w:r>
-    </w:p>
-    <w:p>
-      <w:pPr>
-        <w:spacing w:after="600" w:before="0"/>
+        <w:t xml:space="preserve">Segunda Entrega - MLOps Local</w:t>
+      </w:r>
+    </w:p>
+    <w:p>
+      <w:pPr>
+        <w:spacing w:after="80" w:before="0"/>
         <w:jc w:val="center"/>
       </w:pPr>
       <w:r>
@@ -61,7 +61,22 @@
           <w:sz w:val="20"/>
           <w:szCs w:val="20"/>
         </w:rPr>
-        <w:t xml:space="preserve">ISTEA · Laboratorio de Minería de Datos</w:t>
+        <w:t xml:space="preserve">ISTEA - Laboratorio de Mineria de Datos</w:t>
+      </w:r>
+    </w:p>
+    <w:p>
+      <w:pPr>
+        <w:spacing w:after="600" w:before="0"/>
+        <w:jc w:val="center"/>
+      </w:pPr>
+      <w:r>
+        <w:rPr>
+          <w:rFonts w:ascii="Arial" w:cs="Arial" w:eastAsia="Arial" w:hAnsi="Arial"/>
+          <w:color w:val="888888"/>
+          <w:sz w:val="20"/>
+          <w:szCs w:val="20"/>
+        </w:rPr>
+        <w:t xml:space="preserve">Ronald Boyd | Rodrigo Figueredo | Nicolas Sala</w:t>
       </w:r>
     </w:p>
     <w:p>
@@ -85,7 +100,7 @@
           <w:sz w:val="32"/>
           <w:szCs w:val="32"/>
         </w:rPr>
-        <w:t xml:space="preserve">1. Introducción</w:t>
+        <w:t xml:space="preserve">1. Introduccion</w:t>
       </w:r>
     </w:p>
     <w:p>
@@ -98,7 +113,7 @@
           <w:sz w:val="22"/>
           <w:szCs w:val="22"/>
         </w:rPr>
-        <w:t xml:space="preserve">Este documento describe la arquitectura, los componentes y las decisiones de implementación correspondientes a la segunda entrega del proyecto MLOps para AndesLink Servicios Digitales S.A.</w:t>
+        <w:t xml:space="preserve">Este documento describe la arquitectura, los componentes y las decisiones de implementacion correspondientes a la segunda entrega del proyecto MLOps para AndesLink Servicios Digitales S.A.</w:t>
       </w:r>
     </w:p>
     <w:p>
@@ -111,7 +126,7 @@
           <w:sz w:val="22"/>
           <w:szCs w:val="22"/>
         </w:rPr>
-        <w:t xml:space="preserve">En esta etapa se convirtió el modelo de predicción de churn entrenado en la primera entrega en un servicio productivo local, compuesto por una API de inferencia, una interfaz gráfica de usuario y un entorno de despliegue contenerizado y reproducible.</w:t>
+        <w:t xml:space="preserve">En esta etapa se convirtio el modelo de prediccion de churn entrenado en la primera entrega en un servicio productivo local, compuesto por una API de inferencia, una interfaz grafica de usuario y un entorno de despliegue contenerizado y reproducible.</w:t>
       </w:r>
     </w:p>
     <w:p>
@@ -148,7 +163,7 @@
           <w:sz w:val="22"/>
           <w:szCs w:val="22"/>
         </w:rPr>
-        <w:t xml:space="preserve">La solución se organiza en tres capas que se comunican entre sí:</w:t>
+        <w:t xml:space="preserve">La solucion se organiza en tres capas que se comunican entre si:</w:t>
       </w:r>
     </w:p>
     <w:tbl>
@@ -191,7 +206,7 @@
                 <w:sz w:val="18"/>
                 <w:szCs w:val="18"/>
               </w:rPr>
-              <w:t xml:space="preserve">┌─────────────────────────────────────────────┐</w:t>
+              <w:t xml:space="preserve">USUARIO (Navegador Web)</w:t>
             </w:r>
           </w:p>
           <w:p>
@@ -201,7 +216,7 @@
                 <w:sz w:val="18"/>
                 <w:szCs w:val="18"/>
               </w:rPr>
-              <w:t xml:space="preserve">│         USUARIO (Navegador Web)             │</w:t>
+              <w:t xml:space="preserve">         |  HTTP :8501</w:t>
             </w:r>
           </w:p>
           <w:p>
@@ -211,7 +226,7 @@
                 <w:sz w:val="18"/>
                 <w:szCs w:val="18"/>
               </w:rPr>
-              <w:t xml:space="preserve">└─────────────────┬───────────────────────────┘</w:t>
+              <w:t xml:space="preserve">GUI - Streamlit  (puerto 8501)  [andeslink-gui / Docker]</w:t>
             </w:r>
           </w:p>
           <w:p>
@@ -221,7 +236,7 @@
                 <w:sz w:val="18"/>
                 <w:szCs w:val="18"/>
               </w:rPr>
-              <w:t xml:space="preserve">                  │  HTTP :8501</w:t>
+              <w:t xml:space="preserve">         |  HTTP POST /predecir :8000</w:t>
             </w:r>
           </w:p>
           <w:p>
@@ -231,7 +246,7 @@
                 <w:sz w:val="18"/>
                 <w:szCs w:val="18"/>
               </w:rPr>
-              <w:t xml:space="preserve">┌─────────────────▼───────────────────────────┐</w:t>
+              <w:t xml:space="preserve">API - FastAPI    (puerto 8000)  [andeslink-api / Docker]</w:t>
             </w:r>
           </w:p>
           <w:p>
@@ -241,7 +256,7 @@
                 <w:sz w:val="18"/>
                 <w:szCs w:val="18"/>
               </w:rPr>
-              <w:t xml:space="preserve">│      GUI – Streamlit  (puerto 8501)         │</w:t>
+              <w:t xml:space="preserve">         |  joblib.load()</w:t>
             </w:r>
           </w:p>
           <w:p>
@@ -251,127 +266,7 @@
                 <w:sz w:val="18"/>
                 <w:szCs w:val="18"/>
               </w:rPr>
-              <w:t xml:space="preserve">│         andeslink-gui (Docker)              │</w:t>
-            </w:r>
-          </w:p>
-          <w:p>
-            <w:r>
-              <w:rPr>
-                <w:rFonts w:ascii="Courier New" w:cs="Courier New" w:eastAsia="Courier New" w:hAnsi="Courier New"/>
-                <w:sz w:val="18"/>
-                <w:szCs w:val="18"/>
-              </w:rPr>
-              <w:t xml:space="preserve">└─────────────────┬───────────────────────────┘</w:t>
-            </w:r>
-          </w:p>
-          <w:p>
-            <w:r>
-              <w:rPr>
-                <w:rFonts w:ascii="Courier New" w:cs="Courier New" w:eastAsia="Courier New" w:hAnsi="Courier New"/>
-                <w:sz w:val="18"/>
-                <w:szCs w:val="18"/>
-              </w:rPr>
-              <w:t xml:space="preserve">                  │  HTTP POST /predecir :8000</w:t>
-            </w:r>
-          </w:p>
-          <w:p>
-            <w:r>
-              <w:rPr>
-                <w:rFonts w:ascii="Courier New" w:cs="Courier New" w:eastAsia="Courier New" w:hAnsi="Courier New"/>
-                <w:sz w:val="18"/>
-                <w:szCs w:val="18"/>
-              </w:rPr>
-              <w:t xml:space="preserve">┌─────────────────▼───────────────────────────┐</w:t>
-            </w:r>
-          </w:p>
-          <w:p>
-            <w:r>
-              <w:rPr>
-                <w:rFonts w:ascii="Courier New" w:cs="Courier New" w:eastAsia="Courier New" w:hAnsi="Courier New"/>
-                <w:sz w:val="18"/>
-                <w:szCs w:val="18"/>
-              </w:rPr>
-              <w:t xml:space="preserve">│      API – FastAPI    (puerto 8000)         │</w:t>
-            </w:r>
-          </w:p>
-          <w:p>
-            <w:r>
-              <w:rPr>
-                <w:rFonts w:ascii="Courier New" w:cs="Courier New" w:eastAsia="Courier New" w:hAnsi="Courier New"/>
-                <w:sz w:val="18"/>
-                <w:szCs w:val="18"/>
-              </w:rPr>
-              <w:t xml:space="preserve">│         andeslink-api (Docker)              │</w:t>
-            </w:r>
-          </w:p>
-          <w:p>
-            <w:r>
-              <w:rPr>
-                <w:rFonts w:ascii="Courier New" w:cs="Courier New" w:eastAsia="Courier New" w:hAnsi="Courier New"/>
-                <w:sz w:val="18"/>
-                <w:szCs w:val="18"/>
-              </w:rPr>
-              <w:t xml:space="preserve">└─────────────────┬───────────────────────────┘</w:t>
-            </w:r>
-          </w:p>
-          <w:p>
-            <w:r>
-              <w:rPr>
-                <w:rFonts w:ascii="Courier New" w:cs="Courier New" w:eastAsia="Courier New" w:hAnsi="Courier New"/>
-                <w:sz w:val="18"/>
-                <w:szCs w:val="18"/>
-              </w:rPr>
-              <w:t xml:space="preserve">                  │  joblib.load()</w:t>
-            </w:r>
-          </w:p>
-          <w:p>
-            <w:r>
-              <w:rPr>
-                <w:rFonts w:ascii="Courier New" w:cs="Courier New" w:eastAsia="Courier New" w:hAnsi="Courier New"/>
-                <w:sz w:val="18"/>
-                <w:szCs w:val="18"/>
-              </w:rPr>
-              <w:t xml:space="preserve">┌─────────────────▼───────────────────────────┐</w:t>
-            </w:r>
-          </w:p>
-          <w:p>
-            <w:r>
-              <w:rPr>
-                <w:rFonts w:ascii="Courier New" w:cs="Courier New" w:eastAsia="Courier New" w:hAnsi="Courier New"/>
-                <w:sz w:val="18"/>
-                <w:szCs w:val="18"/>
-              </w:rPr>
-              <w:t xml:space="preserve">│      MODELOS SERIALIZADOS  (models/)        │</w:t>
-            </w:r>
-          </w:p>
-          <w:p>
-            <w:r>
-              <w:rPr>
-                <w:rFonts w:ascii="Courier New" w:cs="Courier New" w:eastAsia="Courier New" w:hAnsi="Courier New"/>
-                <w:sz w:val="18"/>
-                <w:szCs w:val="18"/>
-              </w:rPr>
-              <w:t xml:space="preserve">│  logistic_regression.joblib  scaler.joblib  │</w:t>
-            </w:r>
-          </w:p>
-          <w:p>
-            <w:r>
-              <w:rPr>
-                <w:rFonts w:ascii="Courier New" w:cs="Courier New" w:eastAsia="Courier New" w:hAnsi="Courier New"/>
-                <w:sz w:val="18"/>
-                <w:szCs w:val="18"/>
-              </w:rPr>
-              <w:t xml:space="preserve">│  encoder_contract/payment/internet/region   │</w:t>
-            </w:r>
-          </w:p>
-          <w:p>
-            <w:r>
-              <w:rPr>
-                <w:rFonts w:ascii="Courier New" w:cs="Courier New" w:eastAsia="Courier New" w:hAnsi="Courier New"/>
-                <w:sz w:val="18"/>
-                <w:szCs w:val="18"/>
-              </w:rPr>
-              <w:t xml:space="preserve">└─────────────────────────────────────────────┘</w:t>
+              <w:t xml:space="preserve">MODELOS SERIALIZADOS  (models/)  [DVC -&gt; DagsHub]</w:t>
             </w:r>
           </w:p>
         </w:tc>
@@ -445,7 +340,7 @@
           <w:sz w:val="22"/>
           <w:szCs w:val="22"/>
         </w:rPr>
-        <w:t xml:space="preserve">La API se implementó con FastAPI y expone dos endpoints:</w:t>
+        <w:t xml:space="preserve">La API se implemento con FastAPI y expone dos endpoints:</w:t>
       </w:r>
     </w:p>
     <w:p>
@@ -463,7 +358,7 @@
           <w:sz w:val="22"/>
           <w:szCs w:val="22"/>
         </w:rPr>
-        <w:t xml:space="preserve">GET /  →  health check, confirma que el servicio está operativo</w:t>
+        <w:t xml:space="preserve">GET /  -&gt;  health check, confirma que el servicio esta operativo</w:t>
       </w:r>
     </w:p>
     <w:p>
@@ -481,7 +376,7 @@
           <w:sz w:val="22"/>
           <w:szCs w:val="22"/>
         </w:rPr>
-        <w:t xml:space="preserve">POST /predecir  →  recibe los datos del cliente y devuelve la predicción</w:t>
+        <w:t xml:space="preserve">POST /predecir  -&gt;  recibe los datos del cliente y devuelve la prediccion</w:t>
       </w:r>
     </w:p>
     <w:p>
@@ -494,7 +389,7 @@
           <w:sz w:val="22"/>
           <w:szCs w:val="22"/>
         </w:rPr>
-        <w:t xml:space="preserve">Al arrancar, la API carga en memoria los 6 artefactos serializados (modelo, scaler y 4 encoders). El contrato de entrada se define con Pydantic, lo que garantiza validación automática de tipos y valores permitidos antes de llegar al modelo.</w:t>
+        <w:t xml:space="preserve">Al arrancar, la API carga en memoria los 6 artefactos serializados (modelo, scaler y 4 encoders). La ruta a los modelos se configura mediante la variable de entorno MODELS_DIR, lo que permite que el contenedor Docker encuentre los archivos correctamente. El contrato de entrada se define con Pydantic, garantizando validacion automatica de tipos y valores permitidos.</w:t>
       </w:r>
     </w:p>
     <w:p>
@@ -547,7 +442,7 @@
                 <w:sz w:val="20"/>
                 <w:szCs w:val="20"/>
               </w:rPr>
-              <w:t xml:space="preserve">Método</w:t>
+              <w:t xml:space="preserve">Metodo</w:t>
             </w:r>
           </w:p>
         </w:tc>
@@ -609,7 +504,7 @@
                 <w:sz w:val="20"/>
                 <w:szCs w:val="20"/>
               </w:rPr>
-              <w:t xml:space="preserve">Descripción</w:t>
+              <w:t xml:space="preserve">Descripcion</w:t>
             </w:r>
           </w:p>
         </w:tc>
@@ -695,7 +590,7 @@
                 <w:sz w:val="20"/>
                 <w:szCs w:val="20"/>
               </w:rPr>
-              <w:t xml:space="preserve">Health check – estado del servicio</w:t>
+              <w:t xml:space="preserve">Health check - estado del servicio</w:t>
             </w:r>
           </w:p>
         </w:tc>
@@ -781,7 +676,7 @@
                 <w:sz w:val="20"/>
                 <w:szCs w:val="20"/>
               </w:rPr>
-              <w:t xml:space="preserve">Predicción de churn para un cliente</w:t>
+              <w:t xml:space="preserve">Prediccion de churn para un cliente</w:t>
             </w:r>
           </w:p>
         </w:tc>
@@ -805,7 +700,7 @@
           <w:sz w:val="26"/>
           <w:szCs w:val="26"/>
         </w:rPr>
-        <w:t xml:space="preserve">3.2 Interfaz Gráfica (Streamlit)</w:t>
+        <w:t xml:space="preserve">3.2 Interfaz Grafica (Streamlit)</w:t>
       </w:r>
     </w:p>
     <w:p>
@@ -831,7 +726,7 @@
           <w:sz w:val="22"/>
           <w:szCs w:val="22"/>
         </w:rPr>
-        <w:t xml:space="preserve">La GUI permite al usuario ingresar los datos de un cliente mediante un formulario con campos validados (selectboxes para categóricas, number inputs para numéricas), disparar la predicción con un botón y visualizar el resultado con indicador de color (verde/rojo) y barra de probabilidad.</w:t>
+        <w:t xml:space="preserve">La GUI permite al usuario ingresar los datos de un cliente mediante un formulario con campos validados, disparar la prediccion con un boton y visualizar el resultado con indicador de color (verde/rojo) y barra de probabilidad.</w:t>
       </w:r>
     </w:p>
     <w:p>
@@ -844,7 +739,7 @@
           <w:sz w:val="22"/>
           <w:szCs w:val="22"/>
         </w:rPr>
-        <w:t xml:space="preserve">La URL de la API se configura mediante la variable de entorno API_URL, lo que permite que la GUI funcione tanto en modo local (http://localhost:8000) como dentro de Docker (http://api:8000) sin cambios en el código.</w:t>
+        <w:t xml:space="preserve">La URL de la API se configura mediante la variable de entorno API_URL, lo que permite que la GUI funcione tanto en modo local (http://localhost:8000) como dentro de Docker (http://api:8000) sin cambios en el codigo.</w:t>
       </w:r>
     </w:p>
     <w:p>
@@ -865,7 +760,7 @@
           <w:sz w:val="26"/>
           <w:szCs w:val="26"/>
         </w:rPr>
-        <w:t xml:space="preserve">3.3 Contenerización (Docker)</w:t>
+        <w:t xml:space="preserve">3.3 Contenerizacion (Docker)</w:t>
       </w:r>
     </w:p>
     <w:p>
@@ -878,7 +773,7 @@
           <w:sz w:val="22"/>
           <w:szCs w:val="22"/>
         </w:rPr>
-        <w:t xml:space="preserve">Se generaron dos imágenes Docker independientes:</w:t>
+        <w:t xml:space="preserve">Se generaron dos imagenes Docker independientes:</w:t>
       </w:r>
     </w:p>
     <w:p>
@@ -896,7 +791,7 @@
           <w:sz w:val="22"/>
           <w:szCs w:val="22"/>
         </w:rPr>
-        <w:t xml:space="preserve">Dockerfile.api — imagen basada en python:3.13-slim que instala dependencias desde requirements.txt, copia los modelos y expone el puerto 8000</w:t>
+        <w:t xml:space="preserve">Dockerfile.api - imagen basada en python:3.13-slim con copias explicitas de cada archivo .joblib y variable de entorno MODELS_DIR=/app/models configurada</w:t>
       </w:r>
     </w:p>
     <w:p>
@@ -914,7 +809,7 @@
           <w:sz w:val="22"/>
           <w:szCs w:val="22"/>
         </w:rPr>
-        <w:t xml:space="preserve">Dockerfile.streamlit — imagen equivalente que copia la GUI y expone el puerto 8501</w:t>
+        <w:t xml:space="preserve">Dockerfile.streamlit - imagen equivalente que copia la GUI y expone el puerto 8501</w:t>
       </w:r>
     </w:p>
     <w:p>
@@ -927,7 +822,112 @@
           <w:sz w:val="22"/>
           <w:szCs w:val="22"/>
         </w:rPr>
-        <w:t xml:space="preserve">La orquestación se maneja con docker-compose.yml. El servicio gui depende del servicio api con condición service_healthy, garantizando que la API esté lista antes de levantar la GUI.</w:t>
+        <w:t xml:space="preserve">La orquestacion se maneja con docker-compose.yml. El servicio gui depende del servicio api con condicion service_healthy, garantizando que la API este lista antes de levantar la GUI.</w:t>
+      </w:r>
+    </w:p>
+    <w:p>
+      <w:pPr>
+        <w:spacing w:after="0" w:before="160"/>
+      </w:pPr>
+    </w:p>
+    <w:p>
+      <w:pPr>
+        <w:pStyle w:val="Heading2"/>
+        <w:spacing w:after="120" w:before="240"/>
+      </w:pPr>
+      <w:r>
+        <w:rPr>
+          <w:rFonts w:ascii="Arial" w:cs="Arial" w:eastAsia="Arial" w:hAnsi="Arial"/>
+          <w:b/>
+          <w:bCs/>
+          <w:sz w:val="26"/>
+          <w:szCs w:val="26"/>
+        </w:rPr>
+        <w:t xml:space="preserve">3.4 Versionado de Datos y Modelos (DVC + DagsHub)</w:t>
+      </w:r>
+    </w:p>
+    <w:p>
+      <w:pPr>
+        <w:spacing w:after="80" w:before="80"/>
+      </w:pPr>
+      <w:r>
+        <w:rPr>
+          <w:rFonts w:ascii="Arial" w:cs="Arial" w:eastAsia="Arial" w:hAnsi="Arial"/>
+          <w:sz w:val="22"/>
+          <w:szCs w:val="22"/>
+        </w:rPr>
+        <w:t xml:space="preserve">Los datos y modelos se versionan con DVC utilizando DagsHub como remote storage. Esto permite que cualquier colaborador pueda recuperar los artefactos ejecutando dvc pull sin necesidad de reentrenar el modelo.</w:t>
+      </w:r>
+    </w:p>
+    <w:p>
+      <w:pPr>
+        <w:spacing w:after="80" w:before="80"/>
+      </w:pPr>
+      <w:r>
+        <w:rPr>
+          <w:rFonts w:ascii="Arial" w:cs="Arial" w:eastAsia="Arial" w:hAnsi="Arial"/>
+          <w:sz w:val="22"/>
+          <w:szCs w:val="22"/>
+        </w:rPr>
+        <w:t xml:space="preserve">El remote se configura localmente con credenciales de DagsHub (no se suben a Git). Cada colaborador genera su propio token gratuito en dagshub.com/user/settings/tokens y lo configura con:</w:t>
+      </w:r>
+    </w:p>
+    <w:p>
+      <w:pPr>
+        <w:shd w:fill="F0F0F0" w:val="clear"/>
+        <w:spacing w:after="60" w:before="60"/>
+        <w:ind w:left="360"/>
+      </w:pPr>
+      <w:r>
+        <w:rPr>
+          <w:rFonts w:ascii="Courier New" w:cs="Courier New" w:eastAsia="Courier New" w:hAnsi="Courier New"/>
+          <w:sz w:val="20"/>
+          <w:szCs w:val="20"/>
+        </w:rPr>
+        <w:t xml:space="preserve">dvc remote modify --local origin auth basic</w:t>
+      </w:r>
+    </w:p>
+    <w:p>
+      <w:pPr>
+        <w:shd w:fill="F0F0F0" w:val="clear"/>
+        <w:spacing w:after="60" w:before="60"/>
+        <w:ind w:left="360"/>
+      </w:pPr>
+      <w:r>
+        <w:rPr>
+          <w:rFonts w:ascii="Courier New" w:cs="Courier New" w:eastAsia="Courier New" w:hAnsi="Courier New"/>
+          <w:sz w:val="20"/>
+          <w:szCs w:val="20"/>
+        </w:rPr>
+        <w:t xml:space="preserve">dvc remote modify --local origin user TU_USUARIO</w:t>
+      </w:r>
+    </w:p>
+    <w:p>
+      <w:pPr>
+        <w:shd w:fill="F0F0F0" w:val="clear"/>
+        <w:spacing w:after="60" w:before="60"/>
+        <w:ind w:left="360"/>
+      </w:pPr>
+      <w:r>
+        <w:rPr>
+          <w:rFonts w:ascii="Courier New" w:cs="Courier New" w:eastAsia="Courier New" w:hAnsi="Courier New"/>
+          <w:sz w:val="20"/>
+          <w:szCs w:val="20"/>
+        </w:rPr>
+        <w:t xml:space="preserve">dvc remote modify --local origin password TU_TOKEN</w:t>
+      </w:r>
+    </w:p>
+    <w:p>
+      <w:pPr>
+        <w:spacing w:after="80" w:before="80"/>
+      </w:pPr>
+      <w:r>
+        <w:rPr>
+          <w:rFonts w:ascii="Arial" w:cs="Arial" w:eastAsia="Arial" w:hAnsi="Arial"/>
+          <w:sz w:val="22"/>
+          <w:szCs w:val="22"/>
+        </w:rPr>
+        <w:t xml:space="preserve">Esta decision reemplaza la configuracion inicial con Google Drive, que presentaba restricciones de verificacion OAuth que impedian el acceso desde nuevas maquinas sin intervencion manual.</w:t>
       </w:r>
     </w:p>
     <w:p>
@@ -967,7 +967,7 @@
           <w:sz w:val="26"/>
           <w:szCs w:val="26"/>
         </w:rPr>
-        <w:t xml:space="preserve">4.1 Entrada — POST /predecir</w:t>
+        <w:t xml:space="preserve">4.1 Entrada - POST /predecir</w:t>
       </w:r>
     </w:p>
     <w:p>
@@ -1168,7 +1168,7 @@
                 <w:sz w:val="20"/>
                 <w:szCs w:val="20"/>
               </w:rPr>
-              <w:t xml:space="preserve">≥ 0 — meses de antigüedad</w:t>
+              <w:t xml:space="preserve">&gt;= 0 - meses de antiguedad</w:t>
             </w:r>
           </w:p>
         </w:tc>
@@ -1254,7 +1254,7 @@
                 <w:sz w:val="20"/>
                 <w:szCs w:val="20"/>
               </w:rPr>
-              <w:t xml:space="preserve">≥ 0 — cargo mensual en USD</w:t>
+              <w:t xml:space="preserve">&gt;= 0 - cargo mensual en USD</w:t>
             </w:r>
           </w:p>
         </w:tc>
@@ -1340,7 +1340,7 @@
                 <w:sz w:val="20"/>
                 <w:szCs w:val="20"/>
               </w:rPr>
-              <w:t xml:space="preserve">≥ 0 — tickets de soporte</w:t>
+              <w:t xml:space="preserve">&gt;= 0 - tickets de soporte</w:t>
             </w:r>
           </w:p>
         </w:tc>
@@ -1426,7 +1426,7 @@
                 <w:sz w:val="20"/>
                 <w:szCs w:val="20"/>
               </w:rPr>
-              <w:t xml:space="preserve">≥ 0 — pagos tardíos</w:t>
+              <w:t xml:space="preserve">&gt;= 0 - pagos tardios</w:t>
             </w:r>
           </w:p>
         </w:tc>
@@ -1512,7 +1512,7 @@
                 <w:sz w:val="20"/>
                 <w:szCs w:val="20"/>
               </w:rPr>
-              <w:t xml:space="preserve">≥ 0 — uso promedio en GB</w:t>
+              <w:t xml:space="preserve">&gt;= 0 - uso promedio en GB</w:t>
             </w:r>
           </w:p>
         </w:tc>
@@ -1598,7 +1598,7 @@
                 <w:sz w:val="20"/>
                 <w:szCs w:val="20"/>
               </w:rPr>
-              <w:t xml:space="preserve">≥ 18 — edad del cliente</w:t>
+              <w:t xml:space="preserve">&gt;= 18 - edad del cliente</w:t>
             </w:r>
           </w:p>
         </w:tc>
@@ -2081,7 +2081,7 @@
                 <w:sz w:val="20"/>
                 <w:szCs w:val="20"/>
               </w:rPr>
-              <w:t xml:space="preserve">Descripción</w:t>
+              <w:t xml:space="preserve">Descripcion</w:t>
             </w:r>
           </w:p>
         </w:tc>
@@ -2339,7 +2339,7 @@
                 <w:sz w:val="20"/>
                 <w:szCs w:val="20"/>
               </w:rPr>
-              <w:t xml:space="preserve">Descripción legible del resultado</w:t>
+              <w:t xml:space="preserve">Descripcion legible del resultado</w:t>
             </w:r>
           </w:p>
         </w:tc>
@@ -2366,7 +2366,7 @@
           <w:sz w:val="32"/>
           <w:szCs w:val="32"/>
         </w:rPr>
-        <w:t xml:space="preserve">5. Pruebas Automáticas</w:t>
+        <w:t xml:space="preserve">5. Pruebas Automaticas</w:t>
       </w:r>
     </w:p>
     <w:p>
@@ -2379,7 +2379,7 @@
           <w:sz w:val="22"/>
           <w:szCs w:val="22"/>
         </w:rPr>
-        <w:t xml:space="preserve">Se implementaron 6 pruebas con pytest en tests/test_api.py utilizando el TestClient de FastAPI, que permite testear la API sin necesidad de levantar un servidor real:</w:t>
+        <w:t xml:space="preserve">Se implementaron 6 pruebas con pytest en tests/test_api.py utilizando el TestClient de FastAPI:</w:t>
       </w:r>
     </w:p>
     <w:p>
@@ -2462,7 +2462,7 @@
                 <w:sz w:val="20"/>
                 <w:szCs w:val="20"/>
               </w:rPr>
-              <w:t xml:space="preserve">Qué verifica</w:t>
+              <w:t xml:space="preserve">Que verifica</w:t>
             </w:r>
           </w:p>
         </w:tc>
@@ -2836,21 +2836,9 @@
     </w:p>
     <w:p>
       <w:pPr>
-        <w:spacing w:after="80" w:before="80"/>
-      </w:pPr>
-      <w:r>
-        <w:rPr>
-          <w:rFonts w:ascii="Arial" w:cs="Arial" w:eastAsia="Arial" w:hAnsi="Arial"/>
-          <w:sz w:val="22"/>
-          <w:szCs w:val="22"/>
-        </w:rPr>
-        <w:t xml:space="preserve">Comando de ejecución:</w:t>
-      </w:r>
-    </w:p>
-    <w:p>
-      <w:pPr>
         <w:shd w:fill="F0F0F0" w:val="clear"/>
-        <w:spacing w:after="80" w:before="80"/>
+        <w:spacing w:after="60" w:before="60"/>
+        <w:ind w:left="360"/>
       </w:pPr>
       <w:r>
         <w:rPr>
@@ -2898,7 +2886,7 @@
           <w:sz w:val="26"/>
           <w:szCs w:val="26"/>
         </w:rPr>
-        <w:t xml:space="preserve">Opción A — Docker (recomendado)</w:t>
+        <w:t xml:space="preserve">Requisitos previos</w:t>
       </w:r>
     </w:p>
     <w:p>
@@ -2916,7 +2904,7 @@
           <w:sz w:val="22"/>
           <w:szCs w:val="22"/>
         </w:rPr>
-        <w:t xml:space="preserve">Tener Docker Desktop abierto y corriendo</w:t>
+        <w:t xml:space="preserve">Anaconda o Miniconda instalado</w:t>
       </w:r>
     </w:p>
     <w:p>
@@ -2934,7 +2922,7 @@
           <w:sz w:val="22"/>
           <w:szCs w:val="22"/>
         </w:rPr>
-        <w:t xml:space="preserve">Ejecutar desde la raíz del proyecto: docker-compose up --build</w:t>
+        <w:t xml:space="preserve">Git instalado</w:t>
       </w:r>
     </w:p>
     <w:p>
@@ -2952,7 +2940,7 @@
           <w:sz w:val="22"/>
           <w:szCs w:val="22"/>
         </w:rPr>
-        <w:t xml:space="preserve">Acceder a la GUI en http://localhost:8501</w:t>
+        <w:t xml:space="preserve">Docker Desktop instalado y corriendo</w:t>
       </w:r>
     </w:p>
     <w:p>
@@ -2970,7 +2958,28 @@
           <w:sz w:val="22"/>
           <w:szCs w:val="22"/>
         </w:rPr>
-        <w:t xml:space="preserve">Acceder a la documentación de la API en http://localhost:8000/docs</w:t>
+        <w:t xml:space="preserve">Cuenta gratuita en DagsHub (dagshub.com) con token generado</w:t>
+      </w:r>
+    </w:p>
+    <w:p>
+      <w:pPr>
+        <w:spacing w:after="0" w:before="160"/>
+      </w:pPr>
+    </w:p>
+    <w:p>
+      <w:pPr>
+        <w:pStyle w:val="Heading2"/>
+        <w:spacing w:after="120" w:before="240"/>
+      </w:pPr>
+      <w:r>
+        <w:rPr>
+          <w:rFonts w:ascii="Arial" w:cs="Arial" w:eastAsia="Arial" w:hAnsi="Arial"/>
+          <w:b/>
+          <w:bCs/>
+          <w:sz w:val="26"/>
+          <w:szCs w:val="26"/>
+        </w:rPr>
+        <w:t xml:space="preserve">Opcion A - Docker (recomendado)</w:t>
       </w:r>
     </w:p>
     <w:p>
@@ -2988,28 +2997,7 @@
           <w:sz w:val="22"/>
           <w:szCs w:val="22"/>
         </w:rPr>
-        <w:t xml:space="preserve">Para detener: docker-compose down</w:t>
-      </w:r>
-    </w:p>
-    <w:p>
-      <w:pPr>
-        <w:spacing w:after="0" w:before="160"/>
-      </w:pPr>
-    </w:p>
-    <w:p>
-      <w:pPr>
-        <w:pStyle w:val="Heading2"/>
-        <w:spacing w:after="120" w:before="240"/>
-      </w:pPr>
-      <w:r>
-        <w:rPr>
-          <w:rFonts w:ascii="Arial" w:cs="Arial" w:eastAsia="Arial" w:hAnsi="Arial"/>
-          <w:b/>
-          <w:bCs/>
-          <w:sz w:val="26"/>
-          <w:szCs w:val="26"/>
-        </w:rPr>
-        <w:t xml:space="preserve">Opción B — Local con conda</w:t>
+        <w:t xml:space="preserve">Clonar el repositorio: git clone https://github.com/Nicosala96/Proyecto-Lab.-Mineria-de-datos</w:t>
       </w:r>
     </w:p>
     <w:p>
@@ -3027,7 +3015,7 @@
           <w:sz w:val="22"/>
           <w:szCs w:val="22"/>
         </w:rPr>
-        <w:t xml:space="preserve">Activar entorno: conda activate andeslink-churn</w:t>
+        <w:t xml:space="preserve">Crear entorno: conda create -n andeslink-churn python=3.13 &amp;&amp; conda activate andeslink-churn</w:t>
       </w:r>
     </w:p>
     <w:p>
@@ -3045,7 +3033,7 @@
           <w:sz w:val="22"/>
           <w:szCs w:val="22"/>
         </w:rPr>
-        <w:t xml:space="preserve">Terminal 1 — API: cd src &amp;&amp; uvicorn api:app --reload</w:t>
+        <w:t xml:space="preserve">Instalar dependencias: pip install -r requirements.txt &amp;&amp; pip install "dvc[http]" mlflow jupyter jupyterlab</w:t>
       </w:r>
     </w:p>
     <w:p>
@@ -3063,7 +3051,7 @@
           <w:sz w:val="22"/>
           <w:szCs w:val="22"/>
         </w:rPr>
-        <w:t xml:space="preserve">Terminal 2 — GUI: cd src &amp;&amp; streamlit run app.py</w:t>
+        <w:t xml:space="preserve">Configurar DVC con token de DagsHub (ver seccion 3.4)</w:t>
       </w:r>
     </w:p>
     <w:p>
@@ -3081,31 +3069,7 @@
           <w:sz w:val="22"/>
           <w:szCs w:val="22"/>
         </w:rPr>
-        <w:t xml:space="preserve">Acceder a http://localhost:8501</w:t>
-      </w:r>
-    </w:p>
-    <w:p>
-      <w:pPr>
-        <w:pBdr>
-          <w:bottom w:val="single" w:color="2E75B6" w:sz="4" w:space="1"/>
-        </w:pBdr>
-        <w:spacing w:after="160" w:before="160"/>
-      </w:pPr>
-    </w:p>
-    <w:p>
-      <w:pPr>
-        <w:pStyle w:val="Heading1"/>
-        <w:spacing w:after="200" w:before="300"/>
-      </w:pPr>
-      <w:r>
-        <w:rPr>
-          <w:rFonts w:ascii="Arial" w:cs="Arial" w:eastAsia="Arial" w:hAnsi="Arial"/>
-          <w:b/>
-          <w:bCs/>
-          <w:sz w:val="32"/>
-          <w:szCs w:val="32"/>
-        </w:rPr>
-        <w:t xml:space="preserve">7. Decisiones Técnicas</w:t>
+        <w:t xml:space="preserve">Descargar modelos y datos: dvc pull</w:t>
       </w:r>
     </w:p>
     <w:p>
@@ -3123,7 +3087,7 @@
           <w:sz w:val="22"/>
           <w:szCs w:val="22"/>
         </w:rPr>
-        <w:t xml:space="preserve">FastAPI sobre Flask: validación automática con Pydantic, documentación interactiva generada automáticamente en /docs y mejor performance asíncrona.</w:t>
+        <w:t xml:space="preserve">Levantar servicios: docker-compose up --build</w:t>
       </w:r>
     </w:p>
     <w:p>
@@ -3141,7 +3105,7 @@
           <w:sz w:val="22"/>
           <w:szCs w:val="22"/>
         </w:rPr>
-        <w:t xml:space="preserve">Streamlit sobre otras alternativas: permite construir una GUI funcional con muy pocas líneas de código, orientada a prototipado rápido de aplicaciones de datos.</w:t>
+        <w:t xml:space="preserve">Acceder a GUI en http://localhost:8501 y API en http://localhost:8000/docs</w:t>
       </w:r>
     </w:p>
     <w:p>
@@ -3159,7 +3123,28 @@
           <w:sz w:val="22"/>
           <w:szCs w:val="22"/>
         </w:rPr>
-        <w:t xml:space="preserve">Dos Dockerfiles separados: permite escalar o reemplazar cada servicio de forma independiente sin afectar al otro.</w:t>
+        <w:t xml:space="preserve">Para detener: docker-compose down</w:t>
+      </w:r>
+    </w:p>
+    <w:p>
+      <w:pPr>
+        <w:spacing w:after="0" w:before="160"/>
+      </w:pPr>
+    </w:p>
+    <w:p>
+      <w:pPr>
+        <w:pStyle w:val="Heading2"/>
+        <w:spacing w:after="120" w:before="240"/>
+      </w:pPr>
+      <w:r>
+        <w:rPr>
+          <w:rFonts w:ascii="Arial" w:cs="Arial" w:eastAsia="Arial" w:hAnsi="Arial"/>
+          <w:b/>
+          <w:bCs/>
+          <w:sz w:val="26"/>
+          <w:szCs w:val="26"/>
+        </w:rPr>
+        <w:t xml:space="preserve">Opcion B - Local con conda</w:t>
       </w:r>
     </w:p>
     <w:p>
@@ -3177,7 +3162,7 @@
           <w:sz w:val="22"/>
           <w:szCs w:val="22"/>
         </w:rPr>
-        <w:t xml:space="preserve">Variable de entorno API_URL: desacopla la GUI de la ubicación de la API, funcionando tanto en local como en Docker sin cambios de código.</w:t>
+        <w:t xml:space="preserve">Seguir pasos 1 a 5 de Opcion A</w:t>
       </w:r>
     </w:p>
     <w:p>
@@ -3195,7 +3180,7 @@
           <w:sz w:val="22"/>
           <w:szCs w:val="22"/>
         </w:rPr>
-        <w:t xml:space="preserve">Healthcheck en Docker Compose: garantiza que la GUI no intente conectarse a la API antes de que esté lista, evitando errores de arranque.</w:t>
+        <w:t xml:space="preserve">Terminal 1 - API: cd src &amp;&amp; uvicorn api:app --reload</w:t>
       </w:r>
     </w:p>
     <w:p>
@@ -3213,31 +3198,7 @@
           <w:sz w:val="22"/>
           <w:szCs w:val="22"/>
         </w:rPr>
-        <w:t xml:space="preserve">Encoders individuales por columna: corrige el problema de la primera entrega donde todos los encoders sobreescribían la misma variable, perdiendo los parámetros aprendidos.</w:t>
-      </w:r>
-    </w:p>
-    <w:p>
-      <w:pPr>
-        <w:pBdr>
-          <w:bottom w:val="single" w:color="2E75B6" w:sz="4" w:space="1"/>
-        </w:pBdr>
-        <w:spacing w:after="160" w:before="160"/>
-      </w:pPr>
-    </w:p>
-    <w:p>
-      <w:pPr>
-        <w:pStyle w:val="Heading1"/>
-        <w:spacing w:after="200" w:before="300"/>
-      </w:pPr>
-      <w:r>
-        <w:rPr>
-          <w:rFonts w:ascii="Arial" w:cs="Arial" w:eastAsia="Arial" w:hAnsi="Arial"/>
-          <w:b/>
-          <w:bCs/>
-          <w:sz w:val="32"/>
-          <w:szCs w:val="32"/>
-        </w:rPr>
-        <w:t xml:space="preserve">8. Limitaciones Conocidas</w:t>
+        <w:t xml:space="preserve">Terminal 2 - GUI: cd src &amp;&amp; streamlit run app.py</w:t>
       </w:r>
     </w:p>
     <w:p>
@@ -3255,7 +3216,31 @@
           <w:sz w:val="22"/>
           <w:szCs w:val="22"/>
         </w:rPr>
-        <w:t xml:space="preserve">DVC no tiene configurado un storage remoto. Los archivos .dvc están commiteados en Git como evidencia de trazabilidad, pero un colaborador externo debe obtener los datos y modelos por otro medio.</w:t>
+        <w:t xml:space="preserve">Acceder a http://localhost:8501</w:t>
+      </w:r>
+    </w:p>
+    <w:p>
+      <w:pPr>
+        <w:pBdr>
+          <w:bottom w:val="single" w:color="2E75B6" w:sz="4" w:space="1"/>
+        </w:pBdr>
+        <w:spacing w:after="160" w:before="160"/>
+      </w:pPr>
+    </w:p>
+    <w:p>
+      <w:pPr>
+        <w:pStyle w:val="Heading1"/>
+        <w:spacing w:after="200" w:before="300"/>
+      </w:pPr>
+      <w:r>
+        <w:rPr>
+          <w:rFonts w:ascii="Arial" w:cs="Arial" w:eastAsia="Arial" w:hAnsi="Arial"/>
+          <w:b/>
+          <w:bCs/>
+          <w:sz w:val="32"/>
+          <w:szCs w:val="32"/>
+        </w:rPr>
+        <w:t xml:space="preserve">7. Decisiones Tecnicas</w:t>
       </w:r>
     </w:p>
     <w:p>
@@ -3273,7 +3258,7 @@
           <w:sz w:val="22"/>
           <w:szCs w:val="22"/>
         </w:rPr>
-        <w:t xml:space="preserve">La GUI dentro de Docker no puede conectarse directamente al localhost del host. La solución recomendada es correr la GUI localmente mientras Docker sirve la API.</w:t>
+        <w:t xml:space="preserve">FastAPI sobre Flask: validacion automatica con Pydantic, documentacion interactiva en /docs y mejor performance asincrona.</w:t>
       </w:r>
     </w:p>
     <w:p>
@@ -3291,7 +3276,7 @@
           <w:sz w:val="22"/>
           <w:szCs w:val="22"/>
         </w:rPr>
-        <w:t xml:space="preserve">Los modelos se serializaron con scikit-learn 1.7.1. Si se usan con versiones posteriores pueden aparecer InconsistentVersionWarnings, aunque sin impacto funcional en esta versión.</w:t>
+        <w:t xml:space="preserve">Streamlit: permite construir una GUI funcional con pocas lineas de codigo, orientada a prototipado rapido de aplicaciones de datos.</w:t>
       </w:r>
     </w:p>
     <w:p>
@@ -3309,7 +3294,211 @@
           <w:sz w:val="22"/>
           <w:szCs w:val="22"/>
         </w:rPr>
-        <w:t xml:space="preserve">No se implementó autenticación en la API. Para un entorno productivo real sería necesario agregar al menos una API key.</w:t>
+        <w:t xml:space="preserve">Dos Dockerfiles separados: permite escalar o reemplazar cada servicio de forma independiente.</w:t>
+      </w:r>
+    </w:p>
+    <w:p>
+      <w:pPr>
+        <w:pStyle w:val="ListParagraph"/>
+        <w:numPr>
+          <w:ilvl w:val="0"/>
+          <w:numId w:val="2"/>
+        </w:numPr>
+        <w:spacing w:after="60" w:before="60"/>
+      </w:pPr>
+      <w:r>
+        <w:rPr>
+          <w:rFonts w:ascii="Arial" w:cs="Arial" w:eastAsia="Arial" w:hAnsi="Arial"/>
+          <w:sz w:val="22"/>
+          <w:szCs w:val="22"/>
+        </w:rPr>
+        <w:t xml:space="preserve">Variable de entorno MODELS_DIR: desacopla la API de la ubicacion fisica de los modelos, funcionando tanto en local como en Docker.</w:t>
+      </w:r>
+    </w:p>
+    <w:p>
+      <w:pPr>
+        <w:pStyle w:val="ListParagraph"/>
+        <w:numPr>
+          <w:ilvl w:val="0"/>
+          <w:numId w:val="2"/>
+        </w:numPr>
+        <w:spacing w:after="60" w:before="60"/>
+      </w:pPr>
+      <w:r>
+        <w:rPr>
+          <w:rFonts w:ascii="Arial" w:cs="Arial" w:eastAsia="Arial" w:hAnsi="Arial"/>
+          <w:sz w:val="22"/>
+          <w:szCs w:val="22"/>
+        </w:rPr>
+        <w:t xml:space="preserve">Variable de entorno API_URL: desacopla la GUI de la ubicacion de la API, funcionando en ambos entornos sin cambios de codigo.</w:t>
+      </w:r>
+    </w:p>
+    <w:p>
+      <w:pPr>
+        <w:pStyle w:val="ListParagraph"/>
+        <w:numPr>
+          <w:ilvl w:val="0"/>
+          <w:numId w:val="2"/>
+        </w:numPr>
+        <w:spacing w:after="60" w:before="60"/>
+      </w:pPr>
+      <w:r>
+        <w:rPr>
+          <w:rFonts w:ascii="Arial" w:cs="Arial" w:eastAsia="Arial" w:hAnsi="Arial"/>
+          <w:sz w:val="22"/>
+          <w:szCs w:val="22"/>
+        </w:rPr>
+        <w:t xml:space="preserve">Healthcheck en Docker Compose: garantiza que la GUI no intente conectarse a la API antes de que este lista.</w:t>
+      </w:r>
+    </w:p>
+    <w:p>
+      <w:pPr>
+        <w:pStyle w:val="ListParagraph"/>
+        <w:numPr>
+          <w:ilvl w:val="0"/>
+          <w:numId w:val="2"/>
+        </w:numPr>
+        <w:spacing w:after="60" w:before="60"/>
+      </w:pPr>
+      <w:r>
+        <w:rPr>
+          <w:rFonts w:ascii="Arial" w:cs="Arial" w:eastAsia="Arial" w:hAnsi="Arial"/>
+          <w:sz w:val="22"/>
+          <w:szCs w:val="22"/>
+        </w:rPr>
+        <w:t xml:space="preserve">DagsHub como remote de DVC: reemplaza Google Drive por una plataforma disenada para ML que permite autenticacion por token sin restricciones OAuth.</w:t>
+      </w:r>
+    </w:p>
+    <w:p>
+      <w:pPr>
+        <w:pStyle w:val="ListParagraph"/>
+        <w:numPr>
+          <w:ilvl w:val="0"/>
+          <w:numId w:val="2"/>
+        </w:numPr>
+        <w:spacing w:after="60" w:before="60"/>
+      </w:pPr>
+      <w:r>
+        <w:rPr>
+          <w:rFonts w:ascii="Arial" w:cs="Arial" w:eastAsia="Arial" w:hAnsi="Arial"/>
+          <w:sz w:val="22"/>
+          <w:szCs w:val="22"/>
+        </w:rPr>
+        <w:t xml:space="preserve">Encoders individuales por columna: corrige el problema de la primera entrega donde todos los encoders sobreescribian la misma variable.</w:t>
+      </w:r>
+    </w:p>
+    <w:p>
+      <w:pPr>
+        <w:pStyle w:val="ListParagraph"/>
+        <w:numPr>
+          <w:ilvl w:val="0"/>
+          <w:numId w:val="2"/>
+        </w:numPr>
+        <w:spacing w:after="60" w:before="60"/>
+      </w:pPr>
+      <w:r>
+        <w:rPr>
+          <w:rFonts w:ascii="Arial" w:cs="Arial" w:eastAsia="Arial" w:hAnsi="Arial"/>
+          <w:sz w:val="22"/>
+          <w:szCs w:val="22"/>
+        </w:rPr>
+        <w:t xml:space="preserve">Copias explicitas de modelos en Dockerfile.api: evita que Docker copie solo los archivos .dvc en lugar de los .joblib reales.</w:t>
+      </w:r>
+    </w:p>
+    <w:p>
+      <w:pPr>
+        <w:pBdr>
+          <w:bottom w:val="single" w:color="2E75B6" w:sz="4" w:space="1"/>
+        </w:pBdr>
+        <w:spacing w:after="160" w:before="160"/>
+      </w:pPr>
+    </w:p>
+    <w:p>
+      <w:pPr>
+        <w:pStyle w:val="Heading1"/>
+        <w:spacing w:after="200" w:before="300"/>
+      </w:pPr>
+      <w:r>
+        <w:rPr>
+          <w:rFonts w:ascii="Arial" w:cs="Arial" w:eastAsia="Arial" w:hAnsi="Arial"/>
+          <w:b/>
+          <w:bCs/>
+          <w:sz w:val="32"/>
+          <w:szCs w:val="32"/>
+        </w:rPr>
+        <w:t xml:space="preserve">8. Limitaciones Conocidas</w:t>
+      </w:r>
+    </w:p>
+    <w:p>
+      <w:pPr>
+        <w:pStyle w:val="ListParagraph"/>
+        <w:numPr>
+          <w:ilvl w:val="0"/>
+          <w:numId w:val="2"/>
+        </w:numPr>
+        <w:spacing w:after="60" w:before="60"/>
+      </w:pPr>
+      <w:r>
+        <w:rPr>
+          <w:rFonts w:ascii="Arial" w:cs="Arial" w:eastAsia="Arial" w:hAnsi="Arial"/>
+          <w:sz w:val="22"/>
+          <w:szCs w:val="22"/>
+        </w:rPr>
+        <w:t xml:space="preserve">El dvc pull requiere que cada colaborador configure su propio token de DagsHub localmente. No es un paso completamente automatico pero es simple y gratuito.</w:t>
+      </w:r>
+    </w:p>
+    <w:p>
+      <w:pPr>
+        <w:pStyle w:val="ListParagraph"/>
+        <w:numPr>
+          <w:ilvl w:val="0"/>
+          <w:numId w:val="2"/>
+        </w:numPr>
+        <w:spacing w:after="60" w:before="60"/>
+      </w:pPr>
+      <w:r>
+        <w:rPr>
+          <w:rFonts w:ascii="Arial" w:cs="Arial" w:eastAsia="Arial" w:hAnsi="Arial"/>
+          <w:sz w:val="22"/>
+          <w:szCs w:val="22"/>
+        </w:rPr>
+        <w:t xml:space="preserve">La GUI dentro de Docker no puede conectarse directamente al localhost del host. Se recomienda correr la GUI localmente mientras Docker sirve la API, o usar docker-compose up --build con ambos servicios.</w:t>
+      </w:r>
+    </w:p>
+    <w:p>
+      <w:pPr>
+        <w:pStyle w:val="ListParagraph"/>
+        <w:numPr>
+          <w:ilvl w:val="0"/>
+          <w:numId w:val="2"/>
+        </w:numPr>
+        <w:spacing w:after="60" w:before="60"/>
+      </w:pPr>
+      <w:r>
+        <w:rPr>
+          <w:rFonts w:ascii="Arial" w:cs="Arial" w:eastAsia="Arial" w:hAnsi="Arial"/>
+          <w:sz w:val="22"/>
+          <w:szCs w:val="22"/>
+        </w:rPr>
+        <w:t xml:space="preserve">Los modelos se serializaron con scikit-learn 1.7.1. Si se usan con versiones posteriores pueden aparecer InconsistentVersionWarnings, aunque sin impacto funcional en esta version.</w:t>
+      </w:r>
+    </w:p>
+    <w:p>
+      <w:pPr>
+        <w:pStyle w:val="ListParagraph"/>
+        <w:numPr>
+          <w:ilvl w:val="0"/>
+          <w:numId w:val="2"/>
+        </w:numPr>
+        <w:spacing w:after="60" w:before="60"/>
+      </w:pPr>
+      <w:r>
+        <w:rPr>
+          <w:rFonts w:ascii="Arial" w:cs="Arial" w:eastAsia="Arial" w:hAnsi="Arial"/>
+          <w:sz w:val="22"/>
+          <w:szCs w:val="22"/>
+        </w:rPr>
+        <w:t xml:space="preserve">No se implemento autenticacion en la API. Para un entorno productivo real seria necesario agregar al menos una API key.</w:t>
       </w:r>
     </w:p>
     <w:sectPr>
@@ -3367,11 +3556,6 @@
 <file path=word/footer1.xml><?xml version="1.0" encoding="utf-8"?>
 <w:ftr xmlns:wpc="http://schemas.microsoft.com/office/word/2010/wordprocessingCanvas" xmlns:mc="http://schemas.openxmlformats.org/markup-compatibility/2006" xmlns:o="urn:schemas-microsoft-com:office:office" xmlns:r="http://schemas.openxmlformats.org/officeDocument/2006/relationships" xmlns:m="http://schemas.openxmlformats.org/officeDocument/2006/math" xmlns:v="urn:schemas-microsoft-com:vml" xmlns:wp14="http://schemas.microsoft.com/office/word/2010/wordprocessingDrawing" xmlns:wp="http://schemas.openxmlformats.org/drawingml/2006/wordprocessingDrawing" xmlns:w10="urn:schemas-microsoft-com:office:word" xmlns:w="http://schemas.openxmlformats.org/wordprocessingml/2006/main" xmlns:w14="http://schemas.microsoft.com/office/word/2010/wordml" xmlns:w15="http://schemas.microsoft.com/office/word/2012/wordml" xmlns:wpg="http://schemas.microsoft.com/office/word/2010/wordprocessingGroup" xmlns:wpi="http://schemas.microsoft.com/office/word/2010/wordprocessingInk" xmlns:wne="http://schemas.microsoft.com/office/word/2006/wordml" xmlns:wps="http://schemas.microsoft.com/office/word/2010/wordprocessingShape">
   <w:p>
-    <w:pPr>
-      <w:tabs>
-        <w:tab w:val="right" w:pos="9026"/>
-      </w:tabs>
-    </w:pPr>
     <w:r>
       <w:rPr>
         <w:rFonts w:ascii="Arial" w:cs="Arial" w:eastAsia="Arial" w:hAnsi="Arial"/>
@@ -3379,16 +3563,7 @@
         <w:sz w:val="18"/>
         <w:szCs w:val="18"/>
       </w:rPr>
-      <w:t xml:space="preserve">AndesLink – Documento Técnico de Despliegue  </w:t>
-    </w:r>
-    <w:r>
-      <w:rPr>
-        <w:rFonts w:ascii="Arial" w:cs="Arial" w:eastAsia="Arial" w:hAnsi="Arial"/>
-        <w:color w:val="888888"/>
-        <w:sz w:val="18"/>
-        <w:szCs w:val="18"/>
-      </w:rPr>
-      <w:t xml:space="preserve"/>
+      <w:t xml:space="preserve">AndesLink – Documento Tecnico de Despliegue</w:t>
     </w:r>
   </w:p>
 </w:ftr>

</xml_diff>

<commit_message>
docs: actualizar README y documento tecnico a v1.1.0
</commit_message>
<xml_diff>
--- a/documento_tecnico_despliegue.docx
+++ b/documento_tecnico_despliegue.docx
@@ -46,7 +46,7 @@
           <w:sz w:val="22"/>
           <w:szCs w:val="22"/>
         </w:rPr>
-        <w:t xml:space="preserve">Segunda Entrega - MLOps Local</w:t>
+        <w:t xml:space="preserve">Segunda Entrega - MLOps Local  |  Version 1.1.0</w:t>
       </w:r>
     </w:p>
     <w:p>
@@ -126,7 +126,7 @@
           <w:sz w:val="22"/>
           <w:szCs w:val="22"/>
         </w:rPr>
-        <w:t xml:space="preserve">En esta etapa se convirtio el modelo de prediccion de churn entrenado en la primera entrega en un servicio productivo local, compuesto por una API de inferencia, una interfaz grafica de usuario y un entorno de despliegue contenerizado y reproducible.</w:t>
+        <w:t xml:space="preserve">En esta etapa se convirtio el modelo de prediccion de churn en un servicio productivo local compuesto por una API de inferencia (FastAPI), una interfaz grafica (Streamlit) y un entorno de despliegue contenerizado y reproducible (Docker). Ademas se incorporo logging operativo, endpoint de health check con validacion de artefactos e informacion de version del modelo.</w:t>
       </w:r>
     </w:p>
     <w:p>
@@ -256,7 +256,7 @@
                 <w:sz w:val="18"/>
                 <w:szCs w:val="18"/>
               </w:rPr>
-              <w:t xml:space="preserve">         |  joblib.load()</w:t>
+              <w:t xml:space="preserve">         |  joblib.load() via MODELS_DIR</w:t>
             </w:r>
           </w:p>
           <w:p>
@@ -314,7 +314,7 @@
           <w:sz w:val="26"/>
           <w:szCs w:val="26"/>
         </w:rPr>
-        <w:t xml:space="preserve">3.1 API de Inferencia (FastAPI)</w:t>
+        <w:t xml:space="preserve">3.1 API de Inferencia (FastAPI) — v1.1.0</w:t>
       </w:r>
     </w:p>
     <w:p>
@@ -340,7 +340,7 @@
           <w:sz w:val="22"/>
           <w:szCs w:val="22"/>
         </w:rPr>
-        <w:t xml:space="preserve">La API se implemento con FastAPI y expone dos endpoints:</w:t>
+        <w:t xml:space="preserve">La API expone tres endpoints:</w:t>
       </w:r>
     </w:p>
     <w:p>
@@ -358,7 +358,7 @@
           <w:sz w:val="22"/>
           <w:szCs w:val="22"/>
         </w:rPr>
-        <w:t xml:space="preserve">GET /  -&gt;  health check, confirma que el servicio esta operativo</w:t>
+        <w:t xml:space="preserve">GET /  -&gt;  respuesta basica de estado y version del modelo</w:t>
       </w:r>
     </w:p>
     <w:p>
@@ -376,7 +376,25 @@
           <w:sz w:val="22"/>
           <w:szCs w:val="22"/>
         </w:rPr>
-        <w:t xml:space="preserve">POST /predecir  -&gt;  recibe los datos del cliente y devuelve la prediccion</w:t>
+        <w:t xml:space="preserve">GET /health  -&gt;  valida que cada artefacto esta cargado en memoria e informa su estado individualmente</w:t>
+      </w:r>
+    </w:p>
+    <w:p>
+      <w:pPr>
+        <w:pStyle w:val="ListParagraph"/>
+        <w:numPr>
+          <w:ilvl w:val="0"/>
+          <w:numId w:val="2"/>
+        </w:numPr>
+        <w:spacing w:after="60" w:before="60"/>
+      </w:pPr>
+      <w:r>
+        <w:rPr>
+          <w:rFonts w:ascii="Arial" w:cs="Arial" w:eastAsia="Arial" w:hAnsi="Arial"/>
+          <w:sz w:val="22"/>
+          <w:szCs w:val="22"/>
+        </w:rPr>
+        <w:t xml:space="preserve">POST /predecir  -&gt;  recibe las 10 variables del cliente, aplica encoders y scaler, y devuelve la prediccion</w:t>
       </w:r>
     </w:p>
     <w:p>
@@ -389,7 +407,7 @@
           <w:sz w:val="22"/>
           <w:szCs w:val="22"/>
         </w:rPr>
-        <w:t xml:space="preserve">Al arrancar, la API carga en memoria los 6 artefactos serializados (modelo, scaler y 4 encoders). La ruta a los modelos se configura mediante la variable de entorno MODELS_DIR, lo que permite que el contenedor Docker encuentre los archivos correctamente. El contrato de entrada se define con Pydantic, garantizando validacion automatica de tipos y valores permitidos.</w:t>
+        <w:t xml:space="preserve">Cambios respecto a la version anterior: se agrego el endpoint /health con validacion de artefactos, se incorporo logging operativo por request e inferencia, se informa la version del modelo en /health y en la respuesta de /predecir, y se corrigio el DataFrame de prediccion para incluir las 10 variables con las que fue entrenado el modelo (payment_method, internet_service y region estaban ausentes en la version 1.0.0).</w:t>
       </w:r>
     </w:p>
     <w:p>
@@ -590,7 +608,7 @@
                 <w:sz w:val="20"/>
                 <w:szCs w:val="20"/>
               </w:rPr>
-              <w:t xml:space="preserve">Health check - estado del servicio</w:t>
+              <w:t xml:space="preserve">Estado de la API y version del modelo</w:t>
             </w:r>
           </w:p>
         </w:tc>
@@ -620,6 +638,92 @@
                 <w:sz w:val="20"/>
                 <w:szCs w:val="20"/>
               </w:rPr>
+              <w:t xml:space="preserve">GET</w:t>
+            </w:r>
+          </w:p>
+        </w:tc>
+        <w:tc>
+          <w:tcPr>
+            <w:tcW w:type="dxa" w:w="2500"/>
+            <w:tcBorders>
+              <w:top w:val="single" w:color="CCCCCC" w:sz="1"/>
+              <w:left w:val="single" w:color="CCCCCC" w:sz="1"/>
+              <w:bottom w:val="single" w:color="CCCCCC" w:sz="1"/>
+              <w:right w:val="single" w:color="CCCCCC" w:sz="1"/>
+            </w:tcBorders>
+            <w:shd w:fill="EBF3FB" w:val="clear"/>
+            <w:tcMar>
+              <w:top w:type="dxa" w:w="80"/>
+              <w:left w:type="dxa" w:w="120"/>
+              <w:bottom w:type="dxa" w:w="80"/>
+              <w:right w:type="dxa" w:w="120"/>
+            </w:tcMar>
+          </w:tcPr>
+          <w:p>
+            <w:r>
+              <w:rPr>
+                <w:rFonts w:ascii="Arial" w:cs="Arial" w:eastAsia="Arial" w:hAnsi="Arial"/>
+                <w:sz w:val="20"/>
+                <w:szCs w:val="20"/>
+              </w:rPr>
+              <w:t xml:space="preserve">/health</w:t>
+            </w:r>
+          </w:p>
+        </w:tc>
+        <w:tc>
+          <w:tcPr>
+            <w:tcW w:type="dxa" w:w="4860"/>
+            <w:tcBorders>
+              <w:top w:val="single" w:color="CCCCCC" w:sz="1"/>
+              <w:left w:val="single" w:color="CCCCCC" w:sz="1"/>
+              <w:bottom w:val="single" w:color="CCCCCC" w:sz="1"/>
+              <w:right w:val="single" w:color="CCCCCC" w:sz="1"/>
+            </w:tcBorders>
+            <w:shd w:fill="EBF3FB" w:val="clear"/>
+            <w:tcMar>
+              <w:top w:type="dxa" w:w="80"/>
+              <w:left w:type="dxa" w:w="120"/>
+              <w:bottom w:type="dxa" w:w="80"/>
+              <w:right w:type="dxa" w:w="120"/>
+            </w:tcMar>
+          </w:tcPr>
+          <w:p>
+            <w:r>
+              <w:rPr>
+                <w:rFonts w:ascii="Arial" w:cs="Arial" w:eastAsia="Arial" w:hAnsi="Arial"/>
+                <w:sz w:val="20"/>
+                <w:szCs w:val="20"/>
+              </w:rPr>
+              <w:t xml:space="preserve">Validacion de artefactos cargados en memoria</w:t>
+            </w:r>
+          </w:p>
+        </w:tc>
+      </w:tr>
+      <w:tr>
+        <w:tc>
+          <w:tcPr>
+            <w:tcW w:type="dxa" w:w="2000"/>
+            <w:tcBorders>
+              <w:top w:val="single" w:color="CCCCCC" w:sz="1"/>
+              <w:left w:val="single" w:color="CCCCCC" w:sz="1"/>
+              <w:bottom w:val="single" w:color="CCCCCC" w:sz="1"/>
+              <w:right w:val="single" w:color="CCCCCC" w:sz="1"/>
+            </w:tcBorders>
+            <w:shd w:fill="FFFFFF" w:val="clear"/>
+            <w:tcMar>
+              <w:top w:type="dxa" w:w="80"/>
+              <w:left w:type="dxa" w:w="120"/>
+              <w:bottom w:type="dxa" w:w="80"/>
+              <w:right w:type="dxa" w:w="120"/>
+            </w:tcMar>
+          </w:tcPr>
+          <w:p>
+            <w:r>
+              <w:rPr>
+                <w:rFonts w:ascii="Arial" w:cs="Arial" w:eastAsia="Arial" w:hAnsi="Arial"/>
+                <w:sz w:val="20"/>
+                <w:szCs w:val="20"/>
+              </w:rPr>
               <w:t xml:space="preserve">POST</w:t>
             </w:r>
           </w:p>
@@ -633,7 +737,7 @@
               <w:bottom w:val="single" w:color="CCCCCC" w:sz="1"/>
               <w:right w:val="single" w:color="CCCCCC" w:sz="1"/>
             </w:tcBorders>
-            <w:shd w:fill="EBF3FB" w:val="clear"/>
+            <w:shd w:fill="FFFFFF" w:val="clear"/>
             <w:tcMar>
               <w:top w:type="dxa" w:w="80"/>
               <w:left w:type="dxa" w:w="120"/>
@@ -661,22 +765,22 @@
               <w:bottom w:val="single" w:color="CCCCCC" w:sz="1"/>
               <w:right w:val="single" w:color="CCCCCC" w:sz="1"/>
             </w:tcBorders>
-            <w:shd w:fill="EBF3FB" w:val="clear"/>
-            <w:tcMar>
-              <w:top w:type="dxa" w:w="80"/>
-              <w:left w:type="dxa" w:w="120"/>
-              <w:bottom w:type="dxa" w:w="80"/>
-              <w:right w:type="dxa" w:w="120"/>
-            </w:tcMar>
-          </w:tcPr>
-          <w:p>
-            <w:r>
-              <w:rPr>
-                <w:rFonts w:ascii="Arial" w:cs="Arial" w:eastAsia="Arial" w:hAnsi="Arial"/>
-                <w:sz w:val="20"/>
-                <w:szCs w:val="20"/>
-              </w:rPr>
-              <w:t xml:space="preserve">Prediccion de churn para un cliente</w:t>
+            <w:shd w:fill="FFFFFF" w:val="clear"/>
+            <w:tcMar>
+              <w:top w:type="dxa" w:w="80"/>
+              <w:left w:type="dxa" w:w="120"/>
+              <w:bottom w:type="dxa" w:w="80"/>
+              <w:right w:type="dxa" w:w="120"/>
+            </w:tcMar>
+          </w:tcPr>
+          <w:p>
+            <w:r>
+              <w:rPr>
+                <w:rFonts w:ascii="Arial" w:cs="Arial" w:eastAsia="Arial" w:hAnsi="Arial"/>
+                <w:sz w:val="20"/>
+                <w:szCs w:val="20"/>
+              </w:rPr>
+              <w:t xml:space="preserve">Prediccion de churn con las 10 variables</w:t>
             </w:r>
           </w:p>
         </w:tc>
@@ -726,20 +830,7 @@
           <w:sz w:val="22"/>
           <w:szCs w:val="22"/>
         </w:rPr>
-        <w:t xml:space="preserve">La GUI permite al usuario ingresar los datos de un cliente mediante un formulario con campos validados, disparar la prediccion con un boton y visualizar el resultado con indicador de color (verde/rojo) y barra de probabilidad.</w:t>
-      </w:r>
-    </w:p>
-    <w:p>
-      <w:pPr>
-        <w:spacing w:after="80" w:before="80"/>
-      </w:pPr>
-      <w:r>
-        <w:rPr>
-          <w:rFonts w:ascii="Arial" w:cs="Arial" w:eastAsia="Arial" w:hAnsi="Arial"/>
-          <w:sz w:val="22"/>
-          <w:szCs w:val="22"/>
-        </w:rPr>
-        <w:t xml:space="preserve">La URL de la API se configura mediante la variable de entorno API_URL, lo que permite que la GUI funcione tanto en modo local (http://localhost:8000) como dentro de Docker (http://api:8000) sin cambios en el codigo.</w:t>
+        <w:t xml:space="preserve">La GUI permite ingresar las 10 variables del cliente, disparar la prediccion y visualizar el resultado con indicador de color (verde/rojo), etiqueta descriptiva y barra de probabilidad. La URL de la API se configura mediante la variable de entorno API_URL, lo que permite operar tanto en modo local como dentro de Docker sin cambios en el codigo.</w:t>
       </w:r>
     </w:p>
     <w:p>
@@ -773,7 +864,7 @@
           <w:sz w:val="22"/>
           <w:szCs w:val="22"/>
         </w:rPr>
-        <w:t xml:space="preserve">Se generaron dos imagenes Docker independientes:</w:t>
+        <w:t xml:space="preserve">Dos imagenes Docker independientes orquestadas con docker-compose.yml:</w:t>
       </w:r>
     </w:p>
     <w:p>
@@ -791,7 +882,7 @@
           <w:sz w:val="22"/>
           <w:szCs w:val="22"/>
         </w:rPr>
-        <w:t xml:space="preserve">Dockerfile.api - imagen basada en python:3.13-slim con copias explicitas de cada archivo .joblib y variable de entorno MODELS_DIR=/app/models configurada</w:t>
+        <w:t xml:space="preserve">Dockerfile.api — python:3.13-slim, copia explicita de cada .joblib, variable de entorno MODELS_DIR=/app/models, puerto 8000</w:t>
       </w:r>
     </w:p>
     <w:p>
@@ -809,7 +900,7 @@
           <w:sz w:val="22"/>
           <w:szCs w:val="22"/>
         </w:rPr>
-        <w:t xml:space="preserve">Dockerfile.streamlit - imagen equivalente que copia la GUI y expone el puerto 8501</w:t>
+        <w:t xml:space="preserve">Dockerfile.streamlit — python:3.13-slim, copia de la GUI, variable de entorno API_URL, puerto 8501</w:t>
       </w:r>
     </w:p>
     <w:p>
@@ -822,7 +913,20 @@
           <w:sz w:val="22"/>
           <w:szCs w:val="22"/>
         </w:rPr>
-        <w:t xml:space="preserve">La orquestacion se maneja con docker-compose.yml. El servicio gui depende del servicio api con condicion service_healthy, garantizando que la API este lista antes de levantar la GUI.</w:t>
+        <w:t xml:space="preserve">El servicio gui depende del servicio api con condicion service_healthy usando el endpoint /health como verificador. Esto garantiza que la GUI no intente conectarse antes de que los modelos esten cargados.</w:t>
+      </w:r>
+    </w:p>
+    <w:p>
+      <w:pPr>
+        <w:spacing w:after="80" w:before="80"/>
+      </w:pPr>
+      <w:r>
+        <w:rPr>
+          <w:rFonts w:ascii="Arial" w:cs="Arial" w:eastAsia="Arial" w:hAnsi="Arial"/>
+          <w:sz w:val="22"/>
+          <w:szCs w:val="22"/>
+        </w:rPr>
+        <w:t xml:space="preserve">ADVERTENCIA: el build de Docker requiere que los archivos .joblib existan localmente. Si no se ejecuta dvc pull antes de docker-compose up --build, el build falla con FileNotFoundError.</w:t>
       </w:r>
     </w:p>
     <w:p>
@@ -856,7 +960,7 @@
           <w:sz w:val="22"/>
           <w:szCs w:val="22"/>
         </w:rPr>
-        <w:t xml:space="preserve">Los datos y modelos se versionan con DVC utilizando DagsHub como remote storage. Esto permite que cualquier colaborador pueda recuperar los artefactos ejecutando dvc pull sin necesidad de reentrenar el modelo.</w:t>
+        <w:t xml:space="preserve">Los datos y modelos se versionan con DVC utilizando DagsHub como remote storage. Cada colaborador configura sus credenciales localmente con su propio token de DagsHub (gratuito) y ejecuta dvc pull para recuperar los artefactos.</w:t>
       </w:r>
     </w:p>
     <w:p>
@@ -869,65 +973,7 @@
           <w:sz w:val="22"/>
           <w:szCs w:val="22"/>
         </w:rPr>
-        <w:t xml:space="preserve">El remote se configura localmente con credenciales de DagsHub (no se suben a Git). Cada colaborador genera su propio token gratuito en dagshub.com/user/settings/tokens y lo configura con:</w:t>
-      </w:r>
-    </w:p>
-    <w:p>
-      <w:pPr>
-        <w:shd w:fill="F0F0F0" w:val="clear"/>
-        <w:spacing w:after="60" w:before="60"/>
-        <w:ind w:left="360"/>
-      </w:pPr>
-      <w:r>
-        <w:rPr>
-          <w:rFonts w:ascii="Courier New" w:cs="Courier New" w:eastAsia="Courier New" w:hAnsi="Courier New"/>
-          <w:sz w:val="20"/>
-          <w:szCs w:val="20"/>
-        </w:rPr>
-        <w:t xml:space="preserve">dvc remote modify --local origin auth basic</w:t>
-      </w:r>
-    </w:p>
-    <w:p>
-      <w:pPr>
-        <w:shd w:fill="F0F0F0" w:val="clear"/>
-        <w:spacing w:after="60" w:before="60"/>
-        <w:ind w:left="360"/>
-      </w:pPr>
-      <w:r>
-        <w:rPr>
-          <w:rFonts w:ascii="Courier New" w:cs="Courier New" w:eastAsia="Courier New" w:hAnsi="Courier New"/>
-          <w:sz w:val="20"/>
-          <w:szCs w:val="20"/>
-        </w:rPr>
-        <w:t xml:space="preserve">dvc remote modify --local origin user TU_USUARIO</w:t>
-      </w:r>
-    </w:p>
-    <w:p>
-      <w:pPr>
-        <w:shd w:fill="F0F0F0" w:val="clear"/>
-        <w:spacing w:after="60" w:before="60"/>
-        <w:ind w:left="360"/>
-      </w:pPr>
-      <w:r>
-        <w:rPr>
-          <w:rFonts w:ascii="Courier New" w:cs="Courier New" w:eastAsia="Courier New" w:hAnsi="Courier New"/>
-          <w:sz w:val="20"/>
-          <w:szCs w:val="20"/>
-        </w:rPr>
-        <w:t xml:space="preserve">dvc remote modify --local origin password TU_TOKEN</w:t>
-      </w:r>
-    </w:p>
-    <w:p>
-      <w:pPr>
-        <w:spacing w:after="80" w:before="80"/>
-      </w:pPr>
-      <w:r>
-        <w:rPr>
-          <w:rFonts w:ascii="Arial" w:cs="Arial" w:eastAsia="Arial" w:hAnsi="Arial"/>
-          <w:sz w:val="22"/>
-          <w:szCs w:val="22"/>
-        </w:rPr>
-        <w:t xml:space="preserve">Esta decision reemplaza la configuracion inicial con Google Drive, que presentaba restricciones de verificacion OAuth que impedian el acceso desde nuevas maquinas sin intervencion manual.</w:t>
+        <w:t xml:space="preserve">Esta decision reemplaza la configuracion inicial con Google Drive, que presentaba restricciones OAuth que impedian el acceso desde nuevas maquinas sin intervencion manual.</w:t>
       </w:r>
     </w:p>
     <w:p>
@@ -967,7 +1013,20 @@
           <w:sz w:val="26"/>
           <w:szCs w:val="26"/>
         </w:rPr>
-        <w:t xml:space="preserve">4.1 Entrada - POST /predecir</w:t>
+        <w:t xml:space="preserve">4.1 Entrada — POST /predecir</w:t>
+      </w:r>
+    </w:p>
+    <w:p>
+      <w:pPr>
+        <w:spacing w:after="80" w:before="80"/>
+      </w:pPr>
+      <w:r>
+        <w:rPr>
+          <w:rFonts w:ascii="Arial" w:cs="Arial" w:eastAsia="Arial" w:hAnsi="Arial"/>
+          <w:sz w:val="22"/>
+          <w:szCs w:val="22"/>
+        </w:rPr>
+        <w:t xml:space="preserve">El modelo fue reentrenado en la version 1.1.0 para incluir las 10 variables. Las versiones anteriores solo usaban 7.</w:t>
       </w:r>
     </w:p>
     <w:p>
@@ -1168,7 +1227,7 @@
                 <w:sz w:val="20"/>
                 <w:szCs w:val="20"/>
               </w:rPr>
-              <w:t xml:space="preserve">&gt;= 0 - meses de antiguedad</w:t>
+              <w:t xml:space="preserve">&gt;= 0 — meses de antiguedad</w:t>
             </w:r>
           </w:p>
         </w:tc>
@@ -1254,7 +1313,7 @@
                 <w:sz w:val="20"/>
                 <w:szCs w:val="20"/>
               </w:rPr>
-              <w:t xml:space="preserve">&gt;= 0 - cargo mensual en USD</w:t>
+              <w:t xml:space="preserve">&gt;= 0 — cargo mensual en USD</w:t>
             </w:r>
           </w:p>
         </w:tc>
@@ -1340,7 +1399,7 @@
                 <w:sz w:val="20"/>
                 <w:szCs w:val="20"/>
               </w:rPr>
-              <w:t xml:space="preserve">&gt;= 0 - tickets de soporte</w:t>
+              <w:t xml:space="preserve">&gt;= 0 — tickets de soporte</w:t>
             </w:r>
           </w:p>
         </w:tc>
@@ -1426,7 +1485,7 @@
                 <w:sz w:val="20"/>
                 <w:szCs w:val="20"/>
               </w:rPr>
-              <w:t xml:space="preserve">&gt;= 0 - pagos tardios</w:t>
+              <w:t xml:space="preserve">&gt;= 0 — pagos tardios</w:t>
             </w:r>
           </w:p>
         </w:tc>
@@ -1512,7 +1571,7 @@
                 <w:sz w:val="20"/>
                 <w:szCs w:val="20"/>
               </w:rPr>
-              <w:t xml:space="preserve">&gt;= 0 - uso promedio en GB</w:t>
+              <w:t xml:space="preserve">&gt;= 0 — uso promedio en GB</w:t>
             </w:r>
           </w:p>
         </w:tc>
@@ -1598,7 +1657,7 @@
                 <w:sz w:val="20"/>
                 <w:szCs w:val="20"/>
               </w:rPr>
-              <w:t xml:space="preserve">&gt;= 18 - edad del cliente</w:t>
+              <w:t xml:space="preserve">&gt;= 18 — edad del cliente</w:t>
             </w:r>
           </w:p>
         </w:tc>
@@ -1987,14 +2046,14 @@
         </w:tblBorders>
       </w:tblPr>
       <w:tblGrid>
-        <w:gridCol w:w="2000"/>
-        <w:gridCol w:w="1800"/>
+        <w:gridCol w:w="2200"/>
+        <w:gridCol w:w="1600"/>
         <w:gridCol w:w="5560"/>
       </w:tblGrid>
       <w:tr>
         <w:tc>
           <w:tcPr>
-            <w:tcW w:type="dxa" w:w="2000"/>
+            <w:tcW w:type="dxa" w:w="2200"/>
             <w:tcBorders>
               <w:top w:val="single" w:color="CCCCCC" w:sz="1"/>
               <w:left w:val="single" w:color="CCCCCC" w:sz="1"/>
@@ -2025,7 +2084,7 @@
         </w:tc>
         <w:tc>
           <w:tcPr>
-            <w:tcW w:type="dxa" w:w="1800"/>
+            <w:tcW w:type="dxa" w:w="1600"/>
             <w:tcBorders>
               <w:top w:val="single" w:color="CCCCCC" w:sz="1"/>
               <w:left w:val="single" w:color="CCCCCC" w:sz="1"/>
@@ -2089,7 +2148,7 @@
       <w:tr>
         <w:tc>
           <w:tcPr>
-            <w:tcW w:type="dxa" w:w="2000"/>
+            <w:tcW w:type="dxa" w:w="2200"/>
             <w:tcBorders>
               <w:top w:val="single" w:color="CCCCCC" w:sz="1"/>
               <w:left w:val="single" w:color="CCCCCC" w:sz="1"/>
@@ -2117,7 +2176,7 @@
         </w:tc>
         <w:tc>
           <w:tcPr>
-            <w:tcW w:type="dxa" w:w="1800"/>
+            <w:tcW w:type="dxa" w:w="1600"/>
             <w:tcBorders>
               <w:top w:val="single" w:color="CCCCCC" w:sz="1"/>
               <w:left w:val="single" w:color="CCCCCC" w:sz="1"/>
@@ -2175,7 +2234,7 @@
       <w:tr>
         <w:tc>
           <w:tcPr>
-            <w:tcW w:type="dxa" w:w="2000"/>
+            <w:tcW w:type="dxa" w:w="2200"/>
             <w:tcBorders>
               <w:top w:val="single" w:color="CCCCCC" w:sz="1"/>
               <w:left w:val="single" w:color="CCCCCC" w:sz="1"/>
@@ -2203,7 +2262,7 @@
         </w:tc>
         <w:tc>
           <w:tcPr>
-            <w:tcW w:type="dxa" w:w="1800"/>
+            <w:tcW w:type="dxa" w:w="1600"/>
             <w:tcBorders>
               <w:top w:val="single" w:color="CCCCCC" w:sz="1"/>
               <w:left w:val="single" w:color="CCCCCC" w:sz="1"/>
@@ -2261,7 +2320,7 @@
       <w:tr>
         <w:tc>
           <w:tcPr>
-            <w:tcW w:type="dxa" w:w="2000"/>
+            <w:tcW w:type="dxa" w:w="2200"/>
             <w:tcBorders>
               <w:top w:val="single" w:color="CCCCCC" w:sz="1"/>
               <w:left w:val="single" w:color="CCCCCC" w:sz="1"/>
@@ -2289,7 +2348,7 @@
         </w:tc>
         <w:tc>
           <w:tcPr>
-            <w:tcW w:type="dxa" w:w="1800"/>
+            <w:tcW w:type="dxa" w:w="1600"/>
             <w:tcBorders>
               <w:top w:val="single" w:color="CCCCCC" w:sz="1"/>
               <w:left w:val="single" w:color="CCCCCC" w:sz="1"/>
@@ -2340,6 +2399,92 @@
                 <w:szCs w:val="20"/>
               </w:rPr>
               <w:t xml:space="preserve">Descripcion legible del resultado</w:t>
+            </w:r>
+          </w:p>
+        </w:tc>
+      </w:tr>
+      <w:tr>
+        <w:tc>
+          <w:tcPr>
+            <w:tcW w:type="dxa" w:w="2200"/>
+            <w:tcBorders>
+              <w:top w:val="single" w:color="CCCCCC" w:sz="1"/>
+              <w:left w:val="single" w:color="CCCCCC" w:sz="1"/>
+              <w:bottom w:val="single" w:color="CCCCCC" w:sz="1"/>
+              <w:right w:val="single" w:color="CCCCCC" w:sz="1"/>
+            </w:tcBorders>
+            <w:shd w:fill="EBF3FB" w:val="clear"/>
+            <w:tcMar>
+              <w:top w:type="dxa" w:w="80"/>
+              <w:left w:type="dxa" w:w="120"/>
+              <w:bottom w:type="dxa" w:w="80"/>
+              <w:right w:type="dxa" w:w="120"/>
+            </w:tcMar>
+          </w:tcPr>
+          <w:p>
+            <w:r>
+              <w:rPr>
+                <w:rFonts w:ascii="Arial" w:cs="Arial" w:eastAsia="Arial" w:hAnsi="Arial"/>
+                <w:sz w:val="20"/>
+                <w:szCs w:val="20"/>
+              </w:rPr>
+              <w:t xml:space="preserve">model_version</w:t>
+            </w:r>
+          </w:p>
+        </w:tc>
+        <w:tc>
+          <w:tcPr>
+            <w:tcW w:type="dxa" w:w="1600"/>
+            <w:tcBorders>
+              <w:top w:val="single" w:color="CCCCCC" w:sz="1"/>
+              <w:left w:val="single" w:color="CCCCCC" w:sz="1"/>
+              <w:bottom w:val="single" w:color="CCCCCC" w:sz="1"/>
+              <w:right w:val="single" w:color="CCCCCC" w:sz="1"/>
+            </w:tcBorders>
+            <w:shd w:fill="EBF3FB" w:val="clear"/>
+            <w:tcMar>
+              <w:top w:type="dxa" w:w="80"/>
+              <w:left w:type="dxa" w:w="120"/>
+              <w:bottom w:type="dxa" w:w="80"/>
+              <w:right w:type="dxa" w:w="120"/>
+            </w:tcMar>
+          </w:tcPr>
+          <w:p>
+            <w:r>
+              <w:rPr>
+                <w:rFonts w:ascii="Arial" w:cs="Arial" w:eastAsia="Arial" w:hAnsi="Arial"/>
+                <w:sz w:val="20"/>
+                <w:szCs w:val="20"/>
+              </w:rPr>
+              <w:t xml:space="preserve">string</w:t>
+            </w:r>
+          </w:p>
+        </w:tc>
+        <w:tc>
+          <w:tcPr>
+            <w:tcW w:type="dxa" w:w="5560"/>
+            <w:tcBorders>
+              <w:top w:val="single" w:color="CCCCCC" w:sz="1"/>
+              <w:left w:val="single" w:color="CCCCCC" w:sz="1"/>
+              <w:bottom w:val="single" w:color="CCCCCC" w:sz="1"/>
+              <w:right w:val="single" w:color="CCCCCC" w:sz="1"/>
+            </w:tcBorders>
+            <w:shd w:fill="EBF3FB" w:val="clear"/>
+            <w:tcMar>
+              <w:top w:type="dxa" w:w="80"/>
+              <w:left w:type="dxa" w:w="120"/>
+              <w:bottom w:type="dxa" w:w="80"/>
+              <w:right w:type="dxa" w:w="120"/>
+            </w:tcMar>
+          </w:tcPr>
+          <w:p>
+            <w:r>
+              <w:rPr>
+                <w:rFonts w:ascii="Arial" w:cs="Arial" w:eastAsia="Arial" w:hAnsi="Arial"/>
+                <w:sz w:val="20"/>
+                <w:szCs w:val="20"/>
+              </w:rPr>
+              <w:t xml:space="preserve">Version del modelo utilizado (ej: 1.1.0)</w:t>
             </w:r>
           </w:p>
         </w:tc>
@@ -2379,7 +2524,7 @@
           <w:sz w:val="22"/>
           <w:szCs w:val="22"/>
         </w:rPr>
-        <w:t xml:space="preserve">Se implementaron 6 pruebas con pytest en tests/test_api.py utilizando el TestClient de FastAPI:</w:t>
+        <w:t xml:space="preserve">Se implementaron 12 pruebas con pytest en tests/test_api.py utilizando TestClient de FastAPI. Se ampliaron los tests de la version anterior para cubrir el endpoint /health, la version del modelo y la validacion de las 3 variables nuevas.</w:t>
       </w:r>
     </w:p>
     <w:p>
@@ -2400,13 +2545,13 @@
         </w:tblBorders>
       </w:tblPr>
       <w:tblGrid>
-        <w:gridCol w:w="3200"/>
-        <w:gridCol w:w="6160"/>
+        <w:gridCol w:w="3600"/>
+        <w:gridCol w:w="5760"/>
       </w:tblGrid>
       <w:tr>
         <w:tc>
           <w:tcPr>
-            <w:tcW w:type="dxa" w:w="3200"/>
+            <w:tcW w:type="dxa" w:w="3600"/>
             <w:tcBorders>
               <w:top w:val="single" w:color="CCCCCC" w:sz="1"/>
               <w:left w:val="single" w:color="CCCCCC" w:sz="1"/>
@@ -2437,7 +2582,7 @@
         </w:tc>
         <w:tc>
           <w:tcPr>
-            <w:tcW w:type="dxa" w:w="6160"/>
+            <w:tcW w:type="dxa" w:w="5760"/>
             <w:tcBorders>
               <w:top w:val="single" w:color="CCCCCC" w:sz="1"/>
               <w:left w:val="single" w:color="CCCCCC" w:sz="1"/>
@@ -2470,7 +2615,7 @@
       <w:tr>
         <w:tc>
           <w:tcPr>
-            <w:tcW w:type="dxa" w:w="3200"/>
+            <w:tcW w:type="dxa" w:w="3600"/>
             <w:tcBorders>
               <w:top w:val="single" w:color="CCCCCC" w:sz="1"/>
               <w:left w:val="single" w:color="CCCCCC" w:sz="1"/>
@@ -2492,13 +2637,13 @@
                 <w:sz w:val="20"/>
                 <w:szCs w:val="20"/>
               </w:rPr>
-              <w:t xml:space="preserve">test_health_check</w:t>
-            </w:r>
-          </w:p>
-        </w:tc>
-        <w:tc>
-          <w:tcPr>
-            <w:tcW w:type="dxa" w:w="6160"/>
+              <w:t xml:space="preserve">test_root</w:t>
+            </w:r>
+          </w:p>
+        </w:tc>
+        <w:tc>
+          <w:tcPr>
+            <w:tcW w:type="dxa" w:w="5760"/>
             <w:tcBorders>
               <w:top w:val="single" w:color="CCCCCC" w:sz="1"/>
               <w:left w:val="single" w:color="CCCCCC" w:sz="1"/>
@@ -2528,7 +2673,7 @@
       <w:tr>
         <w:tc>
           <w:tcPr>
-            <w:tcW w:type="dxa" w:w="3200"/>
+            <w:tcW w:type="dxa" w:w="3600"/>
             <w:tcBorders>
               <w:top w:val="single" w:color="CCCCCC" w:sz="1"/>
               <w:left w:val="single" w:color="CCCCCC" w:sz="1"/>
@@ -2550,13 +2695,13 @@
                 <w:sz w:val="20"/>
                 <w:szCs w:val="20"/>
               </w:rPr>
-              <w:t xml:space="preserve">test_prediccion_valida</w:t>
-            </w:r>
-          </w:p>
-        </w:tc>
-        <w:tc>
-          <w:tcPr>
-            <w:tcW w:type="dxa" w:w="6160"/>
+              <w:t xml:space="preserve">test_health_artefactos_cargados</w:t>
+            </w:r>
+          </w:p>
+        </w:tc>
+        <w:tc>
+          <w:tcPr>
+            <w:tcW w:type="dxa" w:w="5760"/>
             <w:tcBorders>
               <w:top w:val="single" w:color="CCCCCC" w:sz="1"/>
               <w:left w:val="single" w:color="CCCCCC" w:sz="1"/>
@@ -2578,7 +2723,7 @@
                 <w:sz w:val="20"/>
                 <w:szCs w:val="20"/>
               </w:rPr>
-              <w:t xml:space="preserve">Flujo completo con datos correctos devuelve churn 0 o 1</w:t>
+              <w:t xml:space="preserve">/health confirma todos los artefactos en true</w:t>
             </w:r>
           </w:p>
         </w:tc>
@@ -2586,7 +2731,7 @@
       <w:tr>
         <w:tc>
           <w:tcPr>
-            <w:tcW w:type="dxa" w:w="3200"/>
+            <w:tcW w:type="dxa" w:w="3600"/>
             <w:tcBorders>
               <w:top w:val="single" w:color="CCCCCC" w:sz="1"/>
               <w:left w:val="single" w:color="CCCCCC" w:sz="1"/>
@@ -2608,13 +2753,13 @@
                 <w:sz w:val="20"/>
                 <w:szCs w:val="20"/>
               </w:rPr>
-              <w:t xml:space="preserve">test_prediccion_contrato_invalido</w:t>
-            </w:r>
-          </w:p>
-        </w:tc>
-        <w:tc>
-          <w:tcPr>
-            <w:tcW w:type="dxa" w:w="6160"/>
+              <w:t xml:space="preserve">test_health_version_modelo</w:t>
+            </w:r>
+          </w:p>
+        </w:tc>
+        <w:tc>
+          <w:tcPr>
+            <w:tcW w:type="dxa" w:w="5760"/>
             <w:tcBorders>
               <w:top w:val="single" w:color="CCCCCC" w:sz="1"/>
               <w:left w:val="single" w:color="CCCCCC" w:sz="1"/>
@@ -2636,7 +2781,7 @@
                 <w:sz w:val="20"/>
                 <w:szCs w:val="20"/>
               </w:rPr>
-              <w:t xml:space="preserve">Valor de contrato no permitido devuelve 422</w:t>
+              <w:t xml:space="preserve">/health incluye model_version</w:t>
             </w:r>
           </w:p>
         </w:tc>
@@ -2644,7 +2789,7 @@
       <w:tr>
         <w:tc>
           <w:tcPr>
-            <w:tcW w:type="dxa" w:w="3200"/>
+            <w:tcW w:type="dxa" w:w="3600"/>
             <w:tcBorders>
               <w:top w:val="single" w:color="CCCCCC" w:sz="1"/>
               <w:left w:val="single" w:color="CCCCCC" w:sz="1"/>
@@ -2666,13 +2811,13 @@
                 <w:sz w:val="20"/>
                 <w:szCs w:val="20"/>
               </w:rPr>
-              <w:t xml:space="preserve">test_prediccion_campo_faltante</w:t>
-            </w:r>
-          </w:p>
-        </w:tc>
-        <w:tc>
-          <w:tcPr>
-            <w:tcW w:type="dxa" w:w="6160"/>
+              <w:t xml:space="preserve">test_prediccion_valida</w:t>
+            </w:r>
+          </w:p>
+        </w:tc>
+        <w:tc>
+          <w:tcPr>
+            <w:tcW w:type="dxa" w:w="5760"/>
             <w:tcBorders>
               <w:top w:val="single" w:color="CCCCCC" w:sz="1"/>
               <w:left w:val="single" w:color="CCCCCC" w:sz="1"/>
@@ -2694,7 +2839,7 @@
                 <w:sz w:val="20"/>
                 <w:szCs w:val="20"/>
               </w:rPr>
-              <w:t xml:space="preserve">Request sin campo obligatorio devuelve 422</w:t>
+              <w:t xml:space="preserve">Flujo completo con las 10 variables</w:t>
             </w:r>
           </w:p>
         </w:tc>
@@ -2702,7 +2847,7 @@
       <w:tr>
         <w:tc>
           <w:tcPr>
-            <w:tcW w:type="dxa" w:w="3200"/>
+            <w:tcW w:type="dxa" w:w="3600"/>
             <w:tcBorders>
               <w:top w:val="single" w:color="CCCCCC" w:sz="1"/>
               <w:left w:val="single" w:color="CCCCCC" w:sz="1"/>
@@ -2724,13 +2869,13 @@
                 <w:sz w:val="20"/>
                 <w:szCs w:val="20"/>
               </w:rPr>
-              <w:t xml:space="preserve">test_prediccion_edad_invalida</w:t>
-            </w:r>
-          </w:p>
-        </w:tc>
-        <w:tc>
-          <w:tcPr>
-            <w:tcW w:type="dxa" w:w="6160"/>
+              <w:t xml:space="preserve">test_prediccion_incluye_version_modelo</w:t>
+            </w:r>
+          </w:p>
+        </w:tc>
+        <w:tc>
+          <w:tcPr>
+            <w:tcW w:type="dxa" w:w="5760"/>
             <w:tcBorders>
               <w:top w:val="single" w:color="CCCCCC" w:sz="1"/>
               <w:left w:val="single" w:color="CCCCCC" w:sz="1"/>
@@ -2752,7 +2897,7 @@
                 <w:sz w:val="20"/>
                 <w:szCs w:val="20"/>
               </w:rPr>
-              <w:t xml:space="preserve">Edad menor a 18 devuelve 422</w:t>
+              <w:t xml:space="preserve">Respuesta incluye model_version</w:t>
             </w:r>
           </w:p>
         </w:tc>
@@ -2760,7 +2905,7 @@
       <w:tr>
         <w:tc>
           <w:tcPr>
-            <w:tcW w:type="dxa" w:w="3200"/>
+            <w:tcW w:type="dxa" w:w="3600"/>
             <w:tcBorders>
               <w:top w:val="single" w:color="CCCCCC" w:sz="1"/>
               <w:left w:val="single" w:color="CCCCCC" w:sz="1"/>
@@ -2782,13 +2927,217 @@
                 <w:sz w:val="20"/>
                 <w:szCs w:val="20"/>
               </w:rPr>
+              <w:t xml:space="preserve">test_prediccion_contrato_invalido</w:t>
+            </w:r>
+          </w:p>
+        </w:tc>
+        <w:tc>
+          <w:tcPr>
+            <w:tcW w:type="dxa" w:w="5760"/>
+            <w:tcBorders>
+              <w:top w:val="single" w:color="CCCCCC" w:sz="1"/>
+              <w:left w:val="single" w:color="CCCCCC" w:sz="1"/>
+              <w:bottom w:val="single" w:color="CCCCCC" w:sz="1"/>
+              <w:right w:val="single" w:color="CCCCCC" w:sz="1"/>
+            </w:tcBorders>
+            <w:shd w:fill="EBF3FB" w:val="clear"/>
+            <w:tcMar>
+              <w:top w:type="dxa" w:w="80"/>
+              <w:left w:type="dxa" w:w="120"/>
+              <w:bottom w:type="dxa" w:w="80"/>
+              <w:right w:type="dxa" w:w="120"/>
+            </w:tcMar>
+          </w:tcPr>
+          <w:p>
+            <w:r>
+              <w:rPr>
+                <w:rFonts w:ascii="Arial" w:cs="Arial" w:eastAsia="Arial" w:hAnsi="Arial"/>
+                <w:sz w:val="20"/>
+                <w:szCs w:val="20"/>
+              </w:rPr>
+              <w:t xml:space="preserve">contract_type invalido devuelve 422</w:t>
+            </w:r>
+          </w:p>
+        </w:tc>
+      </w:tr>
+      <w:tr>
+        <w:tc>
+          <w:tcPr>
+            <w:tcW w:type="dxa" w:w="3600"/>
+            <w:tcBorders>
+              <w:top w:val="single" w:color="CCCCCC" w:sz="1"/>
+              <w:left w:val="single" w:color="CCCCCC" w:sz="1"/>
+              <w:bottom w:val="single" w:color="CCCCCC" w:sz="1"/>
+              <w:right w:val="single" w:color="CCCCCC" w:sz="1"/>
+            </w:tcBorders>
+            <w:shd w:fill="FFFFFF" w:val="clear"/>
+            <w:tcMar>
+              <w:top w:type="dxa" w:w="80"/>
+              <w:left w:type="dxa" w:w="120"/>
+              <w:bottom w:type="dxa" w:w="80"/>
+              <w:right w:type="dxa" w:w="120"/>
+            </w:tcMar>
+          </w:tcPr>
+          <w:p>
+            <w:r>
+              <w:rPr>
+                <w:rFonts w:ascii="Arial" w:cs="Arial" w:eastAsia="Arial" w:hAnsi="Arial"/>
+                <w:sz w:val="20"/>
+                <w:szCs w:val="20"/>
+              </w:rPr>
+              <w:t xml:space="preserve">test_prediccion_campo_faltante</w:t>
+            </w:r>
+          </w:p>
+        </w:tc>
+        <w:tc>
+          <w:tcPr>
+            <w:tcW w:type="dxa" w:w="5760"/>
+            <w:tcBorders>
+              <w:top w:val="single" w:color="CCCCCC" w:sz="1"/>
+              <w:left w:val="single" w:color="CCCCCC" w:sz="1"/>
+              <w:bottom w:val="single" w:color="CCCCCC" w:sz="1"/>
+              <w:right w:val="single" w:color="CCCCCC" w:sz="1"/>
+            </w:tcBorders>
+            <w:shd w:fill="FFFFFF" w:val="clear"/>
+            <w:tcMar>
+              <w:top w:type="dxa" w:w="80"/>
+              <w:left w:type="dxa" w:w="120"/>
+              <w:bottom w:type="dxa" w:w="80"/>
+              <w:right w:type="dxa" w:w="120"/>
+            </w:tcMar>
+          </w:tcPr>
+          <w:p>
+            <w:r>
+              <w:rPr>
+                <w:rFonts w:ascii="Arial" w:cs="Arial" w:eastAsia="Arial" w:hAnsi="Arial"/>
+                <w:sz w:val="20"/>
+                <w:szCs w:val="20"/>
+              </w:rPr>
+              <w:t xml:space="preserve">Campo faltante devuelve 422</w:t>
+            </w:r>
+          </w:p>
+        </w:tc>
+      </w:tr>
+      <w:tr>
+        <w:tc>
+          <w:tcPr>
+            <w:tcW w:type="dxa" w:w="3600"/>
+            <w:tcBorders>
+              <w:top w:val="single" w:color="CCCCCC" w:sz="1"/>
+              <w:left w:val="single" w:color="CCCCCC" w:sz="1"/>
+              <w:bottom w:val="single" w:color="CCCCCC" w:sz="1"/>
+              <w:right w:val="single" w:color="CCCCCC" w:sz="1"/>
+            </w:tcBorders>
+            <w:shd w:fill="EBF3FB" w:val="clear"/>
+            <w:tcMar>
+              <w:top w:type="dxa" w:w="80"/>
+              <w:left w:type="dxa" w:w="120"/>
+              <w:bottom w:type="dxa" w:w="80"/>
+              <w:right w:type="dxa" w:w="120"/>
+            </w:tcMar>
+          </w:tcPr>
+          <w:p>
+            <w:r>
+              <w:rPr>
+                <w:rFonts w:ascii="Arial" w:cs="Arial" w:eastAsia="Arial" w:hAnsi="Arial"/>
+                <w:sz w:val="20"/>
+                <w:szCs w:val="20"/>
+              </w:rPr>
+              <w:t xml:space="preserve">test_prediccion_edad_invalida</w:t>
+            </w:r>
+          </w:p>
+        </w:tc>
+        <w:tc>
+          <w:tcPr>
+            <w:tcW w:type="dxa" w:w="5760"/>
+            <w:tcBorders>
+              <w:top w:val="single" w:color="CCCCCC" w:sz="1"/>
+              <w:left w:val="single" w:color="CCCCCC" w:sz="1"/>
+              <w:bottom w:val="single" w:color="CCCCCC" w:sz="1"/>
+              <w:right w:val="single" w:color="CCCCCC" w:sz="1"/>
+            </w:tcBorders>
+            <w:shd w:fill="EBF3FB" w:val="clear"/>
+            <w:tcMar>
+              <w:top w:type="dxa" w:w="80"/>
+              <w:left w:type="dxa" w:w="120"/>
+              <w:bottom w:type="dxa" w:w="80"/>
+              <w:right w:type="dxa" w:w="120"/>
+            </w:tcMar>
+          </w:tcPr>
+          <w:p>
+            <w:r>
+              <w:rPr>
+                <w:rFonts w:ascii="Arial" w:cs="Arial" w:eastAsia="Arial" w:hAnsi="Arial"/>
+                <w:sz w:val="20"/>
+                <w:szCs w:val="20"/>
+              </w:rPr>
+              <w:t xml:space="preserve">Edad menor a 18 devuelve 422</w:t>
+            </w:r>
+          </w:p>
+        </w:tc>
+      </w:tr>
+      <w:tr>
+        <w:tc>
+          <w:tcPr>
+            <w:tcW w:type="dxa" w:w="3600"/>
+            <w:tcBorders>
+              <w:top w:val="single" w:color="CCCCCC" w:sz="1"/>
+              <w:left w:val="single" w:color="CCCCCC" w:sz="1"/>
+              <w:bottom w:val="single" w:color="CCCCCC" w:sz="1"/>
+              <w:right w:val="single" w:color="CCCCCC" w:sz="1"/>
+            </w:tcBorders>
+            <w:shd w:fill="FFFFFF" w:val="clear"/>
+            <w:tcMar>
+              <w:top w:type="dxa" w:w="80"/>
+              <w:left w:type="dxa" w:w="120"/>
+              <w:bottom w:type="dxa" w:w="80"/>
+              <w:right w:type="dxa" w:w="120"/>
+            </w:tcMar>
+          </w:tcPr>
+          <w:p>
+            <w:r>
+              <w:rPr>
+                <w:rFonts w:ascii="Arial" w:cs="Arial" w:eastAsia="Arial" w:hAnsi="Arial"/>
+                <w:sz w:val="20"/>
+                <w:szCs w:val="20"/>
+              </w:rPr>
               <w:t xml:space="preserve">test_prediccion_valores_negativos</w:t>
             </w:r>
           </w:p>
         </w:tc>
         <w:tc>
           <w:tcPr>
-            <w:tcW w:type="dxa" w:w="6160"/>
+            <w:tcW w:type="dxa" w:w="5760"/>
+            <w:tcBorders>
+              <w:top w:val="single" w:color="CCCCCC" w:sz="1"/>
+              <w:left w:val="single" w:color="CCCCCC" w:sz="1"/>
+              <w:bottom w:val="single" w:color="CCCCCC" w:sz="1"/>
+              <w:right w:val="single" w:color="CCCCCC" w:sz="1"/>
+            </w:tcBorders>
+            <w:shd w:fill="FFFFFF" w:val="clear"/>
+            <w:tcMar>
+              <w:top w:type="dxa" w:w="80"/>
+              <w:left w:type="dxa" w:w="120"/>
+              <w:bottom w:type="dxa" w:w="80"/>
+              <w:right w:type="dxa" w:w="120"/>
+            </w:tcMar>
+          </w:tcPr>
+          <w:p>
+            <w:r>
+              <w:rPr>
+                <w:rFonts w:ascii="Arial" w:cs="Arial" w:eastAsia="Arial" w:hAnsi="Arial"/>
+                <w:sz w:val="20"/>
+                <w:szCs w:val="20"/>
+              </w:rPr>
+              <w:t xml:space="preserve">monthly_charge negativo devuelve 422</w:t>
+            </w:r>
+          </w:p>
+        </w:tc>
+      </w:tr>
+      <w:tr>
+        <w:tc>
+          <w:tcPr>
+            <w:tcW w:type="dxa" w:w="3600"/>
             <w:tcBorders>
               <w:top w:val="single" w:color="CCCCCC" w:sz="1"/>
               <w:left w:val="single" w:color="CCCCCC" w:sz="1"/>
@@ -2810,7 +3159,151 @@
                 <w:sz w:val="20"/>
                 <w:szCs w:val="20"/>
               </w:rPr>
-              <w:t xml:space="preserve">monthly_charge negativo devuelve 422</w:t>
+              <w:t xml:space="preserve">test_prediccion_payment_method_invalido</w:t>
+            </w:r>
+          </w:p>
+        </w:tc>
+        <w:tc>
+          <w:tcPr>
+            <w:tcW w:type="dxa" w:w="5760"/>
+            <w:tcBorders>
+              <w:top w:val="single" w:color="CCCCCC" w:sz="1"/>
+              <w:left w:val="single" w:color="CCCCCC" w:sz="1"/>
+              <w:bottom w:val="single" w:color="CCCCCC" w:sz="1"/>
+              <w:right w:val="single" w:color="CCCCCC" w:sz="1"/>
+            </w:tcBorders>
+            <w:shd w:fill="EBF3FB" w:val="clear"/>
+            <w:tcMar>
+              <w:top w:type="dxa" w:w="80"/>
+              <w:left w:type="dxa" w:w="120"/>
+              <w:bottom w:type="dxa" w:w="80"/>
+              <w:right w:type="dxa" w:w="120"/>
+            </w:tcMar>
+          </w:tcPr>
+          <w:p>
+            <w:r>
+              <w:rPr>
+                <w:rFonts w:ascii="Arial" w:cs="Arial" w:eastAsia="Arial" w:hAnsi="Arial"/>
+                <w:sz w:val="20"/>
+                <w:szCs w:val="20"/>
+              </w:rPr>
+              <w:t xml:space="preserve">payment_method invalido devuelve 422</w:t>
+            </w:r>
+          </w:p>
+        </w:tc>
+      </w:tr>
+      <w:tr>
+        <w:tc>
+          <w:tcPr>
+            <w:tcW w:type="dxa" w:w="3600"/>
+            <w:tcBorders>
+              <w:top w:val="single" w:color="CCCCCC" w:sz="1"/>
+              <w:left w:val="single" w:color="CCCCCC" w:sz="1"/>
+              <w:bottom w:val="single" w:color="CCCCCC" w:sz="1"/>
+              <w:right w:val="single" w:color="CCCCCC" w:sz="1"/>
+            </w:tcBorders>
+            <w:shd w:fill="FFFFFF" w:val="clear"/>
+            <w:tcMar>
+              <w:top w:type="dxa" w:w="80"/>
+              <w:left w:type="dxa" w:w="120"/>
+              <w:bottom w:type="dxa" w:w="80"/>
+              <w:right w:type="dxa" w:w="120"/>
+            </w:tcMar>
+          </w:tcPr>
+          <w:p>
+            <w:r>
+              <w:rPr>
+                <w:rFonts w:ascii="Arial" w:cs="Arial" w:eastAsia="Arial" w:hAnsi="Arial"/>
+                <w:sz w:val="20"/>
+                <w:szCs w:val="20"/>
+              </w:rPr>
+              <w:t xml:space="preserve">test_prediccion_internet_service_invalido</w:t>
+            </w:r>
+          </w:p>
+        </w:tc>
+        <w:tc>
+          <w:tcPr>
+            <w:tcW w:type="dxa" w:w="5760"/>
+            <w:tcBorders>
+              <w:top w:val="single" w:color="CCCCCC" w:sz="1"/>
+              <w:left w:val="single" w:color="CCCCCC" w:sz="1"/>
+              <w:bottom w:val="single" w:color="CCCCCC" w:sz="1"/>
+              <w:right w:val="single" w:color="CCCCCC" w:sz="1"/>
+            </w:tcBorders>
+            <w:shd w:fill="FFFFFF" w:val="clear"/>
+            <w:tcMar>
+              <w:top w:type="dxa" w:w="80"/>
+              <w:left w:type="dxa" w:w="120"/>
+              <w:bottom w:type="dxa" w:w="80"/>
+              <w:right w:type="dxa" w:w="120"/>
+            </w:tcMar>
+          </w:tcPr>
+          <w:p>
+            <w:r>
+              <w:rPr>
+                <w:rFonts w:ascii="Arial" w:cs="Arial" w:eastAsia="Arial" w:hAnsi="Arial"/>
+                <w:sz w:val="20"/>
+                <w:szCs w:val="20"/>
+              </w:rPr>
+              <w:t xml:space="preserve">internet_service invalido devuelve 422</w:t>
+            </w:r>
+          </w:p>
+        </w:tc>
+      </w:tr>
+      <w:tr>
+        <w:tc>
+          <w:tcPr>
+            <w:tcW w:type="dxa" w:w="3600"/>
+            <w:tcBorders>
+              <w:top w:val="single" w:color="CCCCCC" w:sz="1"/>
+              <w:left w:val="single" w:color="CCCCCC" w:sz="1"/>
+              <w:bottom w:val="single" w:color="CCCCCC" w:sz="1"/>
+              <w:right w:val="single" w:color="CCCCCC" w:sz="1"/>
+            </w:tcBorders>
+            <w:shd w:fill="EBF3FB" w:val="clear"/>
+            <w:tcMar>
+              <w:top w:type="dxa" w:w="80"/>
+              <w:left w:type="dxa" w:w="120"/>
+              <w:bottom w:type="dxa" w:w="80"/>
+              <w:right w:type="dxa" w:w="120"/>
+            </w:tcMar>
+          </w:tcPr>
+          <w:p>
+            <w:r>
+              <w:rPr>
+                <w:rFonts w:ascii="Arial" w:cs="Arial" w:eastAsia="Arial" w:hAnsi="Arial"/>
+                <w:sz w:val="20"/>
+                <w:szCs w:val="20"/>
+              </w:rPr>
+              <w:t xml:space="preserve">test_prediccion_region_invalida</w:t>
+            </w:r>
+          </w:p>
+        </w:tc>
+        <w:tc>
+          <w:tcPr>
+            <w:tcW w:type="dxa" w:w="5760"/>
+            <w:tcBorders>
+              <w:top w:val="single" w:color="CCCCCC" w:sz="1"/>
+              <w:left w:val="single" w:color="CCCCCC" w:sz="1"/>
+              <w:bottom w:val="single" w:color="CCCCCC" w:sz="1"/>
+              <w:right w:val="single" w:color="CCCCCC" w:sz="1"/>
+            </w:tcBorders>
+            <w:shd w:fill="EBF3FB" w:val="clear"/>
+            <w:tcMar>
+              <w:top w:type="dxa" w:w="80"/>
+              <w:left w:type="dxa" w:w="120"/>
+              <w:bottom w:type="dxa" w:w="80"/>
+              <w:right w:type="dxa" w:w="120"/>
+            </w:tcMar>
+          </w:tcPr>
+          <w:p>
+            <w:r>
+              <w:rPr>
+                <w:rFonts w:ascii="Arial" w:cs="Arial" w:eastAsia="Arial" w:hAnsi="Arial"/>
+                <w:sz w:val="20"/>
+                <w:szCs w:val="20"/>
+              </w:rPr>
+              <w:t xml:space="preserve">region invalida devuelve 422</w:t>
             </w:r>
           </w:p>
         </w:tc>
@@ -2831,7 +3324,7 @@
           <w:sz w:val="22"/>
           <w:szCs w:val="22"/>
         </w:rPr>
-        <w:t xml:space="preserve">Resultado obtenido: 6 passed, 0 failed.</w:t>
+        <w:t xml:space="preserve">Resultado obtenido: 12 passed, 0 failed.</w:t>
       </w:r>
     </w:p>
     <w:p>
@@ -2958,7 +3451,7 @@
           <w:sz w:val="22"/>
           <w:szCs w:val="22"/>
         </w:rPr>
-        <w:t xml:space="preserve">Cuenta gratuita en DagsHub (dagshub.com) con token generado</w:t>
+        <w:t xml:space="preserve">Cuenta gratuita en DagsHub con token generado en dagshub.com/user/settings/tokens</w:t>
       </w:r>
     </w:p>
     <w:p>
@@ -2979,7 +3472,7 @@
           <w:sz w:val="26"/>
           <w:szCs w:val="26"/>
         </w:rPr>
-        <w:t xml:space="preserve">Opcion A - Docker (recomendado)</w:t>
+        <w:t xml:space="preserve">Opcion A — Docker (recomendado)</w:t>
       </w:r>
     </w:p>
     <w:p>
@@ -2997,7 +3490,7 @@
           <w:sz w:val="22"/>
           <w:szCs w:val="22"/>
         </w:rPr>
-        <w:t xml:space="preserve">Clonar el repositorio: git clone https://github.com/Nicosala96/Proyecto-Lab.-Mineria-de-datos</w:t>
+        <w:t xml:space="preserve">Clonar: git clone https://github.com/Nicosala96/Proyecto-Lab.-Mineria-de-datos</w:t>
       </w:r>
     </w:p>
     <w:p>
@@ -3033,7 +3526,7 @@
           <w:sz w:val="22"/>
           <w:szCs w:val="22"/>
         </w:rPr>
-        <w:t xml:space="preserve">Instalar dependencias: pip install -r requirements.txt &amp;&amp; pip install "dvc[http]" mlflow jupyter jupyterlab</w:t>
+        <w:t xml:space="preserve">Instalar: pip install -r requirements.txt &amp;&amp; pip install "dvc[http]" mlflow jupyter jupyterlab</w:t>
       </w:r>
     </w:p>
     <w:p>
@@ -3051,7 +3544,7 @@
           <w:sz w:val="22"/>
           <w:szCs w:val="22"/>
         </w:rPr>
-        <w:t xml:space="preserve">Configurar DVC con token de DagsHub (ver seccion 3.4)</w:t>
+        <w:t xml:space="preserve">Configurar DVC con token de DagsHub (dvc remote modify --local origin ...)</w:t>
       </w:r>
     </w:p>
     <w:p>
@@ -3069,7 +3562,7 @@
           <w:sz w:val="22"/>
           <w:szCs w:val="22"/>
         </w:rPr>
-        <w:t xml:space="preserve">Descargar modelos y datos: dvc pull</w:t>
+        <w:t xml:space="preserve">OBLIGATORIO antes del build: dvc pull</w:t>
       </w:r>
     </w:p>
     <w:p>
@@ -3087,7 +3580,7 @@
           <w:sz w:val="22"/>
           <w:szCs w:val="22"/>
         </w:rPr>
-        <w:t xml:space="preserve">Levantar servicios: docker-compose up --build</w:t>
+        <w:t xml:space="preserve">Levantar: docker-compose up --build</w:t>
       </w:r>
     </w:p>
     <w:p>
@@ -3105,7 +3598,7 @@
           <w:sz w:val="22"/>
           <w:szCs w:val="22"/>
         </w:rPr>
-        <w:t xml:space="preserve">Acceder a GUI en http://localhost:8501 y API en http://localhost:8000/docs</w:t>
+        <w:t xml:space="preserve">GUI en http://localhost:8501  |  API en http://localhost:8000/docs  |  Health en http://localhost:8000/health</w:t>
       </w:r>
     </w:p>
     <w:p>
@@ -3123,7 +3616,7 @@
           <w:sz w:val="22"/>
           <w:szCs w:val="22"/>
         </w:rPr>
-        <w:t xml:space="preserve">Para detener: docker-compose down</w:t>
+        <w:t xml:space="preserve">Detener: docker-compose down</w:t>
       </w:r>
     </w:p>
     <w:p>
@@ -3144,7 +3637,7 @@
           <w:sz w:val="26"/>
           <w:szCs w:val="26"/>
         </w:rPr>
-        <w:t xml:space="preserve">Opcion B - Local con conda</w:t>
+        <w:t xml:space="preserve">Opcion B — Local con conda</w:t>
       </w:r>
     </w:p>
     <w:p>
@@ -3180,7 +3673,7 @@
           <w:sz w:val="22"/>
           <w:szCs w:val="22"/>
         </w:rPr>
-        <w:t xml:space="preserve">Terminal 1 - API: cd src &amp;&amp; uvicorn api:app --reload</w:t>
+        <w:t xml:space="preserve">Terminal 1 — API: cd src &amp;&amp; uvicorn api:app --reload</w:t>
       </w:r>
     </w:p>
     <w:p>
@@ -3198,7 +3691,31 @@
           <w:sz w:val="22"/>
           <w:szCs w:val="22"/>
         </w:rPr>
-        <w:t xml:space="preserve">Terminal 2 - GUI: cd src &amp;&amp; streamlit run app.py</w:t>
+        <w:t xml:space="preserve">Terminal 2 — GUI: cd src &amp;&amp; streamlit run app.py</w:t>
+      </w:r>
+    </w:p>
+    <w:p>
+      <w:pPr>
+        <w:pBdr>
+          <w:bottom w:val="single" w:color="2E75B6" w:sz="4" w:space="1"/>
+        </w:pBdr>
+        <w:spacing w:after="160" w:before="160"/>
+      </w:pPr>
+    </w:p>
+    <w:p>
+      <w:pPr>
+        <w:pStyle w:val="Heading1"/>
+        <w:spacing w:after="200" w:before="300"/>
+      </w:pPr>
+      <w:r>
+        <w:rPr>
+          <w:rFonts w:ascii="Arial" w:cs="Arial" w:eastAsia="Arial" w:hAnsi="Arial"/>
+          <w:b/>
+          <w:bCs/>
+          <w:sz w:val="32"/>
+          <w:szCs w:val="32"/>
+        </w:rPr>
+        <w:t xml:space="preserve">7. Decisiones Tecnicas</w:t>
       </w:r>
     </w:p>
     <w:p>
@@ -3216,31 +3733,7 @@
           <w:sz w:val="22"/>
           <w:szCs w:val="22"/>
         </w:rPr>
-        <w:t xml:space="preserve">Acceder a http://localhost:8501</w:t>
-      </w:r>
-    </w:p>
-    <w:p>
-      <w:pPr>
-        <w:pBdr>
-          <w:bottom w:val="single" w:color="2E75B6" w:sz="4" w:space="1"/>
-        </w:pBdr>
-        <w:spacing w:after="160" w:before="160"/>
-      </w:pPr>
-    </w:p>
-    <w:p>
-      <w:pPr>
-        <w:pStyle w:val="Heading1"/>
-        <w:spacing w:after="200" w:before="300"/>
-      </w:pPr>
-      <w:r>
-        <w:rPr>
-          <w:rFonts w:ascii="Arial" w:cs="Arial" w:eastAsia="Arial" w:hAnsi="Arial"/>
-          <w:b/>
-          <w:bCs/>
-          <w:sz w:val="32"/>
-          <w:szCs w:val="32"/>
-        </w:rPr>
-        <w:t xml:space="preserve">7. Decisiones Tecnicas</w:t>
+        <w:t xml:space="preserve">Reentrenamiento del modelo v1.1.0: se incorporaron payment_method, internet_service y region al DataFrame de entrenamiento para corregir la inconsistencia entre el contrato de la API y las variables realmente usadas por el modelo.</w:t>
       </w:r>
     </w:p>
     <w:p>
@@ -3258,7 +3751,7 @@
           <w:sz w:val="22"/>
           <w:szCs w:val="22"/>
         </w:rPr>
-        <w:t xml:space="preserve">FastAPI sobre Flask: validacion automatica con Pydantic, documentacion interactiva en /docs y mejor performance asincrona.</w:t>
+        <w:t xml:space="preserve">Endpoint /health especifico: valida que cada artefacto esta cargado en memoria e informa su estado individualmente. El healthcheck de Docker Compose apunta a este endpoint en lugar de /.</w:t>
       </w:r>
     </w:p>
     <w:p>
@@ -3276,7 +3769,7 @@
           <w:sz w:val="22"/>
           <w:szCs w:val="22"/>
         </w:rPr>
-        <w:t xml:space="preserve">Streamlit: permite construir una GUI funcional con pocas lineas de codigo, orientada a prototipado rapido de aplicaciones de datos.</w:t>
+        <w:t xml:space="preserve">Logging operativo: se registra cada request recibido, cada prediccion generada y cada error con timestamp, lo que permite observabilidad basica sin herramientas adicionales.</w:t>
       </w:r>
     </w:p>
     <w:p>
@@ -3294,7 +3787,7 @@
           <w:sz w:val="22"/>
           <w:szCs w:val="22"/>
         </w:rPr>
-        <w:t xml:space="preserve">Dos Dockerfiles separados: permite escalar o reemplazar cada servicio de forma independiente.</w:t>
+        <w:t xml:space="preserve">Version del modelo en la respuesta: permite rastrear con que version se genero cada prediccion, util para auditoria y debugging.</w:t>
       </w:r>
     </w:p>
     <w:p>
@@ -3312,7 +3805,7 @@
           <w:sz w:val="22"/>
           <w:szCs w:val="22"/>
         </w:rPr>
-        <w:t xml:space="preserve">Variable de entorno MODELS_DIR: desacopla la API de la ubicacion fisica de los modelos, funcionando tanto en local como en Docker.</w:t>
+        <w:t xml:space="preserve">FastAPI sobre Flask: validacion automatica con Pydantic, documentacion interactiva en /docs y mejor performance asincrona.</w:t>
       </w:r>
     </w:p>
     <w:p>
@@ -3330,7 +3823,7 @@
           <w:sz w:val="22"/>
           <w:szCs w:val="22"/>
         </w:rPr>
-        <w:t xml:space="preserve">Variable de entorno API_URL: desacopla la GUI de la ubicacion de la API, funcionando en ambos entornos sin cambios de codigo.</w:t>
+        <w:t xml:space="preserve">DagsHub como remote de DVC: reemplaza Google Drive por una plataforma disenada para ML que permite autenticacion por token sin restricciones OAuth.</w:t>
       </w:r>
     </w:p>
     <w:p>
@@ -3348,7 +3841,31 @@
           <w:sz w:val="22"/>
           <w:szCs w:val="22"/>
         </w:rPr>
-        <w:t xml:space="preserve">Healthcheck en Docker Compose: garantiza que la GUI no intente conectarse a la API antes de que este lista.</w:t>
+        <w:t xml:space="preserve">Dos Dockerfiles separados: permite escalar o reemplazar cada servicio de forma independiente.</w:t>
+      </w:r>
+    </w:p>
+    <w:p>
+      <w:pPr>
+        <w:pBdr>
+          <w:bottom w:val="single" w:color="2E75B6" w:sz="4" w:space="1"/>
+        </w:pBdr>
+        <w:spacing w:after="160" w:before="160"/>
+      </w:pPr>
+    </w:p>
+    <w:p>
+      <w:pPr>
+        <w:pStyle w:val="Heading1"/>
+        <w:spacing w:after="200" w:before="300"/>
+      </w:pPr>
+      <w:r>
+        <w:rPr>
+          <w:rFonts w:ascii="Arial" w:cs="Arial" w:eastAsia="Arial" w:hAnsi="Arial"/>
+          <w:b/>
+          <w:bCs/>
+          <w:sz w:val="32"/>
+          <w:szCs w:val="32"/>
+        </w:rPr>
+        <w:t xml:space="preserve">8. Limitaciones Conocidas</w:t>
       </w:r>
     </w:p>
     <w:p>
@@ -3366,7 +3883,7 @@
           <w:sz w:val="22"/>
           <w:szCs w:val="22"/>
         </w:rPr>
-        <w:t xml:space="preserve">DagsHub como remote de DVC: reemplaza Google Drive por una plataforma disenada para ML que permite autenticacion por token sin restricciones OAuth.</w:t>
+        <w:t xml:space="preserve">El dvc pull requiere que cada colaborador configure su propio token de DagsHub localmente. Es un paso manual pero simple y gratuito.</w:t>
       </w:r>
     </w:p>
     <w:p>
@@ -3384,7 +3901,7 @@
           <w:sz w:val="22"/>
           <w:szCs w:val="22"/>
         </w:rPr>
-        <w:t xml:space="preserve">Encoders individuales por columna: corrige el problema de la primera entrega donde todos los encoders sobreescribian la misma variable.</w:t>
+        <w:t xml:space="preserve">El build de Docker falla si no se ejecuta dvc pull previamente. No hay fallback automatico si los modelos no estan disponibles.</w:t>
       </w:r>
     </w:p>
     <w:p>
@@ -3402,31 +3919,7 @@
           <w:sz w:val="22"/>
           <w:szCs w:val="22"/>
         </w:rPr>
-        <w:t xml:space="preserve">Copias explicitas de modelos en Dockerfile.api: evita que Docker copie solo los archivos .dvc en lugar de los .joblib reales.</w:t>
-      </w:r>
-    </w:p>
-    <w:p>
-      <w:pPr>
-        <w:pBdr>
-          <w:bottom w:val="single" w:color="2E75B6" w:sz="4" w:space="1"/>
-        </w:pBdr>
-        <w:spacing w:after="160" w:before="160"/>
-      </w:pPr>
-    </w:p>
-    <w:p>
-      <w:pPr>
-        <w:pStyle w:val="Heading1"/>
-        <w:spacing w:after="200" w:before="300"/>
-      </w:pPr>
-      <w:r>
-        <w:rPr>
-          <w:rFonts w:ascii="Arial" w:cs="Arial" w:eastAsia="Arial" w:hAnsi="Arial"/>
-          <w:b/>
-          <w:bCs/>
-          <w:sz w:val="32"/>
-          <w:szCs w:val="32"/>
-        </w:rPr>
-        <w:t xml:space="preserve">8. Limitaciones Conocidas</w:t>
+        <w:t xml:space="preserve">No se implemento autenticacion en la API. Para un entorno productivo real seria necesario agregar al menos una API key.</w:t>
       </w:r>
     </w:p>
     <w:p>
@@ -3444,7 +3937,7 @@
           <w:sz w:val="22"/>
           <w:szCs w:val="22"/>
         </w:rPr>
-        <w:t xml:space="preserve">El dvc pull requiere que cada colaborador configure su propio token de DagsHub localmente. No es un paso completamente automatico pero es simple y gratuito.</w:t>
+        <w:t xml:space="preserve">No hay prueba de integracion GUI + API ni prueba de Docker Compose completo. Estas quedaran para el examen final junto con el monitoreo.</w:t>
       </w:r>
     </w:p>
     <w:p>
@@ -3462,43 +3955,7 @@
           <w:sz w:val="22"/>
           <w:szCs w:val="22"/>
         </w:rPr>
-        <w:t xml:space="preserve">La GUI dentro de Docker no puede conectarse directamente al localhost del host. Se recomienda correr la GUI localmente mientras Docker sirve la API, o usar docker-compose up --build con ambos servicios.</w:t>
-      </w:r>
-    </w:p>
-    <w:p>
-      <w:pPr>
-        <w:pStyle w:val="ListParagraph"/>
-        <w:numPr>
-          <w:ilvl w:val="0"/>
-          <w:numId w:val="2"/>
-        </w:numPr>
-        <w:spacing w:after="60" w:before="60"/>
-      </w:pPr>
-      <w:r>
-        <w:rPr>
-          <w:rFonts w:ascii="Arial" w:cs="Arial" w:eastAsia="Arial" w:hAnsi="Arial"/>
-          <w:sz w:val="22"/>
-          <w:szCs w:val="22"/>
-        </w:rPr>
-        <w:t xml:space="preserve">Los modelos se serializaron con scikit-learn 1.7.1. Si se usan con versiones posteriores pueden aparecer InconsistentVersionWarnings, aunque sin impacto funcional en esta version.</w:t>
-      </w:r>
-    </w:p>
-    <w:p>
-      <w:pPr>
-        <w:pStyle w:val="ListParagraph"/>
-        <w:numPr>
-          <w:ilvl w:val="0"/>
-          <w:numId w:val="2"/>
-        </w:numPr>
-        <w:spacing w:after="60" w:before="60"/>
-      </w:pPr>
-      <w:r>
-        <w:rPr>
-          <w:rFonts w:ascii="Arial" w:cs="Arial" w:eastAsia="Arial" w:hAnsi="Arial"/>
-          <w:sz w:val="22"/>
-          <w:szCs w:val="22"/>
-        </w:rPr>
-        <w:t xml:space="preserve">No se implemento autenticacion en la API. Para un entorno productivo real seria necesario agregar al menos una API key.</w:t>
+        <w:t xml:space="preserve">Los modelos se entrenaron con scikit-learn 1.7.1. En entornos con versiones superiores pueden aparecer InconsistentVersionWarnings sin impacto funcional.</w:t>
       </w:r>
     </w:p>
     <w:sectPr>
@@ -3563,7 +4020,7 @@
         <w:sz w:val="18"/>
         <w:szCs w:val="18"/>
       </w:rPr>
-      <w:t xml:space="preserve">AndesLink – Documento Tecnico de Despliegue</w:t>
+      <w:t xml:space="preserve">AndesLink - Documento Tecnico de Despliegue  v1.1.0</w:t>
     </w:r>
   </w:p>
 </w:ftr>

</xml_diff>

<commit_message>
docs: documento tecnico final v1.2.0 con monitoreo completo
</commit_message>
<xml_diff>
--- a/documento_tecnico_despliegue.docx
+++ b/documento_tecnico_despliegue.docx
@@ -31,7 +31,7 @@
           <w:sz w:val="28"/>
           <w:szCs w:val="28"/>
         </w:rPr>
-        <w:t xml:space="preserve">Documento Tecnico de Despliegue</w:t>
+        <w:t xml:space="preserve">Documento Tecnico Final</w:t>
       </w:r>
     </w:p>
     <w:p>
@@ -46,7 +46,7 @@
           <w:sz w:val="22"/>
           <w:szCs w:val="22"/>
         </w:rPr>
-        <w:t xml:space="preserve">Segunda Entrega - MLOps Local  |  Version 1.1.0</w:t>
+        <w:t xml:space="preserve">Examen Final — MLOps Local con Monitoreo  |  Version 1.2.0</w:t>
       </w:r>
     </w:p>
     <w:p>
@@ -113,7 +113,7 @@
           <w:sz w:val="22"/>
           <w:szCs w:val="22"/>
         </w:rPr>
-        <w:t xml:space="preserve">Este documento describe la arquitectura, los componentes y las decisiones de implementacion correspondientes a la segunda entrega del proyecto MLOps para AndesLink Servicios Digitales S.A.</w:t>
+        <w:t xml:space="preserve">Este documento describe la arquitectura completa, los componentes y las decisiones de implementacion del proyecto MLOps para AndesLink Servicios Digitales S.A., cubriendo las tres entregas: entrenamiento, despliegue y monitoreo.</w:t>
       </w:r>
     </w:p>
     <w:p>
@@ -126,7 +126,7 @@
           <w:sz w:val="22"/>
           <w:szCs w:val="22"/>
         </w:rPr>
-        <w:t xml:space="preserve">En esta etapa se convirtio el modelo de prediccion de churn en un servicio productivo local compuesto por una API de inferencia (FastAPI), una interfaz grafica (Streamlit) y un entorno de despliegue contenerizado y reproducible (Docker). Ademas se incorporo logging operativo, endpoint de health check con validacion de artefactos e informacion de version del modelo.</w:t>
+        <w:t xml:space="preserve">La solucion implementa un ciclo completo de MLOps local: desde el analisis exploratorio y entrenamiento del modelo, pasando por la exposicion como API y GUI, hasta la observabilidad tecnica con Prometheus y Grafana y el monitoreo de datos con Evidently.</w:t>
       </w:r>
     </w:p>
     <w:p>
@@ -150,7 +150,7 @@
           <w:sz w:val="32"/>
           <w:szCs w:val="32"/>
         </w:rPr>
-        <w:t xml:space="preserve">2. Arquitectura Local</w:t>
+        <w:t xml:space="preserve">2. Arquitectura Completa</w:t>
       </w:r>
     </w:p>
     <w:p>
@@ -163,7 +163,7 @@
           <w:sz w:val="22"/>
           <w:szCs w:val="22"/>
         </w:rPr>
-        <w:t xml:space="preserve">La solucion se organiza en tres capas que se comunican entre si:</w:t>
+        <w:t xml:space="preserve">La solucion se organiza en cuatro capas:</w:t>
       </w:r>
     </w:p>
     <w:tbl>
@@ -226,7 +226,7 @@
                 <w:sz w:val="18"/>
                 <w:szCs w:val="18"/>
               </w:rPr>
-              <w:t xml:space="preserve">GUI - Streamlit  (puerto 8501)  [andeslink-gui / Docker]</w:t>
+              <w:t xml:space="preserve">GUI Streamlit (8501) [andeslink-gui]</w:t>
             </w:r>
           </w:p>
           <w:p>
@@ -246,7 +246,7 @@
                 <w:sz w:val="18"/>
                 <w:szCs w:val="18"/>
               </w:rPr>
-              <w:t xml:space="preserve">API - FastAPI    (puerto 8000)  [andeslink-api / Docker]</w:t>
+              <w:t xml:space="preserve">API FastAPI  (8000) [andeslink-api]  --&gt;  /metrics</w:t>
             </w:r>
           </w:p>
           <w:p>
@@ -256,7 +256,7 @@
                 <w:sz w:val="18"/>
                 <w:szCs w:val="18"/>
               </w:rPr>
-              <w:t xml:space="preserve">         |  joblib.load() via MODELS_DIR</w:t>
+              <w:t xml:space="preserve">         |  joblib.load()          |  scrape :15s</w:t>
             </w:r>
           </w:p>
           <w:p>
@@ -266,7 +266,47 @@
                 <w:sz w:val="18"/>
                 <w:szCs w:val="18"/>
               </w:rPr>
-              <w:t xml:space="preserve">MODELOS SERIALIZADOS  (models/)  [DVC -&gt; DagsHub]</w:t>
+              <w:t xml:space="preserve">MODELOS (models/) [DVC-&gt;DagsHub]   Prometheus (9090)</w:t>
+            </w:r>
+          </w:p>
+          <w:p>
+            <w:r>
+              <w:rPr>
+                <w:rFonts w:ascii="Courier New" w:cs="Courier New" w:eastAsia="Courier New" w:hAnsi="Courier New"/>
+                <w:sz w:val="18"/>
+                <w:szCs w:val="18"/>
+              </w:rPr>
+              <w:t xml:space="preserve">                                           |</w:t>
+            </w:r>
+          </w:p>
+          <w:p>
+            <w:r>
+              <w:rPr>
+                <w:rFonts w:ascii="Courier New" w:cs="Courier New" w:eastAsia="Courier New" w:hAnsi="Courier New"/>
+                <w:sz w:val="18"/>
+                <w:szCs w:val="18"/>
+              </w:rPr>
+              <w:t xml:space="preserve">                                   Grafana   (3000)</w:t>
+            </w:r>
+          </w:p>
+          <w:p>
+            <w:r>
+              <w:rPr>
+                <w:rFonts w:ascii="Courier New" w:cs="Courier New" w:eastAsia="Courier New" w:hAnsi="Courier New"/>
+                <w:sz w:val="18"/>
+                <w:szCs w:val="18"/>
+              </w:rPr>
+              <w:t xml:space="preserve"/>
+            </w:r>
+          </w:p>
+          <w:p>
+            <w:r>
+              <w:rPr>
+                <w:rFonts w:ascii="Courier New" w:cs="Courier New" w:eastAsia="Courier New" w:hAnsi="Courier New"/>
+                <w:sz w:val="18"/>
+                <w:szCs w:val="18"/>
+              </w:rPr>
+              <w:t xml:space="preserve">MONITOREO OFFLINE: Evidently -&gt; reports/*.html</w:t>
             </w:r>
           </w:p>
         </w:tc>
@@ -314,7 +354,7 @@
           <w:sz w:val="26"/>
           <w:szCs w:val="26"/>
         </w:rPr>
-        <w:t xml:space="preserve">3.1 API de Inferencia (FastAPI) — v1.1.0</w:t>
+        <w:t xml:space="preserve">3.1 Entrenamiento y Serializacion (Primera Entrega)</w:t>
       </w:r>
     </w:p>
     <w:p>
@@ -327,7 +367,7 @@
           <w:sz w:val="22"/>
           <w:szCs w:val="22"/>
         </w:rPr>
-        <w:t xml:space="preserve">Archivo: src/api.py</w:t>
+        <w:t xml:space="preserve">Dataset sintetico de 5.000 clientes con 10 variables (6 numericas y 4 categoricas). El modelo de Regresion Logistica fue entrenado con separacion correcta de train/test para evitar data leakage: el scaler se ajusta solo con datos de entrenamiento y se aplica a test con transform.</w:t>
       </w:r>
     </w:p>
     <w:p>
@@ -340,7 +380,41 @@
           <w:sz w:val="22"/>
           <w:szCs w:val="22"/>
         </w:rPr>
-        <w:t xml:space="preserve">La API expone tres endpoints:</w:t>
+        <w:t xml:space="preserve">Artefactos serializados: logistic_regression.joblib, decision_tree.joblib, scaler.joblib y 4 encoders individuales por variable categorica.</w:t>
+      </w:r>
+    </w:p>
+    <w:p>
+      <w:pPr>
+        <w:spacing w:after="0" w:before="160"/>
+      </w:pPr>
+    </w:p>
+    <w:p>
+      <w:pPr>
+        <w:pStyle w:val="Heading2"/>
+        <w:spacing w:after="120" w:before="240"/>
+      </w:pPr>
+      <w:r>
+        <w:rPr>
+          <w:rFonts w:ascii="Arial" w:cs="Arial" w:eastAsia="Arial" w:hAnsi="Arial"/>
+          <w:b/>
+          <w:bCs/>
+          <w:sz w:val="26"/>
+          <w:szCs w:val="26"/>
+        </w:rPr>
+        <w:t xml:space="preserve">3.2 API de Inferencia — FastAPI v1.1.0</w:t>
+      </w:r>
+    </w:p>
+    <w:p>
+      <w:pPr>
+        <w:spacing w:after="80" w:before="80"/>
+      </w:pPr>
+      <w:r>
+        <w:rPr>
+          <w:rFonts w:ascii="Arial" w:cs="Arial" w:eastAsia="Arial" w:hAnsi="Arial"/>
+          <w:sz w:val="22"/>
+          <w:szCs w:val="22"/>
+        </w:rPr>
+        <w:t xml:space="preserve">Tres endpoints:</w:t>
       </w:r>
     </w:p>
     <w:p>
@@ -358,7 +432,7 @@
           <w:sz w:val="22"/>
           <w:szCs w:val="22"/>
         </w:rPr>
-        <w:t xml:space="preserve">GET /  -&gt;  respuesta basica de estado y version del modelo</w:t>
+        <w:t xml:space="preserve">GET /  -&gt;  estado y version del modelo</w:t>
       </w:r>
     </w:p>
     <w:p>
@@ -376,7 +450,7 @@
           <w:sz w:val="22"/>
           <w:szCs w:val="22"/>
         </w:rPr>
-        <w:t xml:space="preserve">GET /health  -&gt;  valida que cada artefacto esta cargado en memoria e informa su estado individualmente</w:t>
+        <w:t xml:space="preserve">GET /health  -&gt;  valida que cada artefacto esta cargado en memoria</w:t>
       </w:r>
     </w:p>
     <w:p>
@@ -394,7 +468,7 @@
           <w:sz w:val="22"/>
           <w:szCs w:val="22"/>
         </w:rPr>
-        <w:t xml:space="preserve">POST /predecir  -&gt;  recibe las 10 variables del cliente, aplica encoders y scaler, y devuelve la prediccion</w:t>
+        <w:t xml:space="preserve">POST /predecir  -&gt;  prediccion con las 10 variables, devuelve churn, probabilidad, etiqueta y model_version</w:t>
       </w:r>
     </w:p>
     <w:p>
@@ -407,388 +481,12 @@
           <w:sz w:val="22"/>
           <w:szCs w:val="22"/>
         </w:rPr>
-        <w:t xml:space="preserve">Cambios respecto a la version anterior: se agrego el endpoint /health con validacion de artefactos, se incorporo logging operativo por request e inferencia, se informa la version del modelo en /health y en la respuesta de /predecir, y se corrigio el DataFrame de prediccion para incluir las 10 variables con las que fue entrenado el modelo (payment_method, internet_service y region estaban ausentes en la version 1.0.0).</w:t>
+        <w:t xml:space="preserve">Incorpora logging operativo por request e inferencia, y metricas de negocio expuestas en /metrics para Prometheus.</w:t>
       </w:r>
     </w:p>
     <w:p>
       <w:pPr>
         <w:spacing w:after="0" w:before="160"/>
-      </w:pPr>
-    </w:p>
-    <w:tbl>
-      <w:tblPr>
-        <w:tblW w:type="dxa" w:w="9360"/>
-        <w:tblBorders>
-          <w:top w:val="single" w:color="auto" w:sz="4"/>
-          <w:left w:val="single" w:color="auto" w:sz="4"/>
-          <w:bottom w:val="single" w:color="auto" w:sz="4"/>
-          <w:right w:val="single" w:color="auto" w:sz="4"/>
-          <w:insideH w:val="single" w:color="auto" w:sz="4"/>
-          <w:insideV w:val="single" w:color="auto" w:sz="4"/>
-        </w:tblBorders>
-      </w:tblPr>
-      <w:tblGrid>
-        <w:gridCol w:w="2000"/>
-        <w:gridCol w:w="2500"/>
-        <w:gridCol w:w="4860"/>
-      </w:tblGrid>
-      <w:tr>
-        <w:tc>
-          <w:tcPr>
-            <w:tcW w:type="dxa" w:w="2000"/>
-            <w:tcBorders>
-              <w:top w:val="single" w:color="CCCCCC" w:sz="1"/>
-              <w:left w:val="single" w:color="CCCCCC" w:sz="1"/>
-              <w:bottom w:val="single" w:color="CCCCCC" w:sz="1"/>
-              <w:right w:val="single" w:color="CCCCCC" w:sz="1"/>
-            </w:tcBorders>
-            <w:shd w:fill="2E75B6" w:val="clear"/>
-            <w:tcMar>
-              <w:top w:type="dxa" w:w="80"/>
-              <w:left w:type="dxa" w:w="120"/>
-              <w:bottom w:type="dxa" w:w="80"/>
-              <w:right w:type="dxa" w:w="120"/>
-            </w:tcMar>
-          </w:tcPr>
-          <w:p>
-            <w:r>
-              <w:rPr>
-                <w:rFonts w:ascii="Arial" w:cs="Arial" w:eastAsia="Arial" w:hAnsi="Arial"/>
-                <w:b/>
-                <w:bCs/>
-                <w:color w:val="FFFFFF"/>
-                <w:sz w:val="20"/>
-                <w:szCs w:val="20"/>
-              </w:rPr>
-              <w:t xml:space="preserve">Metodo</w:t>
-            </w:r>
-          </w:p>
-        </w:tc>
-        <w:tc>
-          <w:tcPr>
-            <w:tcW w:type="dxa" w:w="2500"/>
-            <w:tcBorders>
-              <w:top w:val="single" w:color="CCCCCC" w:sz="1"/>
-              <w:left w:val="single" w:color="CCCCCC" w:sz="1"/>
-              <w:bottom w:val="single" w:color="CCCCCC" w:sz="1"/>
-              <w:right w:val="single" w:color="CCCCCC" w:sz="1"/>
-            </w:tcBorders>
-            <w:shd w:fill="2E75B6" w:val="clear"/>
-            <w:tcMar>
-              <w:top w:type="dxa" w:w="80"/>
-              <w:left w:type="dxa" w:w="120"/>
-              <w:bottom w:type="dxa" w:w="80"/>
-              <w:right w:type="dxa" w:w="120"/>
-            </w:tcMar>
-          </w:tcPr>
-          <w:p>
-            <w:r>
-              <w:rPr>
-                <w:rFonts w:ascii="Arial" w:cs="Arial" w:eastAsia="Arial" w:hAnsi="Arial"/>
-                <w:b/>
-                <w:bCs/>
-                <w:color w:val="FFFFFF"/>
-                <w:sz w:val="20"/>
-                <w:szCs w:val="20"/>
-              </w:rPr>
-              <w:t xml:space="preserve">Endpoint</w:t>
-            </w:r>
-          </w:p>
-        </w:tc>
-        <w:tc>
-          <w:tcPr>
-            <w:tcW w:type="dxa" w:w="4860"/>
-            <w:tcBorders>
-              <w:top w:val="single" w:color="CCCCCC" w:sz="1"/>
-              <w:left w:val="single" w:color="CCCCCC" w:sz="1"/>
-              <w:bottom w:val="single" w:color="CCCCCC" w:sz="1"/>
-              <w:right w:val="single" w:color="CCCCCC" w:sz="1"/>
-            </w:tcBorders>
-            <w:shd w:fill="2E75B6" w:val="clear"/>
-            <w:tcMar>
-              <w:top w:type="dxa" w:w="80"/>
-              <w:left w:type="dxa" w:w="120"/>
-              <w:bottom w:type="dxa" w:w="80"/>
-              <w:right w:type="dxa" w:w="120"/>
-            </w:tcMar>
-          </w:tcPr>
-          <w:p>
-            <w:r>
-              <w:rPr>
-                <w:rFonts w:ascii="Arial" w:cs="Arial" w:eastAsia="Arial" w:hAnsi="Arial"/>
-                <w:b/>
-                <w:bCs/>
-                <w:color w:val="FFFFFF"/>
-                <w:sz w:val="20"/>
-                <w:szCs w:val="20"/>
-              </w:rPr>
-              <w:t xml:space="preserve">Descripcion</w:t>
-            </w:r>
-          </w:p>
-        </w:tc>
-      </w:tr>
-      <w:tr>
-        <w:tc>
-          <w:tcPr>
-            <w:tcW w:type="dxa" w:w="2000"/>
-            <w:tcBorders>
-              <w:top w:val="single" w:color="CCCCCC" w:sz="1"/>
-              <w:left w:val="single" w:color="CCCCCC" w:sz="1"/>
-              <w:bottom w:val="single" w:color="CCCCCC" w:sz="1"/>
-              <w:right w:val="single" w:color="CCCCCC" w:sz="1"/>
-            </w:tcBorders>
-            <w:shd w:fill="FFFFFF" w:val="clear"/>
-            <w:tcMar>
-              <w:top w:type="dxa" w:w="80"/>
-              <w:left w:type="dxa" w:w="120"/>
-              <w:bottom w:type="dxa" w:w="80"/>
-              <w:right w:type="dxa" w:w="120"/>
-            </w:tcMar>
-          </w:tcPr>
-          <w:p>
-            <w:r>
-              <w:rPr>
-                <w:rFonts w:ascii="Arial" w:cs="Arial" w:eastAsia="Arial" w:hAnsi="Arial"/>
-                <w:sz w:val="20"/>
-                <w:szCs w:val="20"/>
-              </w:rPr>
-              <w:t xml:space="preserve">GET</w:t>
-            </w:r>
-          </w:p>
-        </w:tc>
-        <w:tc>
-          <w:tcPr>
-            <w:tcW w:type="dxa" w:w="2500"/>
-            <w:tcBorders>
-              <w:top w:val="single" w:color="CCCCCC" w:sz="1"/>
-              <w:left w:val="single" w:color="CCCCCC" w:sz="1"/>
-              <w:bottom w:val="single" w:color="CCCCCC" w:sz="1"/>
-              <w:right w:val="single" w:color="CCCCCC" w:sz="1"/>
-            </w:tcBorders>
-            <w:shd w:fill="FFFFFF" w:val="clear"/>
-            <w:tcMar>
-              <w:top w:type="dxa" w:w="80"/>
-              <w:left w:type="dxa" w:w="120"/>
-              <w:bottom w:type="dxa" w:w="80"/>
-              <w:right w:type="dxa" w:w="120"/>
-            </w:tcMar>
-          </w:tcPr>
-          <w:p>
-            <w:r>
-              <w:rPr>
-                <w:rFonts w:ascii="Arial" w:cs="Arial" w:eastAsia="Arial" w:hAnsi="Arial"/>
-                <w:sz w:val="20"/>
-                <w:szCs w:val="20"/>
-              </w:rPr>
-              <w:t xml:space="preserve">/</w:t>
-            </w:r>
-          </w:p>
-        </w:tc>
-        <w:tc>
-          <w:tcPr>
-            <w:tcW w:type="dxa" w:w="4860"/>
-            <w:tcBorders>
-              <w:top w:val="single" w:color="CCCCCC" w:sz="1"/>
-              <w:left w:val="single" w:color="CCCCCC" w:sz="1"/>
-              <w:bottom w:val="single" w:color="CCCCCC" w:sz="1"/>
-              <w:right w:val="single" w:color="CCCCCC" w:sz="1"/>
-            </w:tcBorders>
-            <w:shd w:fill="FFFFFF" w:val="clear"/>
-            <w:tcMar>
-              <w:top w:type="dxa" w:w="80"/>
-              <w:left w:type="dxa" w:w="120"/>
-              <w:bottom w:type="dxa" w:w="80"/>
-              <w:right w:type="dxa" w:w="120"/>
-            </w:tcMar>
-          </w:tcPr>
-          <w:p>
-            <w:r>
-              <w:rPr>
-                <w:rFonts w:ascii="Arial" w:cs="Arial" w:eastAsia="Arial" w:hAnsi="Arial"/>
-                <w:sz w:val="20"/>
-                <w:szCs w:val="20"/>
-              </w:rPr>
-              <w:t xml:space="preserve">Estado de la API y version del modelo</w:t>
-            </w:r>
-          </w:p>
-        </w:tc>
-      </w:tr>
-      <w:tr>
-        <w:tc>
-          <w:tcPr>
-            <w:tcW w:type="dxa" w:w="2000"/>
-            <w:tcBorders>
-              <w:top w:val="single" w:color="CCCCCC" w:sz="1"/>
-              <w:left w:val="single" w:color="CCCCCC" w:sz="1"/>
-              <w:bottom w:val="single" w:color="CCCCCC" w:sz="1"/>
-              <w:right w:val="single" w:color="CCCCCC" w:sz="1"/>
-            </w:tcBorders>
-            <w:shd w:fill="EBF3FB" w:val="clear"/>
-            <w:tcMar>
-              <w:top w:type="dxa" w:w="80"/>
-              <w:left w:type="dxa" w:w="120"/>
-              <w:bottom w:type="dxa" w:w="80"/>
-              <w:right w:type="dxa" w:w="120"/>
-            </w:tcMar>
-          </w:tcPr>
-          <w:p>
-            <w:r>
-              <w:rPr>
-                <w:rFonts w:ascii="Arial" w:cs="Arial" w:eastAsia="Arial" w:hAnsi="Arial"/>
-                <w:sz w:val="20"/>
-                <w:szCs w:val="20"/>
-              </w:rPr>
-              <w:t xml:space="preserve">GET</w:t>
-            </w:r>
-          </w:p>
-        </w:tc>
-        <w:tc>
-          <w:tcPr>
-            <w:tcW w:type="dxa" w:w="2500"/>
-            <w:tcBorders>
-              <w:top w:val="single" w:color="CCCCCC" w:sz="1"/>
-              <w:left w:val="single" w:color="CCCCCC" w:sz="1"/>
-              <w:bottom w:val="single" w:color="CCCCCC" w:sz="1"/>
-              <w:right w:val="single" w:color="CCCCCC" w:sz="1"/>
-            </w:tcBorders>
-            <w:shd w:fill="EBF3FB" w:val="clear"/>
-            <w:tcMar>
-              <w:top w:type="dxa" w:w="80"/>
-              <w:left w:type="dxa" w:w="120"/>
-              <w:bottom w:type="dxa" w:w="80"/>
-              <w:right w:type="dxa" w:w="120"/>
-            </w:tcMar>
-          </w:tcPr>
-          <w:p>
-            <w:r>
-              <w:rPr>
-                <w:rFonts w:ascii="Arial" w:cs="Arial" w:eastAsia="Arial" w:hAnsi="Arial"/>
-                <w:sz w:val="20"/>
-                <w:szCs w:val="20"/>
-              </w:rPr>
-              <w:t xml:space="preserve">/health</w:t>
-            </w:r>
-          </w:p>
-        </w:tc>
-        <w:tc>
-          <w:tcPr>
-            <w:tcW w:type="dxa" w:w="4860"/>
-            <w:tcBorders>
-              <w:top w:val="single" w:color="CCCCCC" w:sz="1"/>
-              <w:left w:val="single" w:color="CCCCCC" w:sz="1"/>
-              <w:bottom w:val="single" w:color="CCCCCC" w:sz="1"/>
-              <w:right w:val="single" w:color="CCCCCC" w:sz="1"/>
-            </w:tcBorders>
-            <w:shd w:fill="EBF3FB" w:val="clear"/>
-            <w:tcMar>
-              <w:top w:type="dxa" w:w="80"/>
-              <w:left w:type="dxa" w:w="120"/>
-              <w:bottom w:type="dxa" w:w="80"/>
-              <w:right w:type="dxa" w:w="120"/>
-            </w:tcMar>
-          </w:tcPr>
-          <w:p>
-            <w:r>
-              <w:rPr>
-                <w:rFonts w:ascii="Arial" w:cs="Arial" w:eastAsia="Arial" w:hAnsi="Arial"/>
-                <w:sz w:val="20"/>
-                <w:szCs w:val="20"/>
-              </w:rPr>
-              <w:t xml:space="preserve">Validacion de artefactos cargados en memoria</w:t>
-            </w:r>
-          </w:p>
-        </w:tc>
-      </w:tr>
-      <w:tr>
-        <w:tc>
-          <w:tcPr>
-            <w:tcW w:type="dxa" w:w="2000"/>
-            <w:tcBorders>
-              <w:top w:val="single" w:color="CCCCCC" w:sz="1"/>
-              <w:left w:val="single" w:color="CCCCCC" w:sz="1"/>
-              <w:bottom w:val="single" w:color="CCCCCC" w:sz="1"/>
-              <w:right w:val="single" w:color="CCCCCC" w:sz="1"/>
-            </w:tcBorders>
-            <w:shd w:fill="FFFFFF" w:val="clear"/>
-            <w:tcMar>
-              <w:top w:type="dxa" w:w="80"/>
-              <w:left w:type="dxa" w:w="120"/>
-              <w:bottom w:type="dxa" w:w="80"/>
-              <w:right w:type="dxa" w:w="120"/>
-            </w:tcMar>
-          </w:tcPr>
-          <w:p>
-            <w:r>
-              <w:rPr>
-                <w:rFonts w:ascii="Arial" w:cs="Arial" w:eastAsia="Arial" w:hAnsi="Arial"/>
-                <w:sz w:val="20"/>
-                <w:szCs w:val="20"/>
-              </w:rPr>
-              <w:t xml:space="preserve">POST</w:t>
-            </w:r>
-          </w:p>
-        </w:tc>
-        <w:tc>
-          <w:tcPr>
-            <w:tcW w:type="dxa" w:w="2500"/>
-            <w:tcBorders>
-              <w:top w:val="single" w:color="CCCCCC" w:sz="1"/>
-              <w:left w:val="single" w:color="CCCCCC" w:sz="1"/>
-              <w:bottom w:val="single" w:color="CCCCCC" w:sz="1"/>
-              <w:right w:val="single" w:color="CCCCCC" w:sz="1"/>
-            </w:tcBorders>
-            <w:shd w:fill="FFFFFF" w:val="clear"/>
-            <w:tcMar>
-              <w:top w:type="dxa" w:w="80"/>
-              <w:left w:type="dxa" w:w="120"/>
-              <w:bottom w:type="dxa" w:w="80"/>
-              <w:right w:type="dxa" w:w="120"/>
-            </w:tcMar>
-          </w:tcPr>
-          <w:p>
-            <w:r>
-              <w:rPr>
-                <w:rFonts w:ascii="Arial" w:cs="Arial" w:eastAsia="Arial" w:hAnsi="Arial"/>
-                <w:sz w:val="20"/>
-                <w:szCs w:val="20"/>
-              </w:rPr>
-              <w:t xml:space="preserve">/predecir</w:t>
-            </w:r>
-          </w:p>
-        </w:tc>
-        <w:tc>
-          <w:tcPr>
-            <w:tcW w:type="dxa" w:w="4860"/>
-            <w:tcBorders>
-              <w:top w:val="single" w:color="CCCCCC" w:sz="1"/>
-              <w:left w:val="single" w:color="CCCCCC" w:sz="1"/>
-              <w:bottom w:val="single" w:color="CCCCCC" w:sz="1"/>
-              <w:right w:val="single" w:color="CCCCCC" w:sz="1"/>
-            </w:tcBorders>
-            <w:shd w:fill="FFFFFF" w:val="clear"/>
-            <w:tcMar>
-              <w:top w:type="dxa" w:w="80"/>
-              <w:left w:type="dxa" w:w="120"/>
-              <w:bottom w:type="dxa" w:w="80"/>
-              <w:right w:type="dxa" w:w="120"/>
-            </w:tcMar>
-          </w:tcPr>
-          <w:p>
-            <w:r>
-              <w:rPr>
-                <w:rFonts w:ascii="Arial" w:cs="Arial" w:eastAsia="Arial" w:hAnsi="Arial"/>
-                <w:sz w:val="20"/>
-                <w:szCs w:val="20"/>
-              </w:rPr>
-              <w:t xml:space="preserve">Prediccion de churn con las 10 variables</w:t>
-            </w:r>
-          </w:p>
-        </w:tc>
-      </w:tr>
-    </w:tbl>
-    <w:p>
-      <w:pPr>
-        <w:spacing w:after="0" w:before="200"/>
       </w:pPr>
     </w:p>
     <w:p>
@@ -804,7 +502,7 @@
           <w:sz w:val="26"/>
           <w:szCs w:val="26"/>
         </w:rPr>
-        <w:t xml:space="preserve">3.2 Interfaz Grafica (Streamlit)</w:t>
+        <w:t xml:space="preserve">3.3 Interfaz Grafica — Streamlit</w:t>
       </w:r>
     </w:p>
     <w:p>
@@ -817,20 +515,7 @@
           <w:sz w:val="22"/>
           <w:szCs w:val="22"/>
         </w:rPr>
-        <w:t xml:space="preserve">Archivo: src/app.py</w:t>
-      </w:r>
-    </w:p>
-    <w:p>
-      <w:pPr>
-        <w:spacing w:after="80" w:before="80"/>
-      </w:pPr>
-      <w:r>
-        <w:rPr>
-          <w:rFonts w:ascii="Arial" w:cs="Arial" w:eastAsia="Arial" w:hAnsi="Arial"/>
-          <w:sz w:val="22"/>
-          <w:szCs w:val="22"/>
-        </w:rPr>
-        <w:t xml:space="preserve">La GUI permite ingresar las 10 variables del cliente, disparar la prediccion y visualizar el resultado con indicador de color (verde/rojo), etiqueta descriptiva y barra de probabilidad. La URL de la API se configura mediante la variable de entorno API_URL, lo que permite operar tanto en modo local como dentro de Docker sin cambios en el codigo.</w:t>
+        <w:t xml:space="preserve">Formulario con las 10 variables del modelo. Muestra prediccion con indicador de color, etiqueta descriptiva y barra de probabilidad. La URL de la API se configura via variable de entorno API_URL.</w:t>
       </w:r>
     </w:p>
     <w:p>
@@ -851,7 +536,7 @@
           <w:sz w:val="26"/>
           <w:szCs w:val="26"/>
         </w:rPr>
-        <w:t xml:space="preserve">3.3 Contenerizacion (Docker)</w:t>
+        <w:t xml:space="preserve">3.4 Monitoreo Tecnico — Prometheus + Grafana</w:t>
       </w:r>
     </w:p>
     <w:p>
@@ -864,7 +549,7 @@
           <w:sz w:val="22"/>
           <w:szCs w:val="22"/>
         </w:rPr>
-        <w:t xml:space="preserve">Dos imagenes Docker independientes orquestadas con docker-compose.yml:</w:t>
+        <w:t xml:space="preserve">Metricas recolectadas automaticamente por prometheus-fastapi-instrumentator:</w:t>
       </w:r>
     </w:p>
     <w:p>
@@ -882,7 +567,7 @@
           <w:sz w:val="22"/>
           <w:szCs w:val="22"/>
         </w:rPr>
-        <w:t xml:space="preserve">Dockerfile.api — python:3.13-slim, copia explicita de cada .joblib, variable de entorno MODELS_DIR=/app/models, puerto 8000</w:t>
+        <w:t xml:space="preserve">http_requests_total — cantidad de requests por endpoint y status code</w:t>
       </w:r>
     </w:p>
     <w:p>
@@ -900,12 +585,17 @@
           <w:sz w:val="22"/>
           <w:szCs w:val="22"/>
         </w:rPr>
-        <w:t xml:space="preserve">Dockerfile.streamlit — python:3.13-slim, copia de la GUI, variable de entorno API_URL, puerto 8501</w:t>
-      </w:r>
-    </w:p>
-    <w:p>
-      <w:pPr>
-        <w:spacing w:after="80" w:before="80"/>
+        <w:t xml:space="preserve">http_request_duration_seconds — latencia de cada request</w:t>
+      </w:r>
+    </w:p>
+    <w:p>
+      <w:pPr>
+        <w:pStyle w:val="ListParagraph"/>
+        <w:numPr>
+          <w:ilvl w:val="0"/>
+          <w:numId w:val="2"/>
+        </w:numPr>
+        <w:spacing w:after="60" w:before="60"/>
       </w:pPr>
       <w:r>
         <w:rPr>
@@ -913,12 +603,17 @@
           <w:sz w:val="22"/>
           <w:szCs w:val="22"/>
         </w:rPr>
-        <w:t xml:space="preserve">El servicio gui depende del servicio api con condicion service_healthy usando el endpoint /health como verificador. Esto garantiza que la GUI no intente conectarse antes de que los modelos esten cargados.</w:t>
-      </w:r>
-    </w:p>
-    <w:p>
-      <w:pPr>
-        <w:spacing w:after="80" w:before="80"/>
+        <w:t xml:space="preserve">churn_predicciones_total — contador separado por resultado (churn / no_churn)</w:t>
+      </w:r>
+    </w:p>
+    <w:p>
+      <w:pPr>
+        <w:pStyle w:val="ListParagraph"/>
+        <w:numPr>
+          <w:ilvl w:val="0"/>
+          <w:numId w:val="2"/>
+        </w:numPr>
+        <w:spacing w:after="60" w:before="60"/>
       </w:pPr>
       <w:r>
         <w:rPr>
@@ -926,7 +621,38 @@
           <w:sz w:val="22"/>
           <w:szCs w:val="22"/>
         </w:rPr>
-        <w:t xml:space="preserve">ADVERTENCIA: el build de Docker requiere que los archivos .joblib existan localmente. Si no se ejecuta dvc pull antes de docker-compose up --build, el build falla con FileNotFoundError.</w:t>
+        <w:t xml:space="preserve">churn_probabilidad — histograma de probabilidades predichas</w:t>
+      </w:r>
+    </w:p>
+    <w:p>
+      <w:pPr>
+        <w:pStyle w:val="ListParagraph"/>
+        <w:numPr>
+          <w:ilvl w:val="0"/>
+          <w:numId w:val="2"/>
+        </w:numPr>
+        <w:spacing w:after="60" w:before="60"/>
+      </w:pPr>
+      <w:r>
+        <w:rPr>
+          <w:rFonts w:ascii="Arial" w:cs="Arial" w:eastAsia="Arial" w:hAnsi="Arial"/>
+          <w:sz w:val="22"/>
+          <w:szCs w:val="22"/>
+        </w:rPr>
+        <w:t xml:space="preserve">churn_inferencia_segundos — tiempo de inferencia del modelo</w:t>
+      </w:r>
+    </w:p>
+    <w:p>
+      <w:pPr>
+        <w:spacing w:after="80" w:before="80"/>
+      </w:pPr>
+      <w:r>
+        <w:rPr>
+          <w:rFonts w:ascii="Arial" w:cs="Arial" w:eastAsia="Arial" w:hAnsi="Arial"/>
+          <w:sz w:val="22"/>
+          <w:szCs w:val="22"/>
+        </w:rPr>
+        <w:t xml:space="preserve">Prometheus recolecta metricas cada 15 segundos desde /metrics. Grafana visualiza las metricas en un dashboard con 6 paneles: requests por endpoint, latencia p95, predicciones churn vs no_churn, distribucion de probabilidad, latencia de inferencia y total acumulado.</w:t>
       </w:r>
     </w:p>
     <w:p>
@@ -947,7 +673,7 @@
           <w:sz w:val="26"/>
           <w:szCs w:val="26"/>
         </w:rPr>
-        <w:t xml:space="preserve">3.4 Versionado de Datos y Modelos (DVC + DagsHub)</w:t>
+        <w:t xml:space="preserve">3.5 Monitoreo de Datos y Modelo — Evidently</w:t>
       </w:r>
     </w:p>
     <w:p>
@@ -960,12 +686,17 @@
           <w:sz w:val="22"/>
           <w:szCs w:val="22"/>
         </w:rPr>
-        <w:t xml:space="preserve">Los datos y modelos se versionan con DVC utilizando DagsHub como remote storage. Cada colaborador configura sus credenciales localmente con su propio token de DagsHub (gratuito) y ejecuta dvc pull para recuperar los artefactos.</w:t>
-      </w:r>
-    </w:p>
-    <w:p>
-      <w:pPr>
-        <w:spacing w:after="80" w:before="80"/>
+        <w:t xml:space="preserve">Script src/monitoreo_evidently.py que genera dos reportes HTML:</w:t>
+      </w:r>
+    </w:p>
+    <w:p>
+      <w:pPr>
+        <w:pStyle w:val="ListParagraph"/>
+        <w:numPr>
+          <w:ilvl w:val="0"/>
+          <w:numId w:val="2"/>
+        </w:numPr>
+        <w:spacing w:after="60" w:before="60"/>
       </w:pPr>
       <w:r>
         <w:rPr>
@@ -973,7 +704,110 @@
           <w:sz w:val="22"/>
           <w:szCs w:val="22"/>
         </w:rPr>
-        <w:t xml:space="preserve">Esta decision reemplaza la configuracion inicial con Google Drive, que presentaba restricciones OAuth que impedian el acceso desde nuevas maquinas sin intervencion manual.</w:t>
+        <w:t xml:space="preserve">reporte_drift.html — compara la distribucion de las variables entre datos de referencia (70% del dataset) y datos de produccion simulados (30% con drift inducido en monthly_charge y support_tickets)</w:t>
+      </w:r>
+    </w:p>
+    <w:p>
+      <w:pPr>
+        <w:pStyle w:val="ListParagraph"/>
+        <w:numPr>
+          <w:ilvl w:val="0"/>
+          <w:numId w:val="2"/>
+        </w:numPr>
+        <w:spacing w:after="60" w:before="60"/>
+      </w:pPr>
+      <w:r>
+        <w:rPr>
+          <w:rFonts w:ascii="Arial" w:cs="Arial" w:eastAsia="Arial" w:hAnsi="Arial"/>
+          <w:sz w:val="22"/>
+          <w:szCs w:val="22"/>
+        </w:rPr>
+        <w:t xml:space="preserve">reporte_clasificacion.html — evalua degradacion del modelo comparando accuracy, F1 y matriz de confusion entre referencia y produccion</w:t>
+      </w:r>
+    </w:p>
+    <w:p>
+      <w:pPr>
+        <w:spacing w:after="80" w:before="80"/>
+      </w:pPr>
+      <w:r>
+        <w:rPr>
+          <w:rFonts w:ascii="Arial" w:cs="Arial" w:eastAsia="Arial" w:hAnsi="Arial"/>
+          <w:sz w:val="22"/>
+          <w:szCs w:val="22"/>
+        </w:rPr>
+        <w:t xml:space="preserve">Resultados obtenidos en el analisis:</w:t>
+      </w:r>
+    </w:p>
+    <w:p>
+      <w:pPr>
+        <w:pStyle w:val="ListParagraph"/>
+        <w:numPr>
+          <w:ilvl w:val="0"/>
+          <w:numId w:val="2"/>
+        </w:numPr>
+        <w:spacing w:after="60" w:before="60"/>
+      </w:pPr>
+      <w:r>
+        <w:rPr>
+          <w:rFonts w:ascii="Arial" w:cs="Arial" w:eastAsia="Arial" w:hAnsi="Arial"/>
+          <w:sz w:val="22"/>
+          <w:szCs w:val="22"/>
+        </w:rPr>
+        <w:t xml:space="preserve">Dataset drift general: NO detectado</w:t>
+      </w:r>
+    </w:p>
+    <w:p>
+      <w:pPr>
+        <w:pStyle w:val="ListParagraph"/>
+        <w:numPr>
+          <w:ilvl w:val="0"/>
+          <w:numId w:val="2"/>
+        </w:numPr>
+        <w:spacing w:after="60" w:before="60"/>
+      </w:pPr>
+      <w:r>
+        <w:rPr>
+          <w:rFonts w:ascii="Arial" w:cs="Arial" w:eastAsia="Arial" w:hAnsi="Arial"/>
+          <w:sz w:val="22"/>
+          <w:szCs w:val="22"/>
+        </w:rPr>
+        <w:t xml:space="preserve">monthly_charge: drift_score=0.30  -&gt;  drift SI</w:t>
+      </w:r>
+    </w:p>
+    <w:p>
+      <w:pPr>
+        <w:pStyle w:val="ListParagraph"/>
+        <w:numPr>
+          <w:ilvl w:val="0"/>
+          <w:numId w:val="2"/>
+        </w:numPr>
+        <w:spacing w:after="60" w:before="60"/>
+      </w:pPr>
+      <w:r>
+        <w:rPr>
+          <w:rFonts w:ascii="Arial" w:cs="Arial" w:eastAsia="Arial" w:hAnsi="Arial"/>
+          <w:sz w:val="22"/>
+          <w:szCs w:val="22"/>
+        </w:rPr>
+        <w:t xml:space="preserve">support_tickets: drift_score=0.22  -&gt;  drift SI</w:t>
+      </w:r>
+    </w:p>
+    <w:p>
+      <w:pPr>
+        <w:pStyle w:val="ListParagraph"/>
+        <w:numPr>
+          <w:ilvl w:val="0"/>
+          <w:numId w:val="2"/>
+        </w:numPr>
+        <w:spacing w:after="60" w:before="60"/>
+      </w:pPr>
+      <w:r>
+        <w:rPr>
+          <w:rFonts w:ascii="Arial" w:cs="Arial" w:eastAsia="Arial" w:hAnsi="Arial"/>
+          <w:sz w:val="22"/>
+          <w:szCs w:val="22"/>
+        </w:rPr>
+        <w:t xml:space="preserve">tenure_months y avg_monthly_usage_gb: drift NO</w:t>
       </w:r>
     </w:p>
     <w:p>
@@ -998,35 +832,6 @@
           <w:szCs w:val="32"/>
         </w:rPr>
         <w:t xml:space="preserve">4. Contrato de Entrada y Salida</w:t>
-      </w:r>
-    </w:p>
-    <w:p>
-      <w:pPr>
-        <w:pStyle w:val="Heading2"/>
-        <w:spacing w:after="120" w:before="240"/>
-      </w:pPr>
-      <w:r>
-        <w:rPr>
-          <w:rFonts w:ascii="Arial" w:cs="Arial" w:eastAsia="Arial" w:hAnsi="Arial"/>
-          <w:b/>
-          <w:bCs/>
-          <w:sz w:val="26"/>
-          <w:szCs w:val="26"/>
-        </w:rPr>
-        <w:t xml:space="preserve">4.1 Entrada — POST /predecir</w:t>
-      </w:r>
-    </w:p>
-    <w:p>
-      <w:pPr>
-        <w:spacing w:after="80" w:before="80"/>
-      </w:pPr>
-      <w:r>
-        <w:rPr>
-          <w:rFonts w:ascii="Arial" w:cs="Arial" w:eastAsia="Arial" w:hAnsi="Arial"/>
-          <w:sz w:val="22"/>
-          <w:szCs w:val="22"/>
-        </w:rPr>
-        <w:t xml:space="preserve">El modelo fue reentrenado en la version 1.1.0 para incluir las 10 variables. Las versiones anteriores solo usaban 7.</w:t>
       </w:r>
     </w:p>
     <w:p>
@@ -2009,27 +1814,6 @@
     </w:tbl>
     <w:p>
       <w:pPr>
-        <w:spacing w:after="0" w:before="200"/>
-      </w:pPr>
-    </w:p>
-    <w:p>
-      <w:pPr>
-        <w:pStyle w:val="Heading2"/>
-        <w:spacing w:after="120" w:before="240"/>
-      </w:pPr>
-      <w:r>
-        <w:rPr>
-          <w:rFonts w:ascii="Arial" w:cs="Arial" w:eastAsia="Arial" w:hAnsi="Arial"/>
-          <w:b/>
-          <w:bCs/>
-          <w:sz w:val="26"/>
-          <w:szCs w:val="26"/>
-        </w:rPr>
-        <w:t xml:space="preserve">4.2 Salida</w:t>
-      </w:r>
-    </w:p>
-    <w:p>
-      <w:pPr>
         <w:spacing w:after="0" w:before="160"/>
       </w:pPr>
     </w:p>
@@ -2078,7 +1862,7 @@
                 <w:sz w:val="20"/>
                 <w:szCs w:val="20"/>
               </w:rPr>
-              <w:t xml:space="preserve">Campo</w:t>
+              <w:t xml:space="preserve">Salida</w:t>
             </w:r>
           </w:p>
         </w:tc>
@@ -2484,7 +2268,7 @@
                 <w:sz w:val="20"/>
                 <w:szCs w:val="20"/>
               </w:rPr>
-              <w:t xml:space="preserve">Version del modelo utilizado (ej: 1.1.0)</w:t>
+              <w:t xml:space="preserve">Version del modelo (ej: 1.1.0)</w:t>
             </w:r>
           </w:p>
         </w:tc>
@@ -2511,7 +2295,7 @@
           <w:sz w:val="32"/>
           <w:szCs w:val="32"/>
         </w:rPr>
-        <w:t xml:space="preserve">5. Pruebas Automaticas</w:t>
+        <w:t xml:space="preserve">5. Señales de Accion Correctiva</w:t>
       </w:r>
     </w:p>
     <w:p>
@@ -2524,7 +2308,678 @@
           <w:sz w:val="22"/>
           <w:szCs w:val="22"/>
         </w:rPr>
-        <w:t xml:space="preserve">Se implementaron 12 pruebas con pytest en tests/test_api.py utilizando TestClient de FastAPI. Se ampliaron los tests de la version anterior para cubrir el endpoint /health, la version del modelo y la validacion de las 3 variables nuevas.</w:t>
+        <w:t xml:space="preserve">El sistema esta disenado para detectar las siguientes condiciones que requieren intervencion:</w:t>
+      </w:r>
+    </w:p>
+    <w:p>
+      <w:pPr>
+        <w:spacing w:after="0" w:before="160"/>
+      </w:pPr>
+    </w:p>
+    <w:tbl>
+      <w:tblPr>
+        <w:tblW w:type="dxa" w:w="9360"/>
+        <w:tblBorders>
+          <w:top w:val="single" w:color="auto" w:sz="4"/>
+          <w:left w:val="single" w:color="auto" w:sz="4"/>
+          <w:bottom w:val="single" w:color="auto" w:sz="4"/>
+          <w:right w:val="single" w:color="auto" w:sz="4"/>
+          <w:insideH w:val="single" w:color="auto" w:sz="4"/>
+          <w:insideV w:val="single" w:color="auto" w:sz="4"/>
+        </w:tblBorders>
+      </w:tblPr>
+      <w:tblGrid>
+        <w:gridCol w:w="3000"/>
+        <w:gridCol w:w="3000"/>
+        <w:gridCol w:w="3360"/>
+      </w:tblGrid>
+      <w:tr>
+        <w:tc>
+          <w:tcPr>
+            <w:tcW w:type="dxa" w:w="3000"/>
+            <w:tcBorders>
+              <w:top w:val="single" w:color="CCCCCC" w:sz="1"/>
+              <w:left w:val="single" w:color="CCCCCC" w:sz="1"/>
+              <w:bottom w:val="single" w:color="CCCCCC" w:sz="1"/>
+              <w:right w:val="single" w:color="CCCCCC" w:sz="1"/>
+            </w:tcBorders>
+            <w:shd w:fill="2E75B6" w:val="clear"/>
+            <w:tcMar>
+              <w:top w:type="dxa" w:w="80"/>
+              <w:left w:type="dxa" w:w="120"/>
+              <w:bottom w:type="dxa" w:w="80"/>
+              <w:right w:type="dxa" w:w="120"/>
+            </w:tcMar>
+          </w:tcPr>
+          <w:p>
+            <w:r>
+              <w:rPr>
+                <w:rFonts w:ascii="Arial" w:cs="Arial" w:eastAsia="Arial" w:hAnsi="Arial"/>
+                <w:b/>
+                <w:bCs/>
+                <w:color w:val="FFFFFF"/>
+                <w:sz w:val="20"/>
+                <w:szCs w:val="20"/>
+              </w:rPr>
+              <w:t xml:space="preserve">Señal</w:t>
+            </w:r>
+          </w:p>
+        </w:tc>
+        <w:tc>
+          <w:tcPr>
+            <w:tcW w:type="dxa" w:w="3000"/>
+            <w:tcBorders>
+              <w:top w:val="single" w:color="CCCCCC" w:sz="1"/>
+              <w:left w:val="single" w:color="CCCCCC" w:sz="1"/>
+              <w:bottom w:val="single" w:color="CCCCCC" w:sz="1"/>
+              <w:right w:val="single" w:color="CCCCCC" w:sz="1"/>
+            </w:tcBorders>
+            <w:shd w:fill="2E75B6" w:val="clear"/>
+            <w:tcMar>
+              <w:top w:type="dxa" w:w="80"/>
+              <w:left w:type="dxa" w:w="120"/>
+              <w:bottom w:type="dxa" w:w="80"/>
+              <w:right w:type="dxa" w:w="120"/>
+            </w:tcMar>
+          </w:tcPr>
+          <w:p>
+            <w:r>
+              <w:rPr>
+                <w:rFonts w:ascii="Arial" w:cs="Arial" w:eastAsia="Arial" w:hAnsi="Arial"/>
+                <w:b/>
+                <w:bCs/>
+                <w:color w:val="FFFFFF"/>
+                <w:sz w:val="20"/>
+                <w:szCs w:val="20"/>
+              </w:rPr>
+              <w:t xml:space="preserve">Herramienta</w:t>
+            </w:r>
+          </w:p>
+        </w:tc>
+        <w:tc>
+          <w:tcPr>
+            <w:tcW w:type="dxa" w:w="3360"/>
+            <w:tcBorders>
+              <w:top w:val="single" w:color="CCCCCC" w:sz="1"/>
+              <w:left w:val="single" w:color="CCCCCC" w:sz="1"/>
+              <w:bottom w:val="single" w:color="CCCCCC" w:sz="1"/>
+              <w:right w:val="single" w:color="CCCCCC" w:sz="1"/>
+            </w:tcBorders>
+            <w:shd w:fill="2E75B6" w:val="clear"/>
+            <w:tcMar>
+              <w:top w:type="dxa" w:w="80"/>
+              <w:left w:type="dxa" w:w="120"/>
+              <w:bottom w:type="dxa" w:w="80"/>
+              <w:right w:type="dxa" w:w="120"/>
+            </w:tcMar>
+          </w:tcPr>
+          <w:p>
+            <w:r>
+              <w:rPr>
+                <w:rFonts w:ascii="Arial" w:cs="Arial" w:eastAsia="Arial" w:hAnsi="Arial"/>
+                <w:b/>
+                <w:bCs/>
+                <w:color w:val="FFFFFF"/>
+                <w:sz w:val="20"/>
+                <w:szCs w:val="20"/>
+              </w:rPr>
+              <w:t xml:space="preserve">Accion correctiva</w:t>
+            </w:r>
+          </w:p>
+        </w:tc>
+      </w:tr>
+      <w:tr>
+        <w:tc>
+          <w:tcPr>
+            <w:tcW w:type="dxa" w:w="3000"/>
+            <w:tcBorders>
+              <w:top w:val="single" w:color="CCCCCC" w:sz="1"/>
+              <w:left w:val="single" w:color="CCCCCC" w:sz="1"/>
+              <w:bottom w:val="single" w:color="CCCCCC" w:sz="1"/>
+              <w:right w:val="single" w:color="CCCCCC" w:sz="1"/>
+            </w:tcBorders>
+            <w:shd w:fill="FFFFFF" w:val="clear"/>
+            <w:tcMar>
+              <w:top w:type="dxa" w:w="80"/>
+              <w:left w:type="dxa" w:w="120"/>
+              <w:bottom w:type="dxa" w:w="80"/>
+              <w:right w:type="dxa" w:w="120"/>
+            </w:tcMar>
+          </w:tcPr>
+          <w:p>
+            <w:r>
+              <w:rPr>
+                <w:rFonts w:ascii="Arial" w:cs="Arial" w:eastAsia="Arial" w:hAnsi="Arial"/>
+                <w:sz w:val="20"/>
+                <w:szCs w:val="20"/>
+              </w:rPr>
+              <w:t xml:space="preserve">Drift en monthly_charge o support_tickets</w:t>
+            </w:r>
+          </w:p>
+        </w:tc>
+        <w:tc>
+          <w:tcPr>
+            <w:tcW w:type="dxa" w:w="3000"/>
+            <w:tcBorders>
+              <w:top w:val="single" w:color="CCCCCC" w:sz="1"/>
+              <w:left w:val="single" w:color="CCCCCC" w:sz="1"/>
+              <w:bottom w:val="single" w:color="CCCCCC" w:sz="1"/>
+              <w:right w:val="single" w:color="CCCCCC" w:sz="1"/>
+            </w:tcBorders>
+            <w:shd w:fill="FFFFFF" w:val="clear"/>
+            <w:tcMar>
+              <w:top w:type="dxa" w:w="80"/>
+              <w:left w:type="dxa" w:w="120"/>
+              <w:bottom w:type="dxa" w:w="80"/>
+              <w:right w:type="dxa" w:w="120"/>
+            </w:tcMar>
+          </w:tcPr>
+          <w:p>
+            <w:r>
+              <w:rPr>
+                <w:rFonts w:ascii="Arial" w:cs="Arial" w:eastAsia="Arial" w:hAnsi="Arial"/>
+                <w:sz w:val="20"/>
+                <w:szCs w:val="20"/>
+              </w:rPr>
+              <w:t xml:space="preserve">Evidently</w:t>
+            </w:r>
+          </w:p>
+        </w:tc>
+        <w:tc>
+          <w:tcPr>
+            <w:tcW w:type="dxa" w:w="3360"/>
+            <w:tcBorders>
+              <w:top w:val="single" w:color="CCCCCC" w:sz="1"/>
+              <w:left w:val="single" w:color="CCCCCC" w:sz="1"/>
+              <w:bottom w:val="single" w:color="CCCCCC" w:sz="1"/>
+              <w:right w:val="single" w:color="CCCCCC" w:sz="1"/>
+            </w:tcBorders>
+            <w:shd w:fill="FFFFFF" w:val="clear"/>
+            <w:tcMar>
+              <w:top w:type="dxa" w:w="80"/>
+              <w:left w:type="dxa" w:w="120"/>
+              <w:bottom w:type="dxa" w:w="80"/>
+              <w:right w:type="dxa" w:w="120"/>
+            </w:tcMar>
+          </w:tcPr>
+          <w:p>
+            <w:r>
+              <w:rPr>
+                <w:rFonts w:ascii="Arial" w:cs="Arial" w:eastAsia="Arial" w:hAnsi="Arial"/>
+                <w:sz w:val="20"/>
+                <w:szCs w:val="20"/>
+              </w:rPr>
+              <w:t xml:space="preserve">Reentrenar con datos recientes</w:t>
+            </w:r>
+          </w:p>
+        </w:tc>
+      </w:tr>
+      <w:tr>
+        <w:tc>
+          <w:tcPr>
+            <w:tcW w:type="dxa" w:w="3000"/>
+            <w:tcBorders>
+              <w:top w:val="single" w:color="CCCCCC" w:sz="1"/>
+              <w:left w:val="single" w:color="CCCCCC" w:sz="1"/>
+              <w:bottom w:val="single" w:color="CCCCCC" w:sz="1"/>
+              <w:right w:val="single" w:color="CCCCCC" w:sz="1"/>
+            </w:tcBorders>
+            <w:shd w:fill="EBF3FB" w:val="clear"/>
+            <w:tcMar>
+              <w:top w:type="dxa" w:w="80"/>
+              <w:left w:type="dxa" w:w="120"/>
+              <w:bottom w:type="dxa" w:w="80"/>
+              <w:right w:type="dxa" w:w="120"/>
+            </w:tcMar>
+          </w:tcPr>
+          <w:p>
+            <w:r>
+              <w:rPr>
+                <w:rFonts w:ascii="Arial" w:cs="Arial" w:eastAsia="Arial" w:hAnsi="Arial"/>
+                <w:sz w:val="20"/>
+                <w:szCs w:val="20"/>
+              </w:rPr>
+              <w:t xml:space="preserve">Caida de F1 &gt; 5% en produccion</w:t>
+            </w:r>
+          </w:p>
+        </w:tc>
+        <w:tc>
+          <w:tcPr>
+            <w:tcW w:type="dxa" w:w="3000"/>
+            <w:tcBorders>
+              <w:top w:val="single" w:color="CCCCCC" w:sz="1"/>
+              <w:left w:val="single" w:color="CCCCCC" w:sz="1"/>
+              <w:bottom w:val="single" w:color="CCCCCC" w:sz="1"/>
+              <w:right w:val="single" w:color="CCCCCC" w:sz="1"/>
+            </w:tcBorders>
+            <w:shd w:fill="EBF3FB" w:val="clear"/>
+            <w:tcMar>
+              <w:top w:type="dxa" w:w="80"/>
+              <w:left w:type="dxa" w:w="120"/>
+              <w:bottom w:type="dxa" w:w="80"/>
+              <w:right w:type="dxa" w:w="120"/>
+            </w:tcMar>
+          </w:tcPr>
+          <w:p>
+            <w:r>
+              <w:rPr>
+                <w:rFonts w:ascii="Arial" w:cs="Arial" w:eastAsia="Arial" w:hAnsi="Arial"/>
+                <w:sz w:val="20"/>
+                <w:szCs w:val="20"/>
+              </w:rPr>
+              <w:t xml:space="preserve">Evidently</w:t>
+            </w:r>
+          </w:p>
+        </w:tc>
+        <w:tc>
+          <w:tcPr>
+            <w:tcW w:type="dxa" w:w="3360"/>
+            <w:tcBorders>
+              <w:top w:val="single" w:color="CCCCCC" w:sz="1"/>
+              <w:left w:val="single" w:color="CCCCCC" w:sz="1"/>
+              <w:bottom w:val="single" w:color="CCCCCC" w:sz="1"/>
+              <w:right w:val="single" w:color="CCCCCC" w:sz="1"/>
+            </w:tcBorders>
+            <w:shd w:fill="EBF3FB" w:val="clear"/>
+            <w:tcMar>
+              <w:top w:type="dxa" w:w="80"/>
+              <w:left w:type="dxa" w:w="120"/>
+              <w:bottom w:type="dxa" w:w="80"/>
+              <w:right w:type="dxa" w:w="120"/>
+            </w:tcMar>
+          </w:tcPr>
+          <w:p>
+            <w:r>
+              <w:rPr>
+                <w:rFonts w:ascii="Arial" w:cs="Arial" w:eastAsia="Arial" w:hAnsi="Arial"/>
+                <w:sz w:val="20"/>
+                <w:szCs w:val="20"/>
+              </w:rPr>
+              <w:t xml:space="preserve">Revisar umbral de clasificacion o reentrenar</w:t>
+            </w:r>
+          </w:p>
+        </w:tc>
+      </w:tr>
+      <w:tr>
+        <w:tc>
+          <w:tcPr>
+            <w:tcW w:type="dxa" w:w="3000"/>
+            <w:tcBorders>
+              <w:top w:val="single" w:color="CCCCCC" w:sz="1"/>
+              <w:left w:val="single" w:color="CCCCCC" w:sz="1"/>
+              <w:bottom w:val="single" w:color="CCCCCC" w:sz="1"/>
+              <w:right w:val="single" w:color="CCCCCC" w:sz="1"/>
+            </w:tcBorders>
+            <w:shd w:fill="FFFFFF" w:val="clear"/>
+            <w:tcMar>
+              <w:top w:type="dxa" w:w="80"/>
+              <w:left w:type="dxa" w:w="120"/>
+              <w:bottom w:type="dxa" w:w="80"/>
+              <w:right w:type="dxa" w:w="120"/>
+            </w:tcMar>
+          </w:tcPr>
+          <w:p>
+            <w:r>
+              <w:rPr>
+                <w:rFonts w:ascii="Arial" w:cs="Arial" w:eastAsia="Arial" w:hAnsi="Arial"/>
+                <w:sz w:val="20"/>
+                <w:szCs w:val="20"/>
+              </w:rPr>
+              <w:t xml:space="preserve">Latencia p95 &gt; 500ms</w:t>
+            </w:r>
+          </w:p>
+        </w:tc>
+        <w:tc>
+          <w:tcPr>
+            <w:tcW w:type="dxa" w:w="3000"/>
+            <w:tcBorders>
+              <w:top w:val="single" w:color="CCCCCC" w:sz="1"/>
+              <w:left w:val="single" w:color="CCCCCC" w:sz="1"/>
+              <w:bottom w:val="single" w:color="CCCCCC" w:sz="1"/>
+              <w:right w:val="single" w:color="CCCCCC" w:sz="1"/>
+            </w:tcBorders>
+            <w:shd w:fill="FFFFFF" w:val="clear"/>
+            <w:tcMar>
+              <w:top w:type="dxa" w:w="80"/>
+              <w:left w:type="dxa" w:w="120"/>
+              <w:bottom w:type="dxa" w:w="80"/>
+              <w:right w:type="dxa" w:w="120"/>
+            </w:tcMar>
+          </w:tcPr>
+          <w:p>
+            <w:r>
+              <w:rPr>
+                <w:rFonts w:ascii="Arial" w:cs="Arial" w:eastAsia="Arial" w:hAnsi="Arial"/>
+                <w:sz w:val="20"/>
+                <w:szCs w:val="20"/>
+              </w:rPr>
+              <w:t xml:space="preserve">Prometheus / Grafana</w:t>
+            </w:r>
+          </w:p>
+        </w:tc>
+        <w:tc>
+          <w:tcPr>
+            <w:tcW w:type="dxa" w:w="3360"/>
+            <w:tcBorders>
+              <w:top w:val="single" w:color="CCCCCC" w:sz="1"/>
+              <w:left w:val="single" w:color="CCCCCC" w:sz="1"/>
+              <w:bottom w:val="single" w:color="CCCCCC" w:sz="1"/>
+              <w:right w:val="single" w:color="CCCCCC" w:sz="1"/>
+            </w:tcBorders>
+            <w:shd w:fill="FFFFFF" w:val="clear"/>
+            <w:tcMar>
+              <w:top w:type="dxa" w:w="80"/>
+              <w:left w:type="dxa" w:w="120"/>
+              <w:bottom w:type="dxa" w:w="80"/>
+              <w:right w:type="dxa" w:w="120"/>
+            </w:tcMar>
+          </w:tcPr>
+          <w:p>
+            <w:r>
+              <w:rPr>
+                <w:rFonts w:ascii="Arial" w:cs="Arial" w:eastAsia="Arial" w:hAnsi="Arial"/>
+                <w:sz w:val="20"/>
+                <w:szCs w:val="20"/>
+              </w:rPr>
+              <w:t xml:space="preserve">Optimizar pipeline de inferencia</w:t>
+            </w:r>
+          </w:p>
+        </w:tc>
+      </w:tr>
+      <w:tr>
+        <w:tc>
+          <w:tcPr>
+            <w:tcW w:type="dxa" w:w="3000"/>
+            <w:tcBorders>
+              <w:top w:val="single" w:color="CCCCCC" w:sz="1"/>
+              <w:left w:val="single" w:color="CCCCCC" w:sz="1"/>
+              <w:bottom w:val="single" w:color="CCCCCC" w:sz="1"/>
+              <w:right w:val="single" w:color="CCCCCC" w:sz="1"/>
+            </w:tcBorders>
+            <w:shd w:fill="EBF3FB" w:val="clear"/>
+            <w:tcMar>
+              <w:top w:type="dxa" w:w="80"/>
+              <w:left w:type="dxa" w:w="120"/>
+              <w:bottom w:type="dxa" w:w="80"/>
+              <w:right w:type="dxa" w:w="120"/>
+            </w:tcMar>
+          </w:tcPr>
+          <w:p>
+            <w:r>
+              <w:rPr>
+                <w:rFonts w:ascii="Arial" w:cs="Arial" w:eastAsia="Arial" w:hAnsi="Arial"/>
+                <w:sz w:val="20"/>
+                <w:szCs w:val="20"/>
+              </w:rPr>
+              <w:t xml:space="preserve">Tasa de errores 500 &gt; 1%</w:t>
+            </w:r>
+          </w:p>
+        </w:tc>
+        <w:tc>
+          <w:tcPr>
+            <w:tcW w:type="dxa" w:w="3000"/>
+            <w:tcBorders>
+              <w:top w:val="single" w:color="CCCCCC" w:sz="1"/>
+              <w:left w:val="single" w:color="CCCCCC" w:sz="1"/>
+              <w:bottom w:val="single" w:color="CCCCCC" w:sz="1"/>
+              <w:right w:val="single" w:color="CCCCCC" w:sz="1"/>
+            </w:tcBorders>
+            <w:shd w:fill="EBF3FB" w:val="clear"/>
+            <w:tcMar>
+              <w:top w:type="dxa" w:w="80"/>
+              <w:left w:type="dxa" w:w="120"/>
+              <w:bottom w:type="dxa" w:w="80"/>
+              <w:right w:type="dxa" w:w="120"/>
+            </w:tcMar>
+          </w:tcPr>
+          <w:p>
+            <w:r>
+              <w:rPr>
+                <w:rFonts w:ascii="Arial" w:cs="Arial" w:eastAsia="Arial" w:hAnsi="Arial"/>
+                <w:sz w:val="20"/>
+                <w:szCs w:val="20"/>
+              </w:rPr>
+              <w:t xml:space="preserve">Prometheus / Grafana</w:t>
+            </w:r>
+          </w:p>
+        </w:tc>
+        <w:tc>
+          <w:tcPr>
+            <w:tcW w:type="dxa" w:w="3360"/>
+            <w:tcBorders>
+              <w:top w:val="single" w:color="CCCCCC" w:sz="1"/>
+              <w:left w:val="single" w:color="CCCCCC" w:sz="1"/>
+              <w:bottom w:val="single" w:color="CCCCCC" w:sz="1"/>
+              <w:right w:val="single" w:color="CCCCCC" w:sz="1"/>
+            </w:tcBorders>
+            <w:shd w:fill="EBF3FB" w:val="clear"/>
+            <w:tcMar>
+              <w:top w:type="dxa" w:w="80"/>
+              <w:left w:type="dxa" w:w="120"/>
+              <w:bottom w:type="dxa" w:w="80"/>
+              <w:right w:type="dxa" w:w="120"/>
+            </w:tcMar>
+          </w:tcPr>
+          <w:p>
+            <w:r>
+              <w:rPr>
+                <w:rFonts w:ascii="Arial" w:cs="Arial" w:eastAsia="Arial" w:hAnsi="Arial"/>
+                <w:sz w:val="20"/>
+                <w:szCs w:val="20"/>
+              </w:rPr>
+              <w:t xml:space="preserve">Revisar logs de la API y artefactos</w:t>
+            </w:r>
+          </w:p>
+        </w:tc>
+      </w:tr>
+      <w:tr>
+        <w:tc>
+          <w:tcPr>
+            <w:tcW w:type="dxa" w:w="3000"/>
+            <w:tcBorders>
+              <w:top w:val="single" w:color="CCCCCC" w:sz="1"/>
+              <w:left w:val="single" w:color="CCCCCC" w:sz="1"/>
+              <w:bottom w:val="single" w:color="CCCCCC" w:sz="1"/>
+              <w:right w:val="single" w:color="CCCCCC" w:sz="1"/>
+            </w:tcBorders>
+            <w:shd w:fill="FFFFFF" w:val="clear"/>
+            <w:tcMar>
+              <w:top w:type="dxa" w:w="80"/>
+              <w:left w:type="dxa" w:w="120"/>
+              <w:bottom w:type="dxa" w:w="80"/>
+              <w:right w:type="dxa" w:w="120"/>
+            </w:tcMar>
+          </w:tcPr>
+          <w:p>
+            <w:r>
+              <w:rPr>
+                <w:rFonts w:ascii="Arial" w:cs="Arial" w:eastAsia="Arial" w:hAnsi="Arial"/>
+                <w:sz w:val="20"/>
+                <w:szCs w:val="20"/>
+              </w:rPr>
+              <w:t xml:space="preserve">Proporcion churn &gt; 50%</w:t>
+            </w:r>
+          </w:p>
+        </w:tc>
+        <w:tc>
+          <w:tcPr>
+            <w:tcW w:type="dxa" w:w="3000"/>
+            <w:tcBorders>
+              <w:top w:val="single" w:color="CCCCCC" w:sz="1"/>
+              <w:left w:val="single" w:color="CCCCCC" w:sz="1"/>
+              <w:bottom w:val="single" w:color="CCCCCC" w:sz="1"/>
+              <w:right w:val="single" w:color="CCCCCC" w:sz="1"/>
+            </w:tcBorders>
+            <w:shd w:fill="FFFFFF" w:val="clear"/>
+            <w:tcMar>
+              <w:top w:type="dxa" w:w="80"/>
+              <w:left w:type="dxa" w:w="120"/>
+              <w:bottom w:type="dxa" w:w="80"/>
+              <w:right w:type="dxa" w:w="120"/>
+            </w:tcMar>
+          </w:tcPr>
+          <w:p>
+            <w:r>
+              <w:rPr>
+                <w:rFonts w:ascii="Arial" w:cs="Arial" w:eastAsia="Arial" w:hAnsi="Arial"/>
+                <w:sz w:val="20"/>
+                <w:szCs w:val="20"/>
+              </w:rPr>
+              <w:t xml:space="preserve">Prometheus / Grafana</w:t>
+            </w:r>
+          </w:p>
+        </w:tc>
+        <w:tc>
+          <w:tcPr>
+            <w:tcW w:type="dxa" w:w="3360"/>
+            <w:tcBorders>
+              <w:top w:val="single" w:color="CCCCCC" w:sz="1"/>
+              <w:left w:val="single" w:color="CCCCCC" w:sz="1"/>
+              <w:bottom w:val="single" w:color="CCCCCC" w:sz="1"/>
+              <w:right w:val="single" w:color="CCCCCC" w:sz="1"/>
+            </w:tcBorders>
+            <w:shd w:fill="FFFFFF" w:val="clear"/>
+            <w:tcMar>
+              <w:top w:type="dxa" w:w="80"/>
+              <w:left w:type="dxa" w:w="120"/>
+              <w:bottom w:type="dxa" w:w="80"/>
+              <w:right w:type="dxa" w:w="120"/>
+            </w:tcMar>
+          </w:tcPr>
+          <w:p>
+            <w:r>
+              <w:rPr>
+                <w:rFonts w:ascii="Arial" w:cs="Arial" w:eastAsia="Arial" w:hAnsi="Arial"/>
+                <w:sz w:val="20"/>
+                <w:szCs w:val="20"/>
+              </w:rPr>
+              <w:t xml:space="preserve">Alerta de negocio — revisar campanas de retencion</w:t>
+            </w:r>
+          </w:p>
+        </w:tc>
+      </w:tr>
+      <w:tr>
+        <w:tc>
+          <w:tcPr>
+            <w:tcW w:type="dxa" w:w="3000"/>
+            <w:tcBorders>
+              <w:top w:val="single" w:color="CCCCCC" w:sz="1"/>
+              <w:left w:val="single" w:color="CCCCCC" w:sz="1"/>
+              <w:bottom w:val="single" w:color="CCCCCC" w:sz="1"/>
+              <w:right w:val="single" w:color="CCCCCC" w:sz="1"/>
+            </w:tcBorders>
+            <w:shd w:fill="EBF3FB" w:val="clear"/>
+            <w:tcMar>
+              <w:top w:type="dxa" w:w="80"/>
+              <w:left w:type="dxa" w:w="120"/>
+              <w:bottom w:type="dxa" w:w="80"/>
+              <w:right w:type="dxa" w:w="120"/>
+            </w:tcMar>
+          </w:tcPr>
+          <w:p>
+            <w:r>
+              <w:rPr>
+                <w:rFonts w:ascii="Arial" w:cs="Arial" w:eastAsia="Arial" w:hAnsi="Arial"/>
+                <w:sz w:val="20"/>
+                <w:szCs w:val="20"/>
+              </w:rPr>
+              <w:t xml:space="preserve">Health check falla</w:t>
+            </w:r>
+          </w:p>
+        </w:tc>
+        <w:tc>
+          <w:tcPr>
+            <w:tcW w:type="dxa" w:w="3000"/>
+            <w:tcBorders>
+              <w:top w:val="single" w:color="CCCCCC" w:sz="1"/>
+              <w:left w:val="single" w:color="CCCCCC" w:sz="1"/>
+              <w:bottom w:val="single" w:color="CCCCCC" w:sz="1"/>
+              <w:right w:val="single" w:color="CCCCCC" w:sz="1"/>
+            </w:tcBorders>
+            <w:shd w:fill="EBF3FB" w:val="clear"/>
+            <w:tcMar>
+              <w:top w:type="dxa" w:w="80"/>
+              <w:left w:type="dxa" w:w="120"/>
+              <w:bottom w:type="dxa" w:w="80"/>
+              <w:right w:type="dxa" w:w="120"/>
+            </w:tcMar>
+          </w:tcPr>
+          <w:p>
+            <w:r>
+              <w:rPr>
+                <w:rFonts w:ascii="Arial" w:cs="Arial" w:eastAsia="Arial" w:hAnsi="Arial"/>
+                <w:sz w:val="20"/>
+                <w:szCs w:val="20"/>
+              </w:rPr>
+              <w:t xml:space="preserve">Docker Compose</w:t>
+            </w:r>
+          </w:p>
+        </w:tc>
+        <w:tc>
+          <w:tcPr>
+            <w:tcW w:type="dxa" w:w="3360"/>
+            <w:tcBorders>
+              <w:top w:val="single" w:color="CCCCCC" w:sz="1"/>
+              <w:left w:val="single" w:color="CCCCCC" w:sz="1"/>
+              <w:bottom w:val="single" w:color="CCCCCC" w:sz="1"/>
+              <w:right w:val="single" w:color="CCCCCC" w:sz="1"/>
+            </w:tcBorders>
+            <w:shd w:fill="EBF3FB" w:val="clear"/>
+            <w:tcMar>
+              <w:top w:type="dxa" w:w="80"/>
+              <w:left w:type="dxa" w:w="120"/>
+              <w:bottom w:type="dxa" w:w="80"/>
+              <w:right w:type="dxa" w:w="120"/>
+            </w:tcMar>
+          </w:tcPr>
+          <w:p>
+            <w:r>
+              <w:rPr>
+                <w:rFonts w:ascii="Arial" w:cs="Arial" w:eastAsia="Arial" w:hAnsi="Arial"/>
+                <w:sz w:val="20"/>
+                <w:szCs w:val="20"/>
+              </w:rPr>
+              <w:t xml:space="preserve">Reiniciar contenedor y verificar modelos</w:t>
+            </w:r>
+          </w:p>
+        </w:tc>
+      </w:tr>
+    </w:tbl>
+    <w:p>
+      <w:pPr>
+        <w:pBdr>
+          <w:bottom w:val="single" w:color="2E75B6" w:sz="4" w:space="1"/>
+        </w:pBdr>
+        <w:spacing w:after="160" w:before="160"/>
+      </w:pPr>
+    </w:p>
+    <w:p>
+      <w:pPr>
+        <w:pStyle w:val="Heading1"/>
+        <w:spacing w:after="200" w:before="300"/>
+      </w:pPr>
+      <w:r>
+        <w:rPr>
+          <w:rFonts w:ascii="Arial" w:cs="Arial" w:eastAsia="Arial" w:hAnsi="Arial"/>
+          <w:b/>
+          <w:bCs/>
+          <w:sz w:val="32"/>
+          <w:szCs w:val="32"/>
+        </w:rPr>
+        <w:t xml:space="preserve">6. Pruebas Automaticas</w:t>
+      </w:r>
+    </w:p>
+    <w:p>
+      <w:pPr>
+        <w:spacing w:after="80" w:before="80"/>
+      </w:pPr>
+      <w:r>
+        <w:rPr>
+          <w:rFonts w:ascii="Arial" w:cs="Arial" w:eastAsia="Arial" w:hAnsi="Arial"/>
+          <w:sz w:val="22"/>
+          <w:szCs w:val="22"/>
+        </w:rPr>
+        <w:t xml:space="preserve">12 pruebas con pytest — resultado: 12 passed, 0 failed.</w:t>
       </w:r>
     </w:p>
     <w:p>
@@ -3071,7 +3526,7 @@
                 <w:sz w:val="20"/>
                 <w:szCs w:val="20"/>
               </w:rPr>
-              <w:t xml:space="preserve">Edad menor a 18 devuelve 422</w:t>
+              <w:t xml:space="preserve">Edad &lt; 18 devuelve 422</w:t>
             </w:r>
           </w:p>
         </w:tc>
@@ -3129,7 +3584,7 @@
                 <w:sz w:val="20"/>
                 <w:szCs w:val="20"/>
               </w:rPr>
-              <w:t xml:space="preserve">monthly_charge negativo devuelve 422</w:t>
+              <w:t xml:space="preserve">Valor negativo devuelve 422</w:t>
             </w:r>
           </w:p>
         </w:tc>
@@ -3309,39 +3764,6 @@
         </w:tc>
       </w:tr>
     </w:tbl>
-    <w:p>
-      <w:pPr>
-        <w:spacing w:after="0" w:before="160"/>
-      </w:pPr>
-    </w:p>
-    <w:p>
-      <w:pPr>
-        <w:spacing w:after="80" w:before="80"/>
-      </w:pPr>
-      <w:r>
-        <w:rPr>
-          <w:rFonts w:ascii="Arial" w:cs="Arial" w:eastAsia="Arial" w:hAnsi="Arial"/>
-          <w:sz w:val="22"/>
-          <w:szCs w:val="22"/>
-        </w:rPr>
-        <w:t xml:space="preserve">Resultado obtenido: 12 passed, 0 failed.</w:t>
-      </w:r>
-    </w:p>
-    <w:p>
-      <w:pPr>
-        <w:shd w:fill="F0F0F0" w:val="clear"/>
-        <w:spacing w:after="60" w:before="60"/>
-        <w:ind w:left="360"/>
-      </w:pPr>
-      <w:r>
-        <w:rPr>
-          <w:rFonts w:ascii="Courier New" w:cs="Courier New" w:eastAsia="Courier New" w:hAnsi="Courier New"/>
-          <w:sz w:val="20"/>
-          <w:szCs w:val="20"/>
-        </w:rPr>
-        <w:t xml:space="preserve">pytest tests/test_api.py -v</w:t>
-      </w:r>
-    </w:p>
     <w:p>
       <w:pPr>
         <w:pBdr>
@@ -3363,7 +3785,7 @@
           <w:sz w:val="32"/>
           <w:szCs w:val="32"/>
         </w:rPr>
-        <w:t xml:space="preserve">6. Instrucciones de Levantamiento</w:t>
+        <w:t xml:space="preserve">7. Instrucciones de Levantamiento</w:t>
       </w:r>
     </w:p>
     <w:p>
@@ -3379,7 +3801,7 @@
           <w:sz w:val="26"/>
           <w:szCs w:val="26"/>
         </w:rPr>
-        <w:t xml:space="preserve">Requisitos previos</w:t>
+        <w:t xml:space="preserve">Requisitos</w:t>
       </w:r>
     </w:p>
     <w:p>
@@ -3397,7 +3819,7 @@
           <w:sz w:val="22"/>
           <w:szCs w:val="22"/>
         </w:rPr>
-        <w:t xml:space="preserve">Anaconda o Miniconda instalado</w:t>
+        <w:t xml:space="preserve">Anaconda o Miniconda, Git, Docker Desktop</w:t>
       </w:r>
     </w:p>
     <w:p>
@@ -3415,7 +3837,221 @@
           <w:sz w:val="22"/>
           <w:szCs w:val="22"/>
         </w:rPr>
-        <w:t xml:space="preserve">Git instalado</w:t>
+        <w:t xml:space="preserve">Cuenta gratuita en DagsHub con token generado</w:t>
+      </w:r>
+    </w:p>
+    <w:p>
+      <w:pPr>
+        <w:spacing w:after="0" w:before="160"/>
+      </w:pPr>
+    </w:p>
+    <w:p>
+      <w:pPr>
+        <w:pStyle w:val="Heading2"/>
+        <w:spacing w:after="120" w:before="240"/>
+      </w:pPr>
+      <w:r>
+        <w:rPr>
+          <w:rFonts w:ascii="Arial" w:cs="Arial" w:eastAsia="Arial" w:hAnsi="Arial"/>
+          <w:b/>
+          <w:bCs/>
+          <w:sz w:val="26"/>
+          <w:szCs w:val="26"/>
+        </w:rPr>
+        <w:t xml:space="preserve">Despliegue completo</w:t>
+      </w:r>
+    </w:p>
+    <w:p>
+      <w:pPr>
+        <w:shd w:fill="F0F0F0" w:val="clear"/>
+        <w:spacing w:after="60" w:before="60"/>
+        <w:ind w:left="360"/>
+      </w:pPr>
+      <w:r>
+        <w:rPr>
+          <w:rFonts w:ascii="Courier New" w:cs="Courier New" w:eastAsia="Courier New" w:hAnsi="Courier New"/>
+          <w:sz w:val="20"/>
+          <w:szCs w:val="20"/>
+        </w:rPr>
+        <w:t xml:space="preserve">git clone https://github.com/Nicosala96/Proyecto-Lab.-Mineria-de-datos</w:t>
+      </w:r>
+    </w:p>
+    <w:p>
+      <w:pPr>
+        <w:shd w:fill="F0F0F0" w:val="clear"/>
+        <w:spacing w:after="60" w:before="60"/>
+        <w:ind w:left="360"/>
+      </w:pPr>
+      <w:r>
+        <w:rPr>
+          <w:rFonts w:ascii="Courier New" w:cs="Courier New" w:eastAsia="Courier New" w:hAnsi="Courier New"/>
+          <w:sz w:val="20"/>
+          <w:szCs w:val="20"/>
+        </w:rPr>
+        <w:t xml:space="preserve">conda create -n andeslink-churn python=3.13 &amp;&amp; conda activate andeslink-churn</w:t>
+      </w:r>
+    </w:p>
+    <w:p>
+      <w:pPr>
+        <w:shd w:fill="F0F0F0" w:val="clear"/>
+        <w:spacing w:after="60" w:before="60"/>
+        <w:ind w:left="360"/>
+      </w:pPr>
+      <w:r>
+        <w:rPr>
+          <w:rFonts w:ascii="Courier New" w:cs="Courier New" w:eastAsia="Courier New" w:hAnsi="Courier New"/>
+          <w:sz w:val="20"/>
+          <w:szCs w:val="20"/>
+        </w:rPr>
+        <w:t xml:space="preserve">pip install -r requirements.txt &amp;&amp; pip install "dvc[http]" mlflow jupyter jupyterlab</w:t>
+      </w:r>
+    </w:p>
+    <w:p>
+      <w:pPr>
+        <w:shd w:fill="F0F0F0" w:val="clear"/>
+        <w:spacing w:after="60" w:before="60"/>
+        <w:ind w:left="360"/>
+      </w:pPr>
+      <w:r>
+        <w:rPr>
+          <w:rFonts w:ascii="Courier New" w:cs="Courier New" w:eastAsia="Courier New" w:hAnsi="Courier New"/>
+          <w:sz w:val="20"/>
+          <w:szCs w:val="20"/>
+        </w:rPr>
+        <w:t xml:space="preserve">pip install "numpy==1.26.4" --only-binary=numpy &amp;&amp; pip install evidently==0.4.33</w:t>
+      </w:r>
+    </w:p>
+    <w:p>
+      <w:pPr>
+        <w:shd w:fill="F0F0F0" w:val="clear"/>
+        <w:spacing w:after="60" w:before="60"/>
+        <w:ind w:left="360"/>
+      </w:pPr>
+      <w:r>
+        <w:rPr>
+          <w:rFonts w:ascii="Courier New" w:cs="Courier New" w:eastAsia="Courier New" w:hAnsi="Courier New"/>
+          <w:sz w:val="20"/>
+          <w:szCs w:val="20"/>
+        </w:rPr>
+        <w:t xml:space="preserve">dvc remote modify --local origin auth basic</w:t>
+      </w:r>
+    </w:p>
+    <w:p>
+      <w:pPr>
+        <w:shd w:fill="F0F0F0" w:val="clear"/>
+        <w:spacing w:after="60" w:before="60"/>
+        <w:ind w:left="360"/>
+      </w:pPr>
+      <w:r>
+        <w:rPr>
+          <w:rFonts w:ascii="Courier New" w:cs="Courier New" w:eastAsia="Courier New" w:hAnsi="Courier New"/>
+          <w:sz w:val="20"/>
+          <w:szCs w:val="20"/>
+        </w:rPr>
+        <w:t xml:space="preserve">dvc remote modify --local origin user TU_USUARIO &amp;&amp; dvc remote modify --local origin password TU_TOKEN</w:t>
+      </w:r>
+    </w:p>
+    <w:p>
+      <w:pPr>
+        <w:shd w:fill="F0F0F0" w:val="clear"/>
+        <w:spacing w:after="60" w:before="60"/>
+        <w:ind w:left="360"/>
+      </w:pPr>
+      <w:r>
+        <w:rPr>
+          <w:rFonts w:ascii="Courier New" w:cs="Courier New" w:eastAsia="Courier New" w:hAnsi="Courier New"/>
+          <w:sz w:val="20"/>
+          <w:szCs w:val="20"/>
+        </w:rPr>
+        <w:t xml:space="preserve">dvc pull</w:t>
+      </w:r>
+    </w:p>
+    <w:p>
+      <w:pPr>
+        <w:shd w:fill="F0F0F0" w:val="clear"/>
+        <w:spacing w:after="60" w:before="60"/>
+        <w:ind w:left="360"/>
+      </w:pPr>
+      <w:r>
+        <w:rPr>
+          <w:rFonts w:ascii="Courier New" w:cs="Courier New" w:eastAsia="Courier New" w:hAnsi="Courier New"/>
+          <w:sz w:val="20"/>
+          <w:szCs w:val="20"/>
+        </w:rPr>
+        <w:t xml:space="preserve">docker-compose up --build</w:t>
+      </w:r>
+    </w:p>
+    <w:p>
+      <w:pPr>
+        <w:spacing w:after="0" w:before="160"/>
+      </w:pPr>
+    </w:p>
+    <w:p>
+      <w:pPr>
+        <w:pStyle w:val="Heading2"/>
+        <w:spacing w:after="120" w:before="240"/>
+      </w:pPr>
+      <w:r>
+        <w:rPr>
+          <w:rFonts w:ascii="Arial" w:cs="Arial" w:eastAsia="Arial" w:hAnsi="Arial"/>
+          <w:b/>
+          <w:bCs/>
+          <w:sz w:val="26"/>
+          <w:szCs w:val="26"/>
+        </w:rPr>
+        <w:t xml:space="preserve">Monitoreo de datos (offline)</w:t>
+      </w:r>
+    </w:p>
+    <w:p>
+      <w:pPr>
+        <w:shd w:fill="F0F0F0" w:val="clear"/>
+        <w:spacing w:after="60" w:before="60"/>
+        <w:ind w:left="360"/>
+      </w:pPr>
+      <w:r>
+        <w:rPr>
+          <w:rFonts w:ascii="Courier New" w:cs="Courier New" w:eastAsia="Courier New" w:hAnsi="Courier New"/>
+          <w:sz w:val="20"/>
+          <w:szCs w:val="20"/>
+        </w:rPr>
+        <w:t xml:space="preserve">cd src &amp;&amp; python monitoreo_evidently.py</w:t>
+      </w:r>
+    </w:p>
+    <w:p>
+      <w:pPr>
+        <w:spacing w:after="80" w:before="80"/>
+      </w:pPr>
+      <w:r>
+        <w:rPr>
+          <w:rFonts w:ascii="Arial" w:cs="Arial" w:eastAsia="Arial" w:hAnsi="Arial"/>
+          <w:sz w:val="22"/>
+          <w:szCs w:val="22"/>
+        </w:rPr>
+        <w:t xml:space="preserve">Los reportes se guardan en reports/reporte_drift.html y reports/reporte_clasificacion.html</w:t>
+      </w:r>
+    </w:p>
+    <w:p>
+      <w:pPr>
+        <w:pBdr>
+          <w:bottom w:val="single" w:color="2E75B6" w:sz="4" w:space="1"/>
+        </w:pBdr>
+        <w:spacing w:after="160" w:before="160"/>
+      </w:pPr>
+    </w:p>
+    <w:p>
+      <w:pPr>
+        <w:pStyle w:val="Heading1"/>
+        <w:spacing w:after="200" w:before="300"/>
+      </w:pPr>
+      <w:r>
+        <w:rPr>
+          <w:rFonts w:ascii="Arial" w:cs="Arial" w:eastAsia="Arial" w:hAnsi="Arial"/>
+          <w:b/>
+          <w:bCs/>
+          <w:sz w:val="32"/>
+          <w:szCs w:val="32"/>
+        </w:rPr>
+        <w:t xml:space="preserve">8. Decisiones Tecnicas</w:t>
       </w:r>
     </w:p>
     <w:p>
@@ -3433,7 +4069,7 @@
           <w:sz w:val="22"/>
           <w:szCs w:val="22"/>
         </w:rPr>
-        <w:t xml:space="preserve">Docker Desktop instalado y corriendo</w:t>
+        <w:t xml:space="preserve">Prometheus con prometheus-fastapi-instrumentator: instrumentacion automatica de metricas HTTP con metricas de negocio adicionales (predicciones, probabilidades, latencia de inferencia).</w:t>
       </w:r>
     </w:p>
     <w:p>
@@ -3451,28 +4087,7 @@
           <w:sz w:val="22"/>
           <w:szCs w:val="22"/>
         </w:rPr>
-        <w:t xml:space="preserve">Cuenta gratuita en DagsHub con token generado en dagshub.com/user/settings/tokens</w:t>
-      </w:r>
-    </w:p>
-    <w:p>
-      <w:pPr>
-        <w:spacing w:after="0" w:before="160"/>
-      </w:pPr>
-    </w:p>
-    <w:p>
-      <w:pPr>
-        <w:pStyle w:val="Heading2"/>
-        <w:spacing w:after="120" w:before="240"/>
-      </w:pPr>
-      <w:r>
-        <w:rPr>
-          <w:rFonts w:ascii="Arial" w:cs="Arial" w:eastAsia="Arial" w:hAnsi="Arial"/>
-          <w:b/>
-          <w:bCs/>
-          <w:sz w:val="26"/>
-          <w:szCs w:val="26"/>
-        </w:rPr>
-        <w:t xml:space="preserve">Opcion A — Docker (recomendado)</w:t>
+        <w:t xml:space="preserve">Grafana con provisioning automatico: el dashboard se configura automaticamente al levantar Docker, sin necesidad de configuracion manual.</w:t>
       </w:r>
     </w:p>
     <w:p>
@@ -3490,7 +4105,7 @@
           <w:sz w:val="22"/>
           <w:szCs w:val="22"/>
         </w:rPr>
-        <w:t xml:space="preserve">Clonar: git clone https://github.com/Nicosala96/Proyecto-Lab.-Mineria-de-datos</w:t>
+        <w:t xml:space="preserve">Evidently offline: el monitoreo de datos corre como script independiente sobre datos historicos, separado del flujo de inferencia en tiempo real.</w:t>
       </w:r>
     </w:p>
     <w:p>
@@ -3508,7 +4123,7 @@
           <w:sz w:val="22"/>
           <w:szCs w:val="22"/>
         </w:rPr>
-        <w:t xml:space="preserve">Crear entorno: conda create -n andeslink-churn python=3.13 &amp;&amp; conda activate andeslink-churn</w:t>
+        <w:t xml:space="preserve">Drift simulado: se induce drift en monthly_charge y support_tickets para demostrar la capacidad de deteccion de Evidently en un entorno academico sin datos de produccion reales.</w:t>
       </w:r>
     </w:p>
     <w:p>
@@ -3526,7 +4141,7 @@
           <w:sz w:val="22"/>
           <w:szCs w:val="22"/>
         </w:rPr>
-        <w:t xml:space="preserve">Instalar: pip install -r requirements.txt &amp;&amp; pip install "dvc[http]" mlflow jupyter jupyterlab</w:t>
+        <w:t xml:space="preserve">Healthcheck apunta a /health: Docker Compose verifica que los modelos esten cargados antes de levantar la GUI.</w:t>
       </w:r>
     </w:p>
     <w:p>
@@ -3544,7 +4159,31 @@
           <w:sz w:val="22"/>
           <w:szCs w:val="22"/>
         </w:rPr>
-        <w:t xml:space="preserve">Configurar DVC con token de DagsHub (dvc remote modify --local origin ...)</w:t>
+        <w:t xml:space="preserve">DagsHub como remote DVC: permite reproducibilidad sin configuracion de credenciales compleja, con autenticacion por token gratuita.</w:t>
+      </w:r>
+    </w:p>
+    <w:p>
+      <w:pPr>
+        <w:pBdr>
+          <w:bottom w:val="single" w:color="2E75B6" w:sz="4" w:space="1"/>
+        </w:pBdr>
+        <w:spacing w:after="160" w:before="160"/>
+      </w:pPr>
+    </w:p>
+    <w:p>
+      <w:pPr>
+        <w:pStyle w:val="Heading1"/>
+        <w:spacing w:after="200" w:before="300"/>
+      </w:pPr>
+      <w:r>
+        <w:rPr>
+          <w:rFonts w:ascii="Arial" w:cs="Arial" w:eastAsia="Arial" w:hAnsi="Arial"/>
+          <w:b/>
+          <w:bCs/>
+          <w:sz w:val="32"/>
+          <w:szCs w:val="32"/>
+        </w:rPr>
+        <w:t xml:space="preserve">9. Limitaciones Conocidas</w:t>
       </w:r>
     </w:p>
     <w:p>
@@ -3562,7 +4201,7 @@
           <w:sz w:val="22"/>
           <w:szCs w:val="22"/>
         </w:rPr>
-        <w:t xml:space="preserve">OBLIGATORIO antes del build: dvc pull</w:t>
+        <w:t xml:space="preserve">El monitoreo de drift es offline y simulado. En produccion real se necesitaria loguear las inferencias y compararlas con datos de referencia periodicamente.</w:t>
       </w:r>
     </w:p>
     <w:p>
@@ -3580,7 +4219,7 @@
           <w:sz w:val="22"/>
           <w:szCs w:val="22"/>
         </w:rPr>
-        <w:t xml:space="preserve">Levantar: docker-compose up --build</w:t>
+        <w:t xml:space="preserve">El dvc pull requiere token de DagsHub por colaborador. No hay acceso completamente publico a los artefactos.</w:t>
       </w:r>
     </w:p>
     <w:p>
@@ -3598,7 +4237,7 @@
           <w:sz w:val="22"/>
           <w:szCs w:val="22"/>
         </w:rPr>
-        <w:t xml:space="preserve">GUI en http://localhost:8501  |  API en http://localhost:8000/docs  |  Health en http://localhost:8000/health</w:t>
+        <w:t xml:space="preserve">No hay autenticacion en la API. En produccion se requeriria al menos una API key.</w:t>
       </w:r>
     </w:p>
     <w:p>
@@ -3616,28 +4255,7 @@
           <w:sz w:val="22"/>
           <w:szCs w:val="22"/>
         </w:rPr>
-        <w:t xml:space="preserve">Detener: docker-compose down</w:t>
-      </w:r>
-    </w:p>
-    <w:p>
-      <w:pPr>
-        <w:spacing w:after="0" w:before="160"/>
-      </w:pPr>
-    </w:p>
-    <w:p>
-      <w:pPr>
-        <w:pStyle w:val="Heading2"/>
-        <w:spacing w:after="120" w:before="240"/>
-      </w:pPr>
-      <w:r>
-        <w:rPr>
-          <w:rFonts w:ascii="Arial" w:cs="Arial" w:eastAsia="Arial" w:hAnsi="Arial"/>
-          <w:b/>
-          <w:bCs/>
-          <w:sz w:val="26"/>
-          <w:szCs w:val="26"/>
-        </w:rPr>
-        <w:t xml:space="preserve">Opcion B — Local con conda</w:t>
+        <w:t xml:space="preserve">Grafana usa credenciales por defecto (admin/admin). En produccion se deberian cambiar.</w:t>
       </w:r>
     </w:p>
     <w:p>
@@ -3655,307 +4273,7 @@
           <w:sz w:val="22"/>
           <w:szCs w:val="22"/>
         </w:rPr>
-        <w:t xml:space="preserve">Seguir pasos 1 a 5 de Opcion A</w:t>
-      </w:r>
-    </w:p>
-    <w:p>
-      <w:pPr>
-        <w:pStyle w:val="ListParagraph"/>
-        <w:numPr>
-          <w:ilvl w:val="0"/>
-          <w:numId w:val="2"/>
-        </w:numPr>
-        <w:spacing w:after="60" w:before="60"/>
-      </w:pPr>
-      <w:r>
-        <w:rPr>
-          <w:rFonts w:ascii="Arial" w:cs="Arial" w:eastAsia="Arial" w:hAnsi="Arial"/>
-          <w:sz w:val="22"/>
-          <w:szCs w:val="22"/>
-        </w:rPr>
-        <w:t xml:space="preserve">Terminal 1 — API: cd src &amp;&amp; uvicorn api:app --reload</w:t>
-      </w:r>
-    </w:p>
-    <w:p>
-      <w:pPr>
-        <w:pStyle w:val="ListParagraph"/>
-        <w:numPr>
-          <w:ilvl w:val="0"/>
-          <w:numId w:val="2"/>
-        </w:numPr>
-        <w:spacing w:after="60" w:before="60"/>
-      </w:pPr>
-      <w:r>
-        <w:rPr>
-          <w:rFonts w:ascii="Arial" w:cs="Arial" w:eastAsia="Arial" w:hAnsi="Arial"/>
-          <w:sz w:val="22"/>
-          <w:szCs w:val="22"/>
-        </w:rPr>
-        <w:t xml:space="preserve">Terminal 2 — GUI: cd src &amp;&amp; streamlit run app.py</w:t>
-      </w:r>
-    </w:p>
-    <w:p>
-      <w:pPr>
-        <w:pBdr>
-          <w:bottom w:val="single" w:color="2E75B6" w:sz="4" w:space="1"/>
-        </w:pBdr>
-        <w:spacing w:after="160" w:before="160"/>
-      </w:pPr>
-    </w:p>
-    <w:p>
-      <w:pPr>
-        <w:pStyle w:val="Heading1"/>
-        <w:spacing w:after="200" w:before="300"/>
-      </w:pPr>
-      <w:r>
-        <w:rPr>
-          <w:rFonts w:ascii="Arial" w:cs="Arial" w:eastAsia="Arial" w:hAnsi="Arial"/>
-          <w:b/>
-          <w:bCs/>
-          <w:sz w:val="32"/>
-          <w:szCs w:val="32"/>
-        </w:rPr>
-        <w:t xml:space="preserve">7. Decisiones Tecnicas</w:t>
-      </w:r>
-    </w:p>
-    <w:p>
-      <w:pPr>
-        <w:pStyle w:val="ListParagraph"/>
-        <w:numPr>
-          <w:ilvl w:val="0"/>
-          <w:numId w:val="2"/>
-        </w:numPr>
-        <w:spacing w:after="60" w:before="60"/>
-      </w:pPr>
-      <w:r>
-        <w:rPr>
-          <w:rFonts w:ascii="Arial" w:cs="Arial" w:eastAsia="Arial" w:hAnsi="Arial"/>
-          <w:sz w:val="22"/>
-          <w:szCs w:val="22"/>
-        </w:rPr>
-        <w:t xml:space="preserve">Reentrenamiento del modelo v1.1.0: se incorporaron payment_method, internet_service y region al DataFrame de entrenamiento para corregir la inconsistencia entre el contrato de la API y las variables realmente usadas por el modelo.</w:t>
-      </w:r>
-    </w:p>
-    <w:p>
-      <w:pPr>
-        <w:pStyle w:val="ListParagraph"/>
-        <w:numPr>
-          <w:ilvl w:val="0"/>
-          <w:numId w:val="2"/>
-        </w:numPr>
-        <w:spacing w:after="60" w:before="60"/>
-      </w:pPr>
-      <w:r>
-        <w:rPr>
-          <w:rFonts w:ascii="Arial" w:cs="Arial" w:eastAsia="Arial" w:hAnsi="Arial"/>
-          <w:sz w:val="22"/>
-          <w:szCs w:val="22"/>
-        </w:rPr>
-        <w:t xml:space="preserve">Endpoint /health especifico: valida que cada artefacto esta cargado en memoria e informa su estado individualmente. El healthcheck de Docker Compose apunta a este endpoint en lugar de /.</w:t>
-      </w:r>
-    </w:p>
-    <w:p>
-      <w:pPr>
-        <w:pStyle w:val="ListParagraph"/>
-        <w:numPr>
-          <w:ilvl w:val="0"/>
-          <w:numId w:val="2"/>
-        </w:numPr>
-        <w:spacing w:after="60" w:before="60"/>
-      </w:pPr>
-      <w:r>
-        <w:rPr>
-          <w:rFonts w:ascii="Arial" w:cs="Arial" w:eastAsia="Arial" w:hAnsi="Arial"/>
-          <w:sz w:val="22"/>
-          <w:szCs w:val="22"/>
-        </w:rPr>
-        <w:t xml:space="preserve">Logging operativo: se registra cada request recibido, cada prediccion generada y cada error con timestamp, lo que permite observabilidad basica sin herramientas adicionales.</w:t>
-      </w:r>
-    </w:p>
-    <w:p>
-      <w:pPr>
-        <w:pStyle w:val="ListParagraph"/>
-        <w:numPr>
-          <w:ilvl w:val="0"/>
-          <w:numId w:val="2"/>
-        </w:numPr>
-        <w:spacing w:after="60" w:before="60"/>
-      </w:pPr>
-      <w:r>
-        <w:rPr>
-          <w:rFonts w:ascii="Arial" w:cs="Arial" w:eastAsia="Arial" w:hAnsi="Arial"/>
-          <w:sz w:val="22"/>
-          <w:szCs w:val="22"/>
-        </w:rPr>
-        <w:t xml:space="preserve">Version del modelo en la respuesta: permite rastrear con que version se genero cada prediccion, util para auditoria y debugging.</w:t>
-      </w:r>
-    </w:p>
-    <w:p>
-      <w:pPr>
-        <w:pStyle w:val="ListParagraph"/>
-        <w:numPr>
-          <w:ilvl w:val="0"/>
-          <w:numId w:val="2"/>
-        </w:numPr>
-        <w:spacing w:after="60" w:before="60"/>
-      </w:pPr>
-      <w:r>
-        <w:rPr>
-          <w:rFonts w:ascii="Arial" w:cs="Arial" w:eastAsia="Arial" w:hAnsi="Arial"/>
-          <w:sz w:val="22"/>
-          <w:szCs w:val="22"/>
-        </w:rPr>
-        <w:t xml:space="preserve">FastAPI sobre Flask: validacion automatica con Pydantic, documentacion interactiva en /docs y mejor performance asincrona.</w:t>
-      </w:r>
-    </w:p>
-    <w:p>
-      <w:pPr>
-        <w:pStyle w:val="ListParagraph"/>
-        <w:numPr>
-          <w:ilvl w:val="0"/>
-          <w:numId w:val="2"/>
-        </w:numPr>
-        <w:spacing w:after="60" w:before="60"/>
-      </w:pPr>
-      <w:r>
-        <w:rPr>
-          <w:rFonts w:ascii="Arial" w:cs="Arial" w:eastAsia="Arial" w:hAnsi="Arial"/>
-          <w:sz w:val="22"/>
-          <w:szCs w:val="22"/>
-        </w:rPr>
-        <w:t xml:space="preserve">DagsHub como remote de DVC: reemplaza Google Drive por una plataforma disenada para ML que permite autenticacion por token sin restricciones OAuth.</w:t>
-      </w:r>
-    </w:p>
-    <w:p>
-      <w:pPr>
-        <w:pStyle w:val="ListParagraph"/>
-        <w:numPr>
-          <w:ilvl w:val="0"/>
-          <w:numId w:val="2"/>
-        </w:numPr>
-        <w:spacing w:after="60" w:before="60"/>
-      </w:pPr>
-      <w:r>
-        <w:rPr>
-          <w:rFonts w:ascii="Arial" w:cs="Arial" w:eastAsia="Arial" w:hAnsi="Arial"/>
-          <w:sz w:val="22"/>
-          <w:szCs w:val="22"/>
-        </w:rPr>
-        <w:t xml:space="preserve">Dos Dockerfiles separados: permite escalar o reemplazar cada servicio de forma independiente.</w:t>
-      </w:r>
-    </w:p>
-    <w:p>
-      <w:pPr>
-        <w:pBdr>
-          <w:bottom w:val="single" w:color="2E75B6" w:sz="4" w:space="1"/>
-        </w:pBdr>
-        <w:spacing w:after="160" w:before="160"/>
-      </w:pPr>
-    </w:p>
-    <w:p>
-      <w:pPr>
-        <w:pStyle w:val="Heading1"/>
-        <w:spacing w:after="200" w:before="300"/>
-      </w:pPr>
-      <w:r>
-        <w:rPr>
-          <w:rFonts w:ascii="Arial" w:cs="Arial" w:eastAsia="Arial" w:hAnsi="Arial"/>
-          <w:b/>
-          <w:bCs/>
-          <w:sz w:val="32"/>
-          <w:szCs w:val="32"/>
-        </w:rPr>
-        <w:t xml:space="preserve">8. Limitaciones Conocidas</w:t>
-      </w:r>
-    </w:p>
-    <w:p>
-      <w:pPr>
-        <w:pStyle w:val="ListParagraph"/>
-        <w:numPr>
-          <w:ilvl w:val="0"/>
-          <w:numId w:val="2"/>
-        </w:numPr>
-        <w:spacing w:after="60" w:before="60"/>
-      </w:pPr>
-      <w:r>
-        <w:rPr>
-          <w:rFonts w:ascii="Arial" w:cs="Arial" w:eastAsia="Arial" w:hAnsi="Arial"/>
-          <w:sz w:val="22"/>
-          <w:szCs w:val="22"/>
-        </w:rPr>
-        <w:t xml:space="preserve">El dvc pull requiere que cada colaborador configure su propio token de DagsHub localmente. Es un paso manual pero simple y gratuito.</w:t>
-      </w:r>
-    </w:p>
-    <w:p>
-      <w:pPr>
-        <w:pStyle w:val="ListParagraph"/>
-        <w:numPr>
-          <w:ilvl w:val="0"/>
-          <w:numId w:val="2"/>
-        </w:numPr>
-        <w:spacing w:after="60" w:before="60"/>
-      </w:pPr>
-      <w:r>
-        <w:rPr>
-          <w:rFonts w:ascii="Arial" w:cs="Arial" w:eastAsia="Arial" w:hAnsi="Arial"/>
-          <w:sz w:val="22"/>
-          <w:szCs w:val="22"/>
-        </w:rPr>
-        <w:t xml:space="preserve">El build de Docker falla si no se ejecuta dvc pull previamente. No hay fallback automatico si los modelos no estan disponibles.</w:t>
-      </w:r>
-    </w:p>
-    <w:p>
-      <w:pPr>
-        <w:pStyle w:val="ListParagraph"/>
-        <w:numPr>
-          <w:ilvl w:val="0"/>
-          <w:numId w:val="2"/>
-        </w:numPr>
-        <w:spacing w:after="60" w:before="60"/>
-      </w:pPr>
-      <w:r>
-        <w:rPr>
-          <w:rFonts w:ascii="Arial" w:cs="Arial" w:eastAsia="Arial" w:hAnsi="Arial"/>
-          <w:sz w:val="22"/>
-          <w:szCs w:val="22"/>
-        </w:rPr>
-        <w:t xml:space="preserve">No se implemento autenticacion en la API. Para un entorno productivo real seria necesario agregar al menos una API key.</w:t>
-      </w:r>
-    </w:p>
-    <w:p>
-      <w:pPr>
-        <w:pStyle w:val="ListParagraph"/>
-        <w:numPr>
-          <w:ilvl w:val="0"/>
-          <w:numId w:val="2"/>
-        </w:numPr>
-        <w:spacing w:after="60" w:before="60"/>
-      </w:pPr>
-      <w:r>
-        <w:rPr>
-          <w:rFonts w:ascii="Arial" w:cs="Arial" w:eastAsia="Arial" w:hAnsi="Arial"/>
-          <w:sz w:val="22"/>
-          <w:szCs w:val="22"/>
-        </w:rPr>
-        <w:t xml:space="preserve">No hay prueba de integracion GUI + API ni prueba de Docker Compose completo. Estas quedaran para el examen final junto con el monitoreo.</w:t>
-      </w:r>
-    </w:p>
-    <w:p>
-      <w:pPr>
-        <w:pStyle w:val="ListParagraph"/>
-        <w:numPr>
-          <w:ilvl w:val="0"/>
-          <w:numId w:val="2"/>
-        </w:numPr>
-        <w:spacing w:after="60" w:before="60"/>
-      </w:pPr>
-      <w:r>
-        <w:rPr>
-          <w:rFonts w:ascii="Arial" w:cs="Arial" w:eastAsia="Arial" w:hAnsi="Arial"/>
-          <w:sz w:val="22"/>
-          <w:szCs w:val="22"/>
-        </w:rPr>
-        <w:t xml:space="preserve">Los modelos se entrenaron con scikit-learn 1.7.1. En entornos con versiones superiores pueden aparecer InconsistentVersionWarnings sin impacto funcional.</w:t>
+        <w:t xml:space="preserve">Los modelos fueron entrenados con scikit-learn 1.7.1. Pueden aparecer warnings con versiones superiores.</w:t>
       </w:r>
     </w:p>
     <w:sectPr>
@@ -4020,7 +4338,7 @@
         <w:sz w:val="18"/>
         <w:szCs w:val="18"/>
       </w:rPr>
-      <w:t xml:space="preserve">AndesLink - Documento Tecnico de Despliegue  v1.1.0</w:t>
+      <w:t xml:space="preserve">AndesLink - Documento Tecnico Final  v1.2.0</w:t>
     </w:r>
   </w:p>
 </w:ftr>

</xml_diff>